<commit_message>
chore: organizar docs, actualizar template ANEXO02 y fix session TTL
</commit_message>
<xml_diff>
--- a/templates/ANEXO02_template.docx
+++ b/templates/ANEXO02_template.docx
@@ -1,6 +1,6 @@
 
 <file path=word/document.xml><?xml version="1.0" encoding="utf-8"?>
-<w:document xmlns:wpc="http://schemas.microsoft.com/office/word/2010/wordprocessingCanvas" xmlns:cx="http://schemas.microsoft.com/office/drawing/2014/chartex" xmlns:cx1="http://schemas.microsoft.com/office/drawing/2015/9/8/chartex" xmlns:cx2="http://schemas.microsoft.com/office/drawing/2015/10/21/chartex" xmlns:cx3="http://schemas.microsoft.com/office/drawing/2016/5/9/chartex" xmlns:cx4="http://schemas.microsoft.com/office/drawing/2016/5/10/chartex" xmlns:cx5="http://schemas.microsoft.com/office/drawing/2016/5/11/chartex" xmlns:cx6="http://schemas.microsoft.com/office/drawing/2016/5/12/chartex" xmlns:cx7="http://schemas.microsoft.com/office/drawing/2016/5/13/chartex" xmlns:cx8="http://schemas.microsoft.com/office/drawing/2016/5/14/chartex" xmlns:mc="http://schemas.openxmlformats.org/markup-compatibility/2006" xmlns:aink="http://schemas.microsoft.com/office/drawing/2016/ink" xmlns:am3d="http://schemas.microsoft.com/office/drawing/2017/model3d" xmlns:o="urn:schemas-microsoft-com:office:office" xmlns:oel="http://schemas.microsoft.com/office/2019/extlst" xmlns:r="http://schemas.openxmlformats.org/officeDocument/2006/relationships" xmlns:m="http://schemas.openxmlformats.org/officeDocument/2006/math" xmlns:v="urn:schemas-microsoft-com:vml" xmlns:wp14="http://schemas.microsoft.com/office/word/2010/wordprocessingDrawing" xmlns:wp="http://schemas.openxmlformats.org/drawingml/2006/wordprocessingDrawing" xmlns:w10="urn:schemas-microsoft-com:office:word" xmlns:w="http://schemas.openxmlformats.org/wordprocessingml/2006/main" xmlns:w14="http://schemas.microsoft.com/office/word/2010/wordml" xmlns:w15="http://schemas.microsoft.com/office/word/2012/wordml" xmlns:w16cex="http://schemas.microsoft.com/office/word/2018/wordml/cex" xmlns:w16cid="http://schemas.microsoft.com/office/word/2016/wordml/cid" xmlns:w16="http://schemas.microsoft.com/office/word/2018/wordml" xmlns:w16du="http://schemas.microsoft.com/office/word/2023/wordml/word16du" xmlns:w16sdtdh="http://schemas.microsoft.com/office/word/2020/wordml/sdtdatahash" xmlns:w16sdtfl="http://schemas.microsoft.com/office/word/2024/wordml/sdtformatlock" xmlns:w16se="http://schemas.microsoft.com/office/word/2015/wordml/symex" xmlns:wpg="http://schemas.microsoft.com/office/word/2010/wordprocessingGroup" xmlns:wpi="http://schemas.microsoft.com/office/word/2010/wordprocessingInk" xmlns:wne="http://schemas.microsoft.com/office/word/2006/wordml" xmlns:wps="http://schemas.microsoft.com/office/word/2010/wordprocessingShape" mc:Ignorable="w14 w15 w16se w16cid w16 w16cex w16sdtdh w16sdtfl w16du wp14">
+<w:document xmlns:wpc="http://schemas.microsoft.com/office/word/2010/wordprocessingCanvas" xmlns:cx="http://schemas.microsoft.com/office/drawing/2014/chartex" xmlns:cx1="http://schemas.microsoft.com/office/drawing/2015/9/8/chartex" xmlns:cx2="http://schemas.microsoft.com/office/drawing/2015/10/21/chartex" xmlns:cx3="http://schemas.microsoft.com/office/drawing/2016/5/9/chartex" xmlns:cx4="http://schemas.microsoft.com/office/drawing/2016/5/10/chartex" xmlns:cx5="http://schemas.microsoft.com/office/drawing/2016/5/11/chartex" xmlns:cx6="http://schemas.microsoft.com/office/drawing/2016/5/12/chartex" xmlns:cx7="http://schemas.microsoft.com/office/drawing/2016/5/13/chartex" xmlns:cx8="http://schemas.microsoft.com/office/drawing/2016/5/14/chartex" xmlns:mc="http://schemas.openxmlformats.org/markup-compatibility/2006" xmlns:aink="http://schemas.microsoft.com/office/drawing/2016/ink" xmlns:am3d="http://schemas.microsoft.com/office/drawing/2017/model3d" xmlns:o="urn:schemas-microsoft-com:office:office" xmlns:r="http://schemas.openxmlformats.org/officeDocument/2006/relationships" xmlns:m="http://schemas.openxmlformats.org/officeDocument/2006/math" xmlns:v="urn:schemas-microsoft-com:vml" xmlns:wp14="http://schemas.microsoft.com/office/word/2010/wordprocessingDrawing" xmlns:wp="http://schemas.openxmlformats.org/drawingml/2006/wordprocessingDrawing" xmlns:w10="urn:schemas-microsoft-com:office:word" xmlns:w="http://schemas.openxmlformats.org/wordprocessingml/2006/main" xmlns:w14="http://schemas.microsoft.com/office/word/2010/wordml" xmlns:w15="http://schemas.microsoft.com/office/word/2012/wordml" xmlns:w16cex="http://schemas.microsoft.com/office/word/2018/wordml/cex" xmlns:w16cid="http://schemas.microsoft.com/office/word/2016/wordml/cid" xmlns:w16="http://schemas.microsoft.com/office/word/2018/wordml" xmlns:w16sdtdh="http://schemas.microsoft.com/office/word/2020/wordml/sdtdatahash" xmlns:w16se="http://schemas.microsoft.com/office/word/2015/wordml/symex" xmlns:wpg="http://schemas.microsoft.com/office/word/2010/wordprocessingGroup" xmlns:wpi="http://schemas.microsoft.com/office/word/2010/wordprocessingInk" xmlns:wne="http://schemas.microsoft.com/office/word/2006/wordml" xmlns:wps="http://schemas.microsoft.com/office/word/2010/wordprocessingShape" mc:Ignorable="w14 w15 w16se w16cid w16 w16cex w16sdtdh wp14">
   <w:body>
     <w:p>
       <w:pPr>
@@ -60,7 +60,7 @@
                 <w:lang w:eastAsia="es-PE"/>
               </w:rPr>
               <w:drawing>
-                <wp:inline distT="0" distB="0" distL="0" distR="0" wp14:anchorId="701B63CC" wp14:editId="65D06D96">
+                <wp:inline distT="0" distB="0" distL="0" distR="0" wp14:anchorId="1D7DBB9B" wp14:editId="7B92DE0E">
                   <wp:extent cx="647700" cy="402114"/>
                   <wp:effectExtent l="0" t="0" r="0" b="0"/>
                   <wp:docPr id="27" name="Imagen 27"/>
@@ -223,6 +223,554 @@
         <w:rPr>
           <w:rFonts w:ascii="Arial" w:eastAsia="Calibri" w:hAnsi="Arial" w:cs="Arial"/>
           <w:b/>
+          <w:noProof/>
+          <w:sz w:val="16"/>
+          <w:szCs w:val="16"/>
+        </w:rPr>
+        <mc:AlternateContent>
+          <mc:Choice Requires="wps">
+            <w:drawing>
+              <wp:anchor distT="45720" distB="45720" distL="114300" distR="114300" simplePos="0" relativeHeight="251712512" behindDoc="0" locked="0" layoutInCell="1" allowOverlap="1" wp14:anchorId="741D62F5" wp14:editId="33D0D138">
+                <wp:simplePos x="0" y="0"/>
+                <wp:positionH relativeFrom="column">
+                  <wp:posOffset>3224530</wp:posOffset>
+                </wp:positionH>
+                <wp:positionV relativeFrom="page">
+                  <wp:posOffset>1325774</wp:posOffset>
+                </wp:positionV>
+                <wp:extent cx="420624" cy="303292"/>
+                <wp:effectExtent l="0" t="0" r="0" b="1905"/>
+                <wp:wrapNone/>
+                <wp:docPr id="13" name="Cuadro de texto 2"/>
+                <wp:cNvGraphicFramePr>
+                  <a:graphicFrameLocks xmlns:a="http://schemas.openxmlformats.org/drawingml/2006/main"/>
+                </wp:cNvGraphicFramePr>
+                <a:graphic xmlns:a="http://schemas.openxmlformats.org/drawingml/2006/main">
+                  <a:graphicData uri="http://schemas.microsoft.com/office/word/2010/wordprocessingShape">
+                    <wps:wsp>
+                      <wps:cNvSpPr txBox="1">
+                        <a:spLocks noChangeArrowheads="1"/>
+                      </wps:cNvSpPr>
+                      <wps:spPr bwMode="auto">
+                        <a:xfrm>
+                          <a:off x="0" y="0"/>
+                          <a:ext cx="420624" cy="303292"/>
+                        </a:xfrm>
+                        <a:prstGeom prst="rect">
+                          <a:avLst/>
+                        </a:prstGeom>
+                        <a:noFill/>
+                        <a:ln w="9525">
+                          <a:noFill/>
+                          <a:miter lim="800000"/>
+                          <a:headEnd/>
+                          <a:tailEnd/>
+                        </a:ln>
+                      </wps:spPr>
+                      <wps:txbx>
+                        <w:txbxContent>
+                          <w:p>
+                            <w:r>
+                              <w:rPr>
+                                <w:rFonts w:ascii="Arial" w:eastAsia="Calibri" w:hAnsi="Arial" w:cs="Arial"/>
+                                <w:sz w:val="16"/>
+                                <w:szCs w:val="16"/>
+                              </w:rPr>
+                              <w:t>{</w:t>
+                            </w:r>
+                            <w:proofErr w:type="spellStart"/>
+                            <w:r>
+                              <w:rPr>
+                                <w:rFonts w:ascii="Arial" w:eastAsia="Calibri" w:hAnsi="Arial" w:cs="Arial"/>
+                                <w:sz w:val="16"/>
+                                <w:szCs w:val="16"/>
+                              </w:rPr>
+                              <w:t>ckOtros</w:t>
+                            </w:r>
+                            <w:proofErr w:type="spellEnd"/>
+                            <w:r>
+                              <w:rPr>
+                                <w:rFonts w:ascii="Arial" w:eastAsia="Calibri" w:hAnsi="Arial" w:cs="Arial"/>
+                                <w:sz w:val="16"/>
+                                <w:szCs w:val="16"/>
+                              </w:rPr>
+                              <w:t xml:space="preserve">}   </w:t>
+                            </w:r>
+                          </w:p>
+                        </w:txbxContent>
+                      </wps:txbx>
+                      <wps:bodyPr rot="0" vert="horz" wrap="square" lIns="91440" tIns="45720" rIns="91440" bIns="45720" anchor="t" anchorCtr="0">
+                        <a:noAutofit/>
+                      </wps:bodyPr>
+                    </wps:wsp>
+                  </a:graphicData>
+                </a:graphic>
+                <wp14:sizeRelH relativeFrom="margin">
+                  <wp14:pctWidth>0</wp14:pctWidth>
+                </wp14:sizeRelH>
+                <wp14:sizeRelV relativeFrom="margin">
+                  <wp14:pctHeight>0</wp14:pctHeight>
+                </wp14:sizeRelV>
+              </wp:anchor>
+            </w:drawing>
+          </mc:Choice>
+          <mc:Fallback>
+            <w:pict>
+              <v:shapetype w14:anchorId="741D62F5" id="_x0000_t202" coordsize="21600,21600" o:spt="202" path="m,l,21600r21600,l21600,xe">
+                <v:stroke joinstyle="miter"/>
+                <v:path gradientshapeok="t" o:connecttype="rect"/>
+              </v:shapetype>
+              <v:shape id="Cuadro de texto 2" o:spid="_x0000_s1026" type="#_x0000_t202" style="position:absolute;left:0;text-align:left;margin-left:253.9pt;margin-top:104.4pt;width:33.1pt;height:23.9pt;z-index:251712512;visibility:visible;mso-wrap-style:square;mso-width-percent:0;mso-height-percent:0;mso-wrap-distance-left:9pt;mso-wrap-distance-top:3.6pt;mso-wrap-distance-right:9pt;mso-wrap-distance-bottom:3.6pt;mso-position-horizontal:absolute;mso-position-horizontal-relative:text;mso-position-vertical:absolute;mso-position-vertical-relative:page;mso-width-percent:0;mso-height-percent:0;mso-width-relative:margin;mso-height-relative:margin;v-text-anchor:top" o:gfxdata="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" filled="f" stroked="f">
+                <v:textbox>
+                  <w:txbxContent>
+                    <w:p>
+                      <w:r>
+                        <w:rPr>
+                          <w:rFonts w:ascii="Arial" w:eastAsia="Calibri" w:hAnsi="Arial" w:cs="Arial"/>
+                          <w:sz w:val="16"/>
+                          <w:szCs w:val="16"/>
+                        </w:rPr>
+                        <w:t>{</w:t>
+                      </w:r>
+                      <w:proofErr w:type="spellStart"/>
+                      <w:r>
+                        <w:rPr>
+                          <w:rFonts w:ascii="Arial" w:eastAsia="Calibri" w:hAnsi="Arial" w:cs="Arial"/>
+                          <w:sz w:val="16"/>
+                          <w:szCs w:val="16"/>
+                        </w:rPr>
+                        <w:t>ckOtros</w:t>
+                      </w:r>
+                      <w:proofErr w:type="spellEnd"/>
+                      <w:r>
+                        <w:rPr>
+                          <w:rFonts w:ascii="Arial" w:eastAsia="Calibri" w:hAnsi="Arial" w:cs="Arial"/>
+                          <w:sz w:val="16"/>
+                          <w:szCs w:val="16"/>
+                        </w:rPr>
+                        <w:t xml:space="preserve">}   </w:t>
+                      </w:r>
+                    </w:p>
+                  </w:txbxContent>
+                </v:textbox>
+                <w10:wrap anchory="page"/>
+              </v:shape>
+            </w:pict>
+          </mc:Fallback>
+        </mc:AlternateContent>
+      </w:r>
+      <w:r>
+        <w:rPr>
+          <w:rFonts w:ascii="Arial" w:eastAsia="Calibri" w:hAnsi="Arial" w:cs="Arial"/>
+          <w:b/>
+          <w:noProof/>
+          <w:sz w:val="16"/>
+          <w:szCs w:val="16"/>
+        </w:rPr>
+        <mc:AlternateContent>
+          <mc:Choice Requires="wps">
+            <w:drawing>
+              <wp:anchor distT="45720" distB="45720" distL="114300" distR="114300" simplePos="0" relativeHeight="251710464" behindDoc="0" locked="0" layoutInCell="1" allowOverlap="1" wp14:anchorId="78E6D1AE" wp14:editId="3960B0A1">
+                <wp:simplePos x="0" y="0"/>
+                <wp:positionH relativeFrom="column">
+                  <wp:posOffset>1852622</wp:posOffset>
+                </wp:positionH>
+                <wp:positionV relativeFrom="page">
+                  <wp:posOffset>1321580</wp:posOffset>
+                </wp:positionV>
+                <wp:extent cx="420370" cy="303291"/>
+                <wp:effectExtent l="0" t="0" r="0" b="1905"/>
+                <wp:wrapNone/>
+                <wp:docPr id="12" name="Cuadro de texto 2"/>
+                <wp:cNvGraphicFramePr>
+                  <a:graphicFrameLocks xmlns:a="http://schemas.openxmlformats.org/drawingml/2006/main"/>
+                </wp:cNvGraphicFramePr>
+                <a:graphic xmlns:a="http://schemas.openxmlformats.org/drawingml/2006/main">
+                  <a:graphicData uri="http://schemas.microsoft.com/office/word/2010/wordprocessingShape">
+                    <wps:wsp>
+                      <wps:cNvSpPr txBox="1">
+                        <a:spLocks noChangeArrowheads="1"/>
+                      </wps:cNvSpPr>
+                      <wps:spPr bwMode="auto">
+                        <a:xfrm>
+                          <a:off x="0" y="0"/>
+                          <a:ext cx="420370" cy="303291"/>
+                        </a:xfrm>
+                        <a:prstGeom prst="rect">
+                          <a:avLst/>
+                        </a:prstGeom>
+                        <a:noFill/>
+                        <a:ln w="9525">
+                          <a:noFill/>
+                          <a:miter lim="800000"/>
+                          <a:headEnd/>
+                          <a:tailEnd/>
+                        </a:ln>
+                      </wps:spPr>
+                      <wps:txbx>
+                        <w:txbxContent>
+                          <w:p>
+                            <w:r>
+                              <w:rPr>
+                                <w:rFonts w:ascii="Arial" w:eastAsia="Calibri" w:hAnsi="Arial" w:cs="Arial"/>
+                                <w:sz w:val="16"/>
+                                <w:szCs w:val="16"/>
+                              </w:rPr>
+                              <w:t>{</w:t>
+                            </w:r>
+                            <w:proofErr w:type="spellStart"/>
+                            <w:r>
+                              <w:rPr>
+                                <w:rFonts w:ascii="Arial" w:eastAsia="Calibri" w:hAnsi="Arial" w:cs="Arial"/>
+                                <w:sz w:val="16"/>
+                                <w:szCs w:val="16"/>
+                              </w:rPr>
+                              <w:t>ckLocador</w:t>
+                            </w:r>
+                            <w:proofErr w:type="spellEnd"/>
+                            <w:r>
+                              <w:rPr>
+                                <w:rFonts w:ascii="Arial" w:eastAsia="Calibri" w:hAnsi="Arial" w:cs="Arial"/>
+                                <w:sz w:val="16"/>
+                                <w:szCs w:val="16"/>
+                              </w:rPr>
+                              <w:t>}</w:t>
+                            </w:r>
+                          </w:p>
+                        </w:txbxContent>
+                      </wps:txbx>
+                      <wps:bodyPr rot="0" vert="horz" wrap="square" lIns="91440" tIns="45720" rIns="91440" bIns="45720" anchor="t" anchorCtr="0">
+                        <a:noAutofit/>
+                      </wps:bodyPr>
+                    </wps:wsp>
+                  </a:graphicData>
+                </a:graphic>
+                <wp14:sizeRelH relativeFrom="margin">
+                  <wp14:pctWidth>0</wp14:pctWidth>
+                </wp14:sizeRelH>
+                <wp14:sizeRelV relativeFrom="margin">
+                  <wp14:pctHeight>0</wp14:pctHeight>
+                </wp14:sizeRelV>
+              </wp:anchor>
+            </w:drawing>
+          </mc:Choice>
+          <mc:Fallback>
+            <w:pict>
+              <v:shape w14:anchorId="78E6D1AE" id="_x0000_s1027" type="#_x0000_t202" style="position:absolute;left:0;text-align:left;margin-left:145.9pt;margin-top:104.05pt;width:33.1pt;height:23.9pt;z-index:251710464;visibility:visible;mso-wrap-style:square;mso-width-percent:0;mso-height-percent:0;mso-wrap-distance-left:9pt;mso-wrap-distance-top:3.6pt;mso-wrap-distance-right:9pt;mso-wrap-distance-bottom:3.6pt;mso-position-horizontal:absolute;mso-position-horizontal-relative:text;mso-position-vertical:absolute;mso-position-vertical-relative:page;mso-width-percent:0;mso-height-percent:0;mso-width-relative:margin;mso-height-relative:margin;v-text-anchor:top" o:gfxdata="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" filled="f" stroked="f">
+                <v:textbox>
+                  <w:txbxContent>
+                    <w:p>
+                      <w:r>
+                        <w:rPr>
+                          <w:rFonts w:ascii="Arial" w:eastAsia="Calibri" w:hAnsi="Arial" w:cs="Arial"/>
+                          <w:sz w:val="16"/>
+                          <w:szCs w:val="16"/>
+                        </w:rPr>
+                        <w:t>{</w:t>
+                      </w:r>
+                      <w:proofErr w:type="spellStart"/>
+                      <w:r>
+                        <w:rPr>
+                          <w:rFonts w:ascii="Arial" w:eastAsia="Calibri" w:hAnsi="Arial" w:cs="Arial"/>
+                          <w:sz w:val="16"/>
+                          <w:szCs w:val="16"/>
+                        </w:rPr>
+                        <w:t>ckLocador</w:t>
+                      </w:r>
+                      <w:proofErr w:type="spellEnd"/>
+                      <w:r>
+                        <w:rPr>
+                          <w:rFonts w:ascii="Arial" w:eastAsia="Calibri" w:hAnsi="Arial" w:cs="Arial"/>
+                          <w:sz w:val="16"/>
+                          <w:szCs w:val="16"/>
+                        </w:rPr>
+                        <w:t>}</w:t>
+                      </w:r>
+                    </w:p>
+                  </w:txbxContent>
+                </v:textbox>
+                <w10:wrap anchory="page"/>
+              </v:shape>
+            </w:pict>
+          </mc:Fallback>
+        </mc:AlternateContent>
+      </w:r>
+      <w:r>
+        <w:rPr>
+          <w:rFonts w:ascii="Arial" w:eastAsia="Calibri" w:hAnsi="Arial" w:cs="Arial"/>
+          <w:b/>
+          <w:noProof/>
+          <w:sz w:val="16"/>
+          <w:szCs w:val="16"/>
+        </w:rPr>
+        <mc:AlternateContent>
+          <mc:Choice Requires="wps">
+            <w:drawing>
+              <wp:anchor distT="45720" distB="45720" distL="114300" distR="114300" simplePos="0" relativeHeight="251708416" behindDoc="0" locked="0" layoutInCell="1" allowOverlap="1" wp14:anchorId="4538B281" wp14:editId="0886220A">
+                <wp:simplePos x="0" y="0"/>
+                <wp:positionH relativeFrom="column">
+                  <wp:posOffset>1074590</wp:posOffset>
+                </wp:positionH>
+                <wp:positionV relativeFrom="page">
+                  <wp:posOffset>1317279</wp:posOffset>
+                </wp:positionV>
+                <wp:extent cx="420624" cy="289516"/>
+                <wp:effectExtent l="0" t="0" r="0" b="0"/>
+                <wp:wrapNone/>
+                <wp:docPr id="1" name="Cuadro de texto 2"/>
+                <wp:cNvGraphicFramePr>
+                  <a:graphicFrameLocks xmlns:a="http://schemas.openxmlformats.org/drawingml/2006/main"/>
+                </wp:cNvGraphicFramePr>
+                <a:graphic xmlns:a="http://schemas.openxmlformats.org/drawingml/2006/main">
+                  <a:graphicData uri="http://schemas.microsoft.com/office/word/2010/wordprocessingShape">
+                    <wps:wsp>
+                      <wps:cNvSpPr txBox="1">
+                        <a:spLocks noChangeArrowheads="1"/>
+                      </wps:cNvSpPr>
+                      <wps:spPr bwMode="auto">
+                        <a:xfrm>
+                          <a:off x="0" y="0"/>
+                          <a:ext cx="420624" cy="289516"/>
+                        </a:xfrm>
+                        <a:prstGeom prst="rect">
+                          <a:avLst/>
+                        </a:prstGeom>
+                        <a:noFill/>
+                        <a:ln w="9525">
+                          <a:noFill/>
+                          <a:miter lim="800000"/>
+                          <a:headEnd/>
+                          <a:tailEnd/>
+                        </a:ln>
+                      </wps:spPr>
+                      <wps:txbx>
+                        <w:txbxContent>
+                          <w:p>
+                            <w:r>
+                              <w:rPr>
+                                <w:rFonts w:ascii="Arial" w:eastAsia="Calibri" w:hAnsi="Arial" w:cs="Arial"/>
+                                <w:sz w:val="16"/>
+                                <w:szCs w:val="16"/>
+                              </w:rPr>
+                              <w:t>{</w:t>
+                            </w:r>
+                            <w:proofErr w:type="spellStart"/>
+                            <w:r>
+                              <w:rPr>
+                                <w:rFonts w:ascii="Arial" w:eastAsia="Calibri" w:hAnsi="Arial" w:cs="Arial"/>
+                                <w:sz w:val="16"/>
+                                <w:szCs w:val="16"/>
+                              </w:rPr>
+                              <w:t>ckCAS</w:t>
+                            </w:r>
+                            <w:proofErr w:type="spellEnd"/>
+                            <w:r>
+                              <w:rPr>
+                                <w:rFonts w:ascii="Arial" w:eastAsia="Calibri" w:hAnsi="Arial" w:cs="Arial"/>
+                                <w:sz w:val="16"/>
+                                <w:szCs w:val="16"/>
+                              </w:rPr>
+                              <w:t>}</w:t>
+                            </w:r>
+                          </w:p>
+                        </w:txbxContent>
+                      </wps:txbx>
+                      <wps:bodyPr rot="0" vert="horz" wrap="square" lIns="91440" tIns="45720" rIns="91440" bIns="45720" anchor="t" anchorCtr="0">
+                        <a:noAutofit/>
+                      </wps:bodyPr>
+                    </wps:wsp>
+                  </a:graphicData>
+                </a:graphic>
+                <wp14:sizeRelH relativeFrom="margin">
+                  <wp14:pctWidth>0</wp14:pctWidth>
+                </wp14:sizeRelH>
+                <wp14:sizeRelV relativeFrom="margin">
+                  <wp14:pctHeight>0</wp14:pctHeight>
+                </wp14:sizeRelV>
+              </wp:anchor>
+            </w:drawing>
+          </mc:Choice>
+          <mc:Fallback>
+            <w:pict>
+              <v:shape w14:anchorId="4538B281" id="_x0000_s1028" type="#_x0000_t202" style="position:absolute;left:0;text-align:left;margin-left:84.6pt;margin-top:103.7pt;width:33.1pt;height:22.8pt;z-index:251708416;visibility:visible;mso-wrap-style:square;mso-width-percent:0;mso-height-percent:0;mso-wrap-distance-left:9pt;mso-wrap-distance-top:3.6pt;mso-wrap-distance-right:9pt;mso-wrap-distance-bottom:3.6pt;mso-position-horizontal:absolute;mso-position-horizontal-relative:text;mso-position-vertical:absolute;mso-position-vertical-relative:page;mso-width-percent:0;mso-height-percent:0;mso-width-relative:margin;mso-height-relative:margin;v-text-anchor:top" o:gfxdata="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" filled="f" stroked="f">
+                <v:textbox>
+                  <w:txbxContent>
+                    <w:p>
+                      <w:r>
+                        <w:rPr>
+                          <w:rFonts w:ascii="Arial" w:eastAsia="Calibri" w:hAnsi="Arial" w:cs="Arial"/>
+                          <w:sz w:val="16"/>
+                          <w:szCs w:val="16"/>
+                        </w:rPr>
+                        <w:t>{</w:t>
+                      </w:r>
+                      <w:proofErr w:type="spellStart"/>
+                      <w:r>
+                        <w:rPr>
+                          <w:rFonts w:ascii="Arial" w:eastAsia="Calibri" w:hAnsi="Arial" w:cs="Arial"/>
+                          <w:sz w:val="16"/>
+                          <w:szCs w:val="16"/>
+                        </w:rPr>
+                        <w:t>ckCAS</w:t>
+                      </w:r>
+                      <w:proofErr w:type="spellEnd"/>
+                      <w:r>
+                        <w:rPr>
+                          <w:rFonts w:ascii="Arial" w:eastAsia="Calibri" w:hAnsi="Arial" w:cs="Arial"/>
+                          <w:sz w:val="16"/>
+                          <w:szCs w:val="16"/>
+                        </w:rPr>
+                        <w:t>}</w:t>
+                      </w:r>
+                    </w:p>
+                  </w:txbxContent>
+                </v:textbox>
+                <w10:wrap anchory="page"/>
+              </v:shape>
+            </w:pict>
+          </mc:Fallback>
+        </mc:AlternateContent>
+      </w:r>
+      <w:r>
+        <w:rPr>
+          <w:rFonts w:ascii="Arial" w:eastAsia="Calibri" w:hAnsi="Arial" w:cs="Arial"/>
+          <w:b/>
+          <w:noProof/>
+          <w:sz w:val="16"/>
+          <w:szCs w:val="16"/>
+        </w:rPr>
+        <mc:AlternateContent>
+          <mc:Choice Requires="wps">
+            <w:drawing>
+              <wp:anchor distT="45720" distB="45720" distL="114300" distR="114300" simplePos="0" relativeHeight="251706368" behindDoc="0" locked="0" layoutInCell="1" allowOverlap="1" wp14:anchorId="0AE9A122" wp14:editId="5B5BF629">
+                <wp:simplePos x="0" y="0"/>
+                <wp:positionH relativeFrom="column">
+                  <wp:posOffset>37968</wp:posOffset>
+                </wp:positionH>
+                <wp:positionV relativeFrom="page">
+                  <wp:posOffset>1321806</wp:posOffset>
+                </wp:positionV>
+                <wp:extent cx="420624" cy="284989"/>
+                <wp:effectExtent l="0" t="0" r="0" b="1270"/>
+                <wp:wrapNone/>
+                <wp:docPr id="217" name="Cuadro de texto 2"/>
+                <wp:cNvGraphicFramePr>
+                  <a:graphicFrameLocks xmlns:a="http://schemas.openxmlformats.org/drawingml/2006/main"/>
+                </wp:cNvGraphicFramePr>
+                <a:graphic xmlns:a="http://schemas.openxmlformats.org/drawingml/2006/main">
+                  <a:graphicData uri="http://schemas.microsoft.com/office/word/2010/wordprocessingShape">
+                    <wps:wsp>
+                      <wps:cNvSpPr txBox="1">
+                        <a:spLocks noChangeArrowheads="1"/>
+                      </wps:cNvSpPr>
+                      <wps:spPr bwMode="auto">
+                        <a:xfrm>
+                          <a:off x="0" y="0"/>
+                          <a:ext cx="420624" cy="284989"/>
+                        </a:xfrm>
+                        <a:prstGeom prst="rect">
+                          <a:avLst/>
+                        </a:prstGeom>
+                        <a:noFill/>
+                        <a:ln w="9525">
+                          <a:noFill/>
+                          <a:miter lim="800000"/>
+                          <a:headEnd/>
+                          <a:tailEnd/>
+                        </a:ln>
+                      </wps:spPr>
+                      <wps:txbx>
+                        <w:txbxContent>
+                          <w:p>
+                            <w:r>
+                              <w:rPr>
+                                <w:rFonts w:ascii="Arial" w:eastAsia="Calibri" w:hAnsi="Arial" w:cs="Arial"/>
+                                <w:sz w:val="16"/>
+                                <w:szCs w:val="16"/>
+                              </w:rPr>
+                              <w:t>{</w:t>
+                            </w:r>
+                            <w:proofErr w:type="spellStart"/>
+                            <w:r>
+                              <w:rPr>
+                                <w:rFonts w:ascii="Arial" w:eastAsia="Calibri" w:hAnsi="Arial" w:cs="Arial"/>
+                                <w:sz w:val="16"/>
+                                <w:szCs w:val="16"/>
+                              </w:rPr>
+                              <w:t>ckNombrado</w:t>
+                            </w:r>
+                            <w:proofErr w:type="spellEnd"/>
+                            <w:r>
+                              <w:rPr>
+                                <w:rFonts w:ascii="Arial" w:eastAsia="Calibri" w:hAnsi="Arial" w:cs="Arial"/>
+                                <w:sz w:val="16"/>
+                                <w:szCs w:val="16"/>
+                              </w:rPr>
+                              <w:t>}</w:t>
+                            </w:r>
+                          </w:p>
+                        </w:txbxContent>
+                      </wps:txbx>
+                      <wps:bodyPr rot="0" vert="horz" wrap="square" lIns="91440" tIns="45720" rIns="91440" bIns="45720" anchor="t" anchorCtr="0">
+                        <a:noAutofit/>
+                      </wps:bodyPr>
+                    </wps:wsp>
+                  </a:graphicData>
+                </a:graphic>
+                <wp14:sizeRelH relativeFrom="margin">
+                  <wp14:pctWidth>0</wp14:pctWidth>
+                </wp14:sizeRelH>
+                <wp14:sizeRelV relativeFrom="margin">
+                  <wp14:pctHeight>0</wp14:pctHeight>
+                </wp14:sizeRelV>
+              </wp:anchor>
+            </w:drawing>
+          </mc:Choice>
+          <mc:Fallback>
+            <w:pict>
+              <v:shape w14:anchorId="0AE9A122" id="_x0000_s1029" type="#_x0000_t202" style="position:absolute;left:0;text-align:left;margin-left:3pt;margin-top:104.1pt;width:33.1pt;height:22.45pt;z-index:251706368;visibility:visible;mso-wrap-style:square;mso-width-percent:0;mso-height-percent:0;mso-wrap-distance-left:9pt;mso-wrap-distance-top:3.6pt;mso-wrap-distance-right:9pt;mso-wrap-distance-bottom:3.6pt;mso-position-horizontal:absolute;mso-position-horizontal-relative:text;mso-position-vertical:absolute;mso-position-vertical-relative:page;mso-width-percent:0;mso-height-percent:0;mso-width-relative:margin;mso-height-relative:margin;v-text-anchor:top" o:gfxdata="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" filled="f" stroked="f">
+                <v:textbox>
+                  <w:txbxContent>
+                    <w:p>
+                      <w:r>
+                        <w:rPr>
+                          <w:rFonts w:ascii="Arial" w:eastAsia="Calibri" w:hAnsi="Arial" w:cs="Arial"/>
+                          <w:sz w:val="16"/>
+                          <w:szCs w:val="16"/>
+                        </w:rPr>
+                        <w:t>{</w:t>
+                      </w:r>
+                      <w:proofErr w:type="spellStart"/>
+                      <w:r>
+                        <w:rPr>
+                          <w:rFonts w:ascii="Arial" w:eastAsia="Calibri" w:hAnsi="Arial" w:cs="Arial"/>
+                          <w:sz w:val="16"/>
+                          <w:szCs w:val="16"/>
+                        </w:rPr>
+                        <w:t>ckNombrado</w:t>
+                      </w:r>
+                      <w:proofErr w:type="spellEnd"/>
+                      <w:r>
+                        <w:rPr>
+                          <w:rFonts w:ascii="Arial" w:eastAsia="Calibri" w:hAnsi="Arial" w:cs="Arial"/>
+                          <w:sz w:val="16"/>
+                          <w:szCs w:val="16"/>
+                        </w:rPr>
+                        <w:t>}</w:t>
+                      </w:r>
+                    </w:p>
+                  </w:txbxContent>
+                </v:textbox>
+                <w10:wrap anchory="page"/>
+              </v:shape>
+            </w:pict>
+          </mc:Fallback>
+        </mc:AlternateContent>
+      </w:r>
+      <w:r>
+        <w:rPr>
+          <w:rFonts w:ascii="Arial" w:eastAsia="Calibri" w:hAnsi="Arial" w:cs="Arial"/>
+          <w:b/>
           <w:sz w:val="16"/>
           <w:szCs w:val="16"/>
         </w:rPr>
@@ -257,7 +805,7 @@
         <mc:AlternateContent>
           <mc:Choice Requires="wps">
             <w:drawing>
-              <wp:anchor distT="0" distB="0" distL="114300" distR="114300" simplePos="0" relativeHeight="251675648" behindDoc="0" locked="0" layoutInCell="1" allowOverlap="1" wp14:anchorId="080903AA" wp14:editId="5CDE4103">
+              <wp:anchor distT="0" distB="0" distL="114300" distR="114300" simplePos="0" relativeHeight="251675648" behindDoc="0" locked="0" layoutInCell="1" allowOverlap="1" wp14:anchorId="4C5DBA7E" wp14:editId="42C853E8">
                 <wp:simplePos x="0" y="0"/>
                 <wp:positionH relativeFrom="column">
                   <wp:posOffset>3253901</wp:posOffset>
@@ -303,7 +851,7 @@
               </wp:anchor>
             </w:drawing>
           </mc:Choice>
-          <mc:Fallback>
+          <mc:Fallback xmlns:oel="http://schemas.microsoft.com/office/2019/extlst" xmlns:w16du="http://schemas.microsoft.com/office/word/2023/wordml/word16du" xmlns:w16sdtfl="http://schemas.microsoft.com/office/word/2024/wordml/sdtformatlock">
             <w:pict>
               <v:rect w14:anchorId="451D8A76" id="17 Rectángulo" o:spid="_x0000_s1026" style="position:absolute;margin-left:256.2pt;margin-top:2.75pt;width:29.25pt;height:15.75pt;z-index:251675648;visibility:visible;mso-wrap-style:square;mso-wrap-distance-left:9pt;mso-wrap-distance-top:0;mso-wrap-distance-right:9pt;mso-wrap-distance-bottom:0;mso-position-horizontal:absolute;mso-position-horizontal-relative:text;mso-position-vertical:absolute;mso-position-vertical-relative:text;v-text-anchor:middle" o:gfxdata="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" filled="f" strokecolor="windowText" strokeweight=".25pt"/>
             </w:pict>
@@ -322,7 +870,7 @@
         <mc:AlternateContent>
           <mc:Choice Requires="wps">
             <w:drawing>
-              <wp:anchor distT="0" distB="0" distL="114300" distR="114300" simplePos="0" relativeHeight="251673600" behindDoc="0" locked="0" layoutInCell="1" allowOverlap="1" wp14:anchorId="5570E907" wp14:editId="67A8A2AF">
+              <wp:anchor distT="0" distB="0" distL="114300" distR="114300" simplePos="0" relativeHeight="251673600" behindDoc="0" locked="0" layoutInCell="1" allowOverlap="1" wp14:anchorId="1A47C6D9" wp14:editId="4EA424F5">
                 <wp:simplePos x="0" y="0"/>
                 <wp:positionH relativeFrom="column">
                   <wp:posOffset>1122375</wp:posOffset>
@@ -382,7 +930,7 @@
           </mc:Choice>
           <mc:Fallback>
             <w:pict>
-              <v:rect w14:anchorId="5570E907" id="15 Rectángulo" o:spid="_x0000_s1026" style="position:absolute;left:0;text-align:left;margin-left:88.4pt;margin-top:1.55pt;width:29.25pt;height:15.75pt;z-index:251673600;visibility:visible;mso-wrap-style:square;mso-wrap-distance-left:9pt;mso-wrap-distance-top:0;mso-wrap-distance-right:9pt;mso-wrap-distance-bottom:0;mso-position-horizontal:absolute;mso-position-horizontal-relative:text;mso-position-vertical:absolute;mso-position-vertical-relative:text;v-text-anchor:middle" o:gfxdata="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" filled="f" strokecolor="windowText" strokeweight=".25pt">
+              <v:rect w14:anchorId="1A47C6D9" id="15 Rectángulo" o:spid="_x0000_s1030" style="position:absolute;left:0;text-align:left;margin-left:88.4pt;margin-top:1.55pt;width:29.25pt;height:15.75pt;z-index:251673600;visibility:visible;mso-wrap-style:square;mso-wrap-distance-left:9pt;mso-wrap-distance-top:0;mso-wrap-distance-right:9pt;mso-wrap-distance-bottom:0;mso-position-horizontal:absolute;mso-position-horizontal-relative:text;mso-position-vertical:absolute;mso-position-vertical-relative:text;v-text-anchor:middle" o:gfxdata="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" filled="f" strokecolor="windowText" strokeweight=".25pt">
                 <v:textbox>
                   <w:txbxContent>
                     <w:p>
@@ -412,7 +960,7 @@
         <mc:AlternateContent>
           <mc:Choice Requires="wps">
             <w:drawing>
-              <wp:anchor distT="0" distB="0" distL="114300" distR="114300" simplePos="0" relativeHeight="251674624" behindDoc="0" locked="0" layoutInCell="1" allowOverlap="1" wp14:anchorId="4B75F80D" wp14:editId="07B9FAD2">
+              <wp:anchor distT="0" distB="0" distL="114300" distR="114300" simplePos="0" relativeHeight="251674624" behindDoc="0" locked="0" layoutInCell="1" allowOverlap="1" wp14:anchorId="0A2AB8B4" wp14:editId="23FC81DF">
                 <wp:simplePos x="0" y="0"/>
                 <wp:positionH relativeFrom="column">
                   <wp:posOffset>1880540</wp:posOffset>
@@ -458,7 +1006,7 @@
               </wp:anchor>
             </w:drawing>
           </mc:Choice>
-          <mc:Fallback>
+          <mc:Fallback xmlns:oel="http://schemas.microsoft.com/office/2019/extlst" xmlns:w16du="http://schemas.microsoft.com/office/word/2023/wordml/word16du" xmlns:w16sdtfl="http://schemas.microsoft.com/office/word/2024/wordml/sdtformatlock">
             <w:pict>
               <v:rect w14:anchorId="40B76110" id="16 Rectángulo" o:spid="_x0000_s1026" style="position:absolute;margin-left:148.05pt;margin-top:2.3pt;width:29.25pt;height:15.75pt;z-index:251674624;visibility:visible;mso-wrap-style:square;mso-wrap-distance-left:9pt;mso-wrap-distance-top:0;mso-wrap-distance-right:9pt;mso-wrap-distance-bottom:0;mso-position-horizontal:absolute;mso-position-horizontal-relative:text;mso-position-vertical:absolute;mso-position-vertical-relative:text;v-text-anchor:middle" o:gfxdata="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" filled="f" strokecolor="windowText" strokeweight=".25pt"/>
             </w:pict>
@@ -477,7 +1025,7 @@
         <mc:AlternateContent>
           <mc:Choice Requires="wps">
             <w:drawing>
-              <wp:anchor distT="0" distB="0" distL="114300" distR="114300" simplePos="0" relativeHeight="251672576" behindDoc="0" locked="0" layoutInCell="1" allowOverlap="1" wp14:anchorId="04D7F394" wp14:editId="6BA82B76">
+              <wp:anchor distT="0" distB="0" distL="114300" distR="114300" simplePos="0" relativeHeight="251672576" behindDoc="0" locked="0" layoutInCell="1" allowOverlap="1" wp14:anchorId="290F0F7F" wp14:editId="41D2398D">
                 <wp:simplePos x="0" y="0"/>
                 <wp:positionH relativeFrom="column">
                   <wp:posOffset>62865</wp:posOffset>
@@ -523,7 +1071,7 @@
               </wp:anchor>
             </w:drawing>
           </mc:Choice>
-          <mc:Fallback>
+          <mc:Fallback xmlns:oel="http://schemas.microsoft.com/office/2019/extlst" xmlns:w16du="http://schemas.microsoft.com/office/word/2023/wordml/word16du" xmlns:w16sdtfl="http://schemas.microsoft.com/office/word/2024/wordml/sdtformatlock">
             <w:pict>
               <v:rect w14:anchorId="61AD98A6" id="14 Rectángulo" o:spid="_x0000_s1026" style="position:absolute;margin-left:4.95pt;margin-top:1.55pt;width:29.25pt;height:15.75pt;z-index:251672576;visibility:visible;mso-wrap-style:square;mso-wrap-distance-left:9pt;mso-wrap-distance-top:0;mso-wrap-distance-right:9pt;mso-wrap-distance-bottom:0;mso-position-horizontal:absolute;mso-position-horizontal-relative:text;mso-position-vertical:absolute;mso-position-vertical-relative:text;v-text-anchor:middle" o:gfxdata="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" filled="f" strokecolor="windowText" strokeweight=".25pt"/>
             </w:pict>
@@ -657,16 +1205,16 @@
         <mc:AlternateContent>
           <mc:Choice Requires="wps">
             <w:drawing>
-              <wp:anchor distT="0" distB="0" distL="114300" distR="114300" simplePos="0" relativeHeight="251679744" behindDoc="1" locked="0" layoutInCell="1" allowOverlap="1" wp14:anchorId="2D983EA3" wp14:editId="44A7B4ED">
+              <wp:anchor distT="0" distB="0" distL="114300" distR="114300" simplePos="0" relativeHeight="251679744" behindDoc="1" locked="0" layoutInCell="1" allowOverlap="1" wp14:anchorId="38F6BBD4" wp14:editId="41C3B001">
                 <wp:simplePos x="0" y="0"/>
                 <wp:positionH relativeFrom="column">
-                  <wp:posOffset>4171950</wp:posOffset>
+                  <wp:posOffset>4069537</wp:posOffset>
                 </wp:positionH>
                 <wp:positionV relativeFrom="paragraph">
-                  <wp:posOffset>31115</wp:posOffset>
+                  <wp:posOffset>15215</wp:posOffset>
                 </wp:positionV>
-                <wp:extent cx="1362075" cy="470535"/>
-                <wp:effectExtent l="0" t="0" r="28575" b="24765"/>
+                <wp:extent cx="1803196" cy="470535"/>
+                <wp:effectExtent l="0" t="0" r="26035" b="24765"/>
                 <wp:wrapNone/>
                 <wp:docPr id="28" name="21 Rectángulo"/>
                 <wp:cNvGraphicFramePr/>
@@ -677,7 +1225,7 @@
                       <wps:spPr>
                         <a:xfrm>
                           <a:off x="0" y="0"/>
-                          <a:ext cx="1362075" cy="470535"/>
+                          <a:ext cx="1803196" cy="470535"/>
                         </a:xfrm>
                         <a:prstGeom prst="rect">
                           <a:avLst/>
@@ -707,7 +1255,33 @@
                                 <w:b/>
                                 <w:sz w:val="16"/>
                               </w:rPr>
-                              <w:t>Fecha Inicio: {fechaInicio}</w:t>
+                              <w:t>Fecha Inicio:</w:t>
+                            </w:r>
+                            <w:r>
+                              <w:rPr>
+                                <w:rFonts w:ascii="Arial" w:hAnsi="Arial" w:cs="Arial"/>
+                                <w:bCs/>
+                                <w:sz w:val="16"/>
+                              </w:rPr>
+                              <w:t xml:space="preserve"> {</w:t>
+                            </w:r>
+                            <w:proofErr w:type="spellStart"/>
+                            <w:r>
+                              <w:rPr>
+                                <w:rFonts w:ascii="Arial" w:hAnsi="Arial" w:cs="Arial"/>
+                                <w:bCs/>
+                                <w:sz w:val="16"/>
+                              </w:rPr>
+                              <w:t>fechaInicio</w:t>
+                            </w:r>
+                            <w:proofErr w:type="spellEnd"/>
+                            <w:r>
+                              <w:rPr>
+                                <w:rFonts w:ascii="Arial" w:hAnsi="Arial" w:cs="Arial"/>
+                                <w:bCs/>
+                                <w:sz w:val="16"/>
+                              </w:rPr>
+                              <w:t>}</w:t>
                             </w:r>
                           </w:p>
                           <w:p>
@@ -724,7 +1298,15 @@
                                 <w:b/>
                                 <w:sz w:val="16"/>
                               </w:rPr>
-                              <w:t>Fecha Término: {fechaTermino}</w:t>
+                              <w:t>Fecha Término:</w:t>
+                            </w:r>
+                            <w:r>
+                              <w:rPr>
+                                <w:rFonts w:ascii="Arial" w:hAnsi="Arial" w:cs="Arial"/>
+                                <w:bCs/>
+                                <w:sz w:val="16"/>
+                              </w:rPr>
+                              <w:t xml:space="preserve"> {fechaTermino}</w:t>
                             </w:r>
                           </w:p>
                         </w:txbxContent>
@@ -749,7 +1331,7 @@
           </mc:Choice>
           <mc:Fallback>
             <w:pict>
-              <v:rect w14:anchorId="2D983EA3" id="21 Rectángulo" o:spid="_x0000_s1027" style="position:absolute;left:0;text-align:left;margin-left:328.5pt;margin-top:2.45pt;width:107.25pt;height:37.05pt;z-index:-251636736;visibility:visible;mso-wrap-style:square;mso-width-percent:0;mso-height-percent:0;mso-wrap-distance-left:9pt;mso-wrap-distance-top:0;mso-wrap-distance-right:9pt;mso-wrap-distance-bottom:0;mso-position-horizontal:absolute;mso-position-horizontal-relative:text;mso-position-vertical:absolute;mso-position-vertical-relative:text;mso-width-percent:0;mso-height-percent:0;mso-width-relative:margin;mso-height-relative:margin;v-text-anchor:middle" o:gfxdata="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" filled="f" strokecolor="windowText" strokeweight="2pt">
+              <v:rect w14:anchorId="38F6BBD4" id="21 Rectángulo" o:spid="_x0000_s1031" style="position:absolute;left:0;text-align:left;margin-left:320.45pt;margin-top:1.2pt;width:142pt;height:37.05pt;z-index:-251636736;visibility:visible;mso-wrap-style:square;mso-width-percent:0;mso-height-percent:0;mso-wrap-distance-left:9pt;mso-wrap-distance-top:0;mso-wrap-distance-right:9pt;mso-wrap-distance-bottom:0;mso-position-horizontal:absolute;mso-position-horizontal-relative:text;mso-position-vertical:absolute;mso-position-vertical-relative:text;mso-width-percent:0;mso-height-percent:0;mso-width-relative:margin;mso-height-relative:margin;v-text-anchor:middle" o:gfxdata="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" filled="f" strokecolor="windowText" strokeweight="2pt">
                 <v:textbox>
                   <w:txbxContent>
                     <w:p>
@@ -766,7 +1348,33 @@
                           <w:b/>
                           <w:sz w:val="16"/>
                         </w:rPr>
-                        <w:t>Fecha Inicio: {fechaInicio}</w:t>
+                        <w:t>Fecha Inicio:</w:t>
+                      </w:r>
+                      <w:r>
+                        <w:rPr>
+                          <w:rFonts w:ascii="Arial" w:hAnsi="Arial" w:cs="Arial"/>
+                          <w:bCs/>
+                          <w:sz w:val="16"/>
+                        </w:rPr>
+                        <w:t xml:space="preserve"> {</w:t>
+                      </w:r>
+                      <w:proofErr w:type="spellStart"/>
+                      <w:r>
+                        <w:rPr>
+                          <w:rFonts w:ascii="Arial" w:hAnsi="Arial" w:cs="Arial"/>
+                          <w:bCs/>
+                          <w:sz w:val="16"/>
+                        </w:rPr>
+                        <w:t>fechaInicio</w:t>
+                      </w:r>
+                      <w:proofErr w:type="spellEnd"/>
+                      <w:r>
+                        <w:rPr>
+                          <w:rFonts w:ascii="Arial" w:hAnsi="Arial" w:cs="Arial"/>
+                          <w:bCs/>
+                          <w:sz w:val="16"/>
+                        </w:rPr>
+                        <w:t>}</w:t>
                       </w:r>
                     </w:p>
                     <w:p>
@@ -783,7 +1391,15 @@
                           <w:b/>
                           <w:sz w:val="16"/>
                         </w:rPr>
-                        <w:t>Fecha Término: {fechaTermino}</w:t>
+                        <w:t>Fecha Término:</w:t>
+                      </w:r>
+                      <w:r>
+                        <w:rPr>
+                          <w:rFonts w:ascii="Arial" w:hAnsi="Arial" w:cs="Arial"/>
+                          <w:bCs/>
+                          <w:sz w:val="16"/>
+                        </w:rPr>
+                        <w:t xml:space="preserve"> {fechaTermino}</w:t>
                       </w:r>
                     </w:p>
                   </w:txbxContent>
@@ -808,7 +1424,7 @@
           <w:sz w:val="16"/>
           <w:szCs w:val="16"/>
         </w:rPr>
-        <w:t xml:space="preserve">NOMBRADO {ckNombrado}   </w:t>
+        <w:t xml:space="preserve">NOMBRADO   </w:t>
       </w:r>
       <w:r>
         <w:rPr>
@@ -817,7 +1433,7 @@
           <w:szCs w:val="16"/>
         </w:rPr>
         <w:tab/>
-        <w:t xml:space="preserve">      CAS {ckCAS}</w:t>
+        <w:t xml:space="preserve">      CAS</w:t>
       </w:r>
       <w:r>
         <w:rPr>
@@ -826,23 +1442,23 @@
           <w:szCs w:val="16"/>
         </w:rPr>
         <w:tab/>
-        <w:t xml:space="preserve">                 LOCADOR {ckLocador}</w:t>
-      </w:r>
-      <w:r>
-        <w:rPr>
-          <w:rFonts w:ascii="Arial" w:eastAsia="Calibri" w:hAnsi="Arial" w:cs="Arial"/>
-          <w:sz w:val="16"/>
-          <w:szCs w:val="16"/>
-        </w:rPr>
-        <w:t xml:space="preserve"> / O.S</w:t>
-      </w:r>
-      <w:r>
-        <w:rPr>
-          <w:rFonts w:ascii="Arial" w:eastAsia="Calibri" w:hAnsi="Arial" w:cs="Arial"/>
-          <w:sz w:val="16"/>
-          <w:szCs w:val="16"/>
-        </w:rPr>
-        <w:t xml:space="preserve">                      OTROS {ckOtros}   </w:t>
+        <w:t xml:space="preserve">                 LOCADOR </w:t>
+      </w:r>
+      <w:r>
+        <w:rPr>
+          <w:rFonts w:ascii="Arial" w:eastAsia="Calibri" w:hAnsi="Arial" w:cs="Arial"/>
+          <w:sz w:val="16"/>
+          <w:szCs w:val="16"/>
+        </w:rPr>
+        <w:t>/ O.S</w:t>
+      </w:r>
+      <w:r>
+        <w:rPr>
+          <w:rFonts w:ascii="Arial" w:eastAsia="Calibri" w:hAnsi="Arial" w:cs="Arial"/>
+          <w:sz w:val="16"/>
+          <w:szCs w:val="16"/>
+        </w:rPr>
+        <w:t xml:space="preserve">                      OTROS </w:t>
       </w:r>
     </w:p>
     <w:p>
@@ -998,10 +1614,88 @@
       <w:r>
         <w:rPr>
           <w:rFonts w:ascii="Arial" w:eastAsia="Calibri" w:hAnsi="Arial" w:cs="Arial"/>
-          <w:sz w:val="16"/>
-          <w:szCs w:val="16"/>
-        </w:rPr>
-        <w:t>Dirección/ Oficina: {oficina}  Correo electrónico{correo}</w:t>
+          <w:b/>
+          <w:bCs/>
+          <w:sz w:val="16"/>
+          <w:szCs w:val="16"/>
+        </w:rPr>
+        <w:t>Dirección/ Oficina:</w:t>
+      </w:r>
+      <w:r>
+        <w:rPr>
+          <w:rFonts w:ascii="Arial" w:eastAsia="Calibri" w:hAnsi="Arial" w:cs="Arial"/>
+          <w:sz w:val="16"/>
+          <w:szCs w:val="16"/>
+        </w:rPr>
+        <w:t xml:space="preserve"> {</w:t>
+      </w:r>
+      <w:proofErr w:type="gramStart"/>
+      <w:r>
+        <w:rPr>
+          <w:rFonts w:ascii="Arial" w:eastAsia="Calibri" w:hAnsi="Arial" w:cs="Arial"/>
+          <w:sz w:val="16"/>
+          <w:szCs w:val="16"/>
+        </w:rPr>
+        <w:t xml:space="preserve">oficina}  </w:t>
+      </w:r>
+      <w:r>
+        <w:rPr>
+          <w:rFonts w:ascii="Arial" w:eastAsia="Calibri" w:hAnsi="Arial" w:cs="Arial"/>
+          <w:sz w:val="16"/>
+          <w:szCs w:val="16"/>
+        </w:rPr>
+        <w:tab/>
+      </w:r>
+      <w:proofErr w:type="gramEnd"/>
+      <w:r>
+        <w:rPr>
+          <w:rFonts w:ascii="Arial" w:eastAsia="Calibri" w:hAnsi="Arial" w:cs="Arial"/>
+          <w:sz w:val="16"/>
+          <w:szCs w:val="16"/>
+        </w:rPr>
+        <w:tab/>
+      </w:r>
+      <w:r>
+        <w:rPr>
+          <w:rFonts w:ascii="Arial" w:eastAsia="Calibri" w:hAnsi="Arial" w:cs="Arial"/>
+          <w:sz w:val="16"/>
+          <w:szCs w:val="16"/>
+        </w:rPr>
+        <w:tab/>
+      </w:r>
+      <w:r>
+        <w:rPr>
+          <w:rFonts w:ascii="Arial" w:eastAsia="Calibri" w:hAnsi="Arial" w:cs="Arial"/>
+          <w:sz w:val="16"/>
+          <w:szCs w:val="16"/>
+        </w:rPr>
+        <w:tab/>
+      </w:r>
+      <w:r>
+        <w:rPr>
+          <w:rFonts w:ascii="Arial" w:eastAsia="Calibri" w:hAnsi="Arial" w:cs="Arial"/>
+          <w:sz w:val="16"/>
+          <w:szCs w:val="16"/>
+        </w:rPr>
+        <w:tab/>
+      </w:r>
+      <w:r>
+        <w:rPr>
+          <w:rFonts w:ascii="Arial" w:eastAsia="Calibri" w:hAnsi="Arial" w:cs="Arial"/>
+          <w:b/>
+          <w:bCs/>
+          <w:sz w:val="16"/>
+          <w:szCs w:val="16"/>
+        </w:rPr>
+        <w:t>Correo electrónico</w:t>
+      </w:r>
+      <w:r>
+        <w:rPr>
+          <w:rFonts w:ascii="Arial" w:eastAsia="Calibri" w:hAnsi="Arial" w:cs="Arial"/>
+          <w:sz w:val="16"/>
+          <w:szCs w:val="16"/>
+        </w:rPr>
+        <w:t>{correo}</w:t>
       </w:r>
     </w:p>
     <w:p>
@@ -1109,34 +1803,160 @@
       <w:r>
         <w:rPr>
           <w:rFonts w:ascii="Arial" w:eastAsia="Calibri" w:hAnsi="Arial" w:cs="Arial"/>
-          <w:sz w:val="16"/>
-          <w:szCs w:val="16"/>
-        </w:rPr>
-        <w:t>Cargo / Función{cargo}</w:t>
-      </w:r>
-      <w:r>
-        <w:rPr>
-          <w:rFonts w:ascii="Arial" w:eastAsia="Calibri" w:hAnsi="Arial" w:cs="Arial"/>
-          <w:sz w:val="16"/>
-          <w:szCs w:val="16"/>
-        </w:rPr>
-        <w:t xml:space="preserve">   Anexo / </w:t>
-      </w:r>
-      <w:r>
-        <w:rPr>
-          <w:rFonts w:ascii="Arial" w:eastAsia="Calibri" w:hAnsi="Arial" w:cs="Arial"/>
-          <w:sz w:val="16"/>
-          <w:szCs w:val="16"/>
-        </w:rPr>
-        <w:t>Teléfono</w:t>
-      </w:r>
-      <w:r>
-        <w:rPr>
-          <w:rFonts w:ascii="Arial" w:eastAsia="Calibri" w:hAnsi="Arial" w:cs="Arial"/>
-          <w:sz w:val="16"/>
-          <w:szCs w:val="16"/>
-        </w:rPr>
-        <w:t>: {telefono}Sede:{sede}</w:t>
+          <w:b/>
+          <w:bCs/>
+          <w:sz w:val="16"/>
+          <w:szCs w:val="16"/>
+        </w:rPr>
+        <w:t xml:space="preserve">Cargo / </w:t>
+      </w:r>
+      <w:proofErr w:type="gramStart"/>
+      <w:r>
+        <w:rPr>
+          <w:rFonts w:ascii="Arial" w:eastAsia="Calibri" w:hAnsi="Arial" w:cs="Arial"/>
+          <w:b/>
+          <w:bCs/>
+          <w:sz w:val="16"/>
+          <w:szCs w:val="16"/>
+        </w:rPr>
+        <w:t>Función</w:t>
+      </w:r>
+      <w:r>
+        <w:rPr>
+          <w:rFonts w:ascii="Arial" w:eastAsia="Calibri" w:hAnsi="Arial" w:cs="Arial"/>
+          <w:sz w:val="16"/>
+          <w:szCs w:val="16"/>
+        </w:rPr>
+        <w:t>:</w:t>
+      </w:r>
+      <w:r>
+        <w:rPr>
+          <w:rFonts w:ascii="Arial" w:eastAsia="Calibri" w:hAnsi="Arial" w:cs="Arial"/>
+          <w:sz w:val="16"/>
+          <w:szCs w:val="16"/>
+        </w:rPr>
+        <w:t>{</w:t>
+      </w:r>
+      <w:proofErr w:type="gramEnd"/>
+      <w:r>
+        <w:rPr>
+          <w:rFonts w:ascii="Arial" w:eastAsia="Calibri" w:hAnsi="Arial" w:cs="Arial"/>
+          <w:sz w:val="16"/>
+          <w:szCs w:val="16"/>
+        </w:rPr>
+        <w:t>cargo}</w:t>
+      </w:r>
+      <w:r>
+        <w:rPr>
+          <w:rFonts w:ascii="Arial" w:eastAsia="Calibri" w:hAnsi="Arial" w:cs="Arial"/>
+          <w:sz w:val="16"/>
+          <w:szCs w:val="16"/>
+        </w:rPr>
+        <w:t xml:space="preserve">  </w:t>
+      </w:r>
+      <w:r>
+        <w:rPr>
+          <w:rFonts w:ascii="Arial" w:eastAsia="Calibri" w:hAnsi="Arial" w:cs="Arial"/>
+          <w:sz w:val="16"/>
+          <w:szCs w:val="16"/>
+        </w:rPr>
+        <w:tab/>
+      </w:r>
+      <w:r>
+        <w:rPr>
+          <w:rFonts w:ascii="Arial" w:eastAsia="Calibri" w:hAnsi="Arial" w:cs="Arial"/>
+          <w:sz w:val="16"/>
+          <w:szCs w:val="16"/>
+        </w:rPr>
+        <w:tab/>
+      </w:r>
+      <w:r>
+        <w:rPr>
+          <w:rFonts w:ascii="Arial" w:eastAsia="Calibri" w:hAnsi="Arial" w:cs="Arial"/>
+          <w:sz w:val="16"/>
+          <w:szCs w:val="16"/>
+        </w:rPr>
+        <w:tab/>
+      </w:r>
+      <w:r>
+        <w:rPr>
+          <w:rFonts w:ascii="Arial" w:eastAsia="Calibri" w:hAnsi="Arial" w:cs="Arial"/>
+          <w:b/>
+          <w:bCs/>
+          <w:sz w:val="16"/>
+          <w:szCs w:val="16"/>
+        </w:rPr>
+        <w:t xml:space="preserve">Anexo / </w:t>
+      </w:r>
+      <w:r>
+        <w:rPr>
+          <w:rFonts w:ascii="Arial" w:eastAsia="Calibri" w:hAnsi="Arial" w:cs="Arial"/>
+          <w:b/>
+          <w:bCs/>
+          <w:sz w:val="16"/>
+          <w:szCs w:val="16"/>
+        </w:rPr>
+        <w:t>Teléfono:</w:t>
+      </w:r>
+      <w:r>
+        <w:rPr>
+          <w:rFonts w:ascii="Arial" w:eastAsia="Calibri" w:hAnsi="Arial" w:cs="Arial"/>
+          <w:sz w:val="16"/>
+          <w:szCs w:val="16"/>
+        </w:rPr>
+        <w:t xml:space="preserve"> {</w:t>
+      </w:r>
+      <w:proofErr w:type="spellStart"/>
+      <w:r>
+        <w:rPr>
+          <w:rFonts w:ascii="Arial" w:eastAsia="Calibri" w:hAnsi="Arial" w:cs="Arial"/>
+          <w:sz w:val="16"/>
+          <w:szCs w:val="16"/>
+        </w:rPr>
+        <w:t>telefono</w:t>
+      </w:r>
+      <w:proofErr w:type="spellEnd"/>
+      <w:r>
+        <w:rPr>
+          <w:rFonts w:ascii="Arial" w:eastAsia="Calibri" w:hAnsi="Arial" w:cs="Arial"/>
+          <w:sz w:val="16"/>
+          <w:szCs w:val="16"/>
+        </w:rPr>
+        <w:t>}</w:t>
+      </w:r>
+      <w:r>
+        <w:rPr>
+          <w:rFonts w:ascii="Arial" w:eastAsia="Calibri" w:hAnsi="Arial" w:cs="Arial"/>
+          <w:sz w:val="16"/>
+          <w:szCs w:val="16"/>
+        </w:rPr>
+        <w:tab/>
+      </w:r>
+      <w:r>
+        <w:rPr>
+          <w:rFonts w:ascii="Arial" w:eastAsia="Calibri" w:hAnsi="Arial" w:cs="Arial"/>
+          <w:sz w:val="16"/>
+          <w:szCs w:val="16"/>
+        </w:rPr>
+        <w:tab/>
+      </w:r>
+      <w:r>
+        <w:rPr>
+          <w:rFonts w:ascii="Arial" w:eastAsia="Calibri" w:hAnsi="Arial" w:cs="Arial"/>
+          <w:b/>
+          <w:bCs/>
+          <w:sz w:val="16"/>
+          <w:szCs w:val="16"/>
+        </w:rPr>
+        <w:t>Sede:</w:t>
+      </w:r>
+      <w:r>
+        <w:rPr>
+          <w:rFonts w:ascii="Arial" w:eastAsia="Calibri" w:hAnsi="Arial" w:cs="Arial"/>
+          <w:sz w:val="16"/>
+          <w:szCs w:val="16"/>
+        </w:rPr>
+        <w:t>{sede}</w:t>
       </w:r>
     </w:p>
     <w:p>
@@ -1165,13 +1985,13 @@
         <mc:AlternateContent>
           <mc:Choice Requires="wps">
             <w:drawing>
-              <wp:anchor distT="0" distB="0" distL="114300" distR="114300" simplePos="0" relativeHeight="251704320" behindDoc="0" locked="0" layoutInCell="1" allowOverlap="1" wp14:anchorId="041384C5" wp14:editId="7BD92CE4">
+              <wp:anchor distT="0" distB="0" distL="114300" distR="114300" simplePos="0" relativeHeight="251704320" behindDoc="0" locked="0" layoutInCell="1" allowOverlap="1" wp14:anchorId="7C9F8A44" wp14:editId="60D7810F">
                 <wp:simplePos x="0" y="0"/>
                 <wp:positionH relativeFrom="column">
-                  <wp:posOffset>4570038</wp:posOffset>
+                  <wp:posOffset>4430471</wp:posOffset>
                 </wp:positionH>
                 <wp:positionV relativeFrom="paragraph">
-                  <wp:posOffset>85062</wp:posOffset>
+                  <wp:posOffset>73482</wp:posOffset>
                 </wp:positionV>
                 <wp:extent cx="812042" cy="200025"/>
                 <wp:effectExtent l="0" t="0" r="26670" b="28575"/>
@@ -1216,535 +2036,7 @@
           </mc:Choice>
           <mc:Fallback>
             <w:pict>
-              <v:rect w14:anchorId="5A50D51D" id="17 Rectángulo" o:spid="_x0000_s1026" style="position:absolute;margin-left:359.85pt;margin-top:6.7pt;width:63.95pt;height:15.75pt;z-index:251704320;visibility:visible;mso-wrap-style:square;mso-width-percent:0;mso-wrap-distance-left:9pt;mso-wrap-distance-top:0;mso-wrap-distance-right:9pt;mso-wrap-distance-bottom:0;mso-position-horizontal:absolute;mso-position-horizontal-relative:text;mso-position-vertical:absolute;mso-position-vertical-relative:text;mso-width-percent:0;mso-width-relative:margin;v-text-anchor:middle" o:gfxdata="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" filled="f" strokecolor="windowText" strokeweight=".25pt"/>
-            </w:pict>
-          </mc:Fallback>
-        </mc:AlternateContent>
-      </w:r>
-      <w:r>
-        <w:rPr>
-          <w:rFonts w:ascii="Arial" w:eastAsia="Calibri" w:hAnsi="Arial" w:cs="Arial"/>
-          <w:noProof/>
-          <w:sz w:val="16"/>
-          <w:szCs w:val="16"/>
-          <w:lang w:eastAsia="es-PE"/>
-        </w:rPr>
-        <mc:AlternateContent>
-          <mc:Choice Requires="wps">
-            <w:drawing>
-              <wp:anchor distT="0" distB="0" distL="114300" distR="114300" simplePos="0" relativeHeight="251664384" behindDoc="0" locked="0" layoutInCell="1" allowOverlap="1" wp14:anchorId="70D4CD66" wp14:editId="2ED8B213">
-                <wp:simplePos x="0" y="0"/>
-                <wp:positionH relativeFrom="column">
-                  <wp:posOffset>2402678</wp:posOffset>
-                </wp:positionH>
-                <wp:positionV relativeFrom="paragraph">
-                  <wp:posOffset>97155</wp:posOffset>
-                </wp:positionV>
-                <wp:extent cx="247650" cy="152400"/>
-                <wp:effectExtent l="0" t="0" r="19050" b="19050"/>
-                <wp:wrapNone/>
-                <wp:docPr id="6" name="6 Rectángulo"/>
-                <wp:cNvGraphicFramePr/>
-                <a:graphic xmlns:a="http://schemas.openxmlformats.org/drawingml/2006/main">
-                  <a:graphicData uri="http://schemas.microsoft.com/office/word/2010/wordprocessingShape">
-                    <wps:wsp>
-                      <wps:cNvSpPr/>
-                      <wps:spPr>
-                        <a:xfrm>
-                          <a:off x="0" y="0"/>
-                          <a:ext cx="247650" cy="152400"/>
-                        </a:xfrm>
-                        <a:prstGeom prst="rect">
-                          <a:avLst/>
-                        </a:prstGeom>
-                        <a:solidFill>
-                          <a:sysClr val="window" lastClr="FFFFFF"/>
-                        </a:solidFill>
-                        <a:ln w="25400" cap="flat" cmpd="sng" algn="ctr">
-                          <a:solidFill>
-                            <a:sysClr val="windowText" lastClr="000000"/>
-                          </a:solidFill>
-                          <a:prstDash val="solid"/>
-                        </a:ln>
-                        <a:effectLst/>
-                      </wps:spPr>
-                      <wps:bodyPr rot="0" spcFirstLastPara="0" vertOverflow="overflow" horzOverflow="overflow" vert="horz" wrap="square" lIns="91440" tIns="45720" rIns="91440" bIns="45720" numCol="1" spcCol="0" rtlCol="0" fromWordArt="0" anchor="ctr" anchorCtr="0" forceAA="0" compatLnSpc="1">
-                        <a:prstTxWarp prst="textNoShape">
-                          <a:avLst/>
-                        </a:prstTxWarp>
-                        <a:noAutofit/>
-                      </wps:bodyPr>
-                    </wps:wsp>
-                  </a:graphicData>
-                </a:graphic>
-              </wp:anchor>
-            </w:drawing>
-          </mc:Choice>
-          <mc:Fallback>
-            <w:pict>
-              <v:rect w14:anchorId="273DDB4C" id="6 Rectángulo" o:spid="_x0000_s1026" style="position:absolute;margin-left:189.2pt;margin-top:7.65pt;width:19.5pt;height:12pt;z-index:251664384;visibility:visible;mso-wrap-style:square;mso-wrap-distance-left:9pt;mso-wrap-distance-top:0;mso-wrap-distance-right:9pt;mso-wrap-distance-bottom:0;mso-position-horizontal:absolute;mso-position-horizontal-relative:text;mso-position-vertical:absolute;mso-position-vertical-relative:text;v-text-anchor:middle" o:gfxdata="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" fillcolor="window" strokecolor="windowText" strokeweight="2pt"/>
-            </w:pict>
-          </mc:Fallback>
-        </mc:AlternateContent>
-      </w:r>
-      <w:r>
-        <w:rPr>
-          <w:rFonts w:ascii="Arial" w:eastAsia="Calibri" w:hAnsi="Arial" w:cs="Arial"/>
-          <w:noProof/>
-          <w:sz w:val="16"/>
-          <w:szCs w:val="16"/>
-          <w:lang w:eastAsia="es-PE"/>
-        </w:rPr>
-        <mc:AlternateContent>
-          <mc:Choice Requires="wps">
-            <w:drawing>
-              <wp:anchor distT="0" distB="0" distL="114300" distR="114300" simplePos="0" relativeHeight="251665408" behindDoc="0" locked="0" layoutInCell="1" allowOverlap="1" wp14:anchorId="4A344BA8" wp14:editId="5347542E">
-                <wp:simplePos x="0" y="0"/>
-                <wp:positionH relativeFrom="column">
-                  <wp:posOffset>2650328</wp:posOffset>
-                </wp:positionH>
-                <wp:positionV relativeFrom="paragraph">
-                  <wp:posOffset>97155</wp:posOffset>
-                </wp:positionV>
-                <wp:extent cx="247650" cy="152400"/>
-                <wp:effectExtent l="0" t="0" r="19050" b="19050"/>
-                <wp:wrapNone/>
-                <wp:docPr id="7" name="7 Rectángulo"/>
-                <wp:cNvGraphicFramePr/>
-                <a:graphic xmlns:a="http://schemas.openxmlformats.org/drawingml/2006/main">
-                  <a:graphicData uri="http://schemas.microsoft.com/office/word/2010/wordprocessingShape">
-                    <wps:wsp>
-                      <wps:cNvSpPr/>
-                      <wps:spPr>
-                        <a:xfrm>
-                          <a:off x="0" y="0"/>
-                          <a:ext cx="247650" cy="152400"/>
-                        </a:xfrm>
-                        <a:prstGeom prst="rect">
-                          <a:avLst/>
-                        </a:prstGeom>
-                        <a:solidFill>
-                          <a:sysClr val="window" lastClr="FFFFFF"/>
-                        </a:solidFill>
-                        <a:ln w="25400" cap="flat" cmpd="sng" algn="ctr">
-                          <a:solidFill>
-                            <a:sysClr val="windowText" lastClr="000000"/>
-                          </a:solidFill>
-                          <a:prstDash val="solid"/>
-                        </a:ln>
-                        <a:effectLst/>
-                      </wps:spPr>
-                      <wps:bodyPr rot="0" spcFirstLastPara="0" vertOverflow="overflow" horzOverflow="overflow" vert="horz" wrap="square" lIns="91440" tIns="45720" rIns="91440" bIns="45720" numCol="1" spcCol="0" rtlCol="0" fromWordArt="0" anchor="ctr" anchorCtr="0" forceAA="0" compatLnSpc="1">
-                        <a:prstTxWarp prst="textNoShape">
-                          <a:avLst/>
-                        </a:prstTxWarp>
-                        <a:noAutofit/>
-                      </wps:bodyPr>
-                    </wps:wsp>
-                  </a:graphicData>
-                </a:graphic>
-              </wp:anchor>
-            </w:drawing>
-          </mc:Choice>
-          <mc:Fallback>
-            <w:pict>
-              <v:rect w14:anchorId="0A146511" id="7 Rectángulo" o:spid="_x0000_s1026" style="position:absolute;margin-left:208.7pt;margin-top:7.65pt;width:19.5pt;height:12pt;z-index:251665408;visibility:visible;mso-wrap-style:square;mso-wrap-distance-left:9pt;mso-wrap-distance-top:0;mso-wrap-distance-right:9pt;mso-wrap-distance-bottom:0;mso-position-horizontal:absolute;mso-position-horizontal-relative:text;mso-position-vertical:absolute;mso-position-vertical-relative:text;v-text-anchor:middle" o:gfxdata="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" fillcolor="window" strokecolor="windowText" strokeweight="2pt"/>
-            </w:pict>
-          </mc:Fallback>
-        </mc:AlternateContent>
-      </w:r>
-      <w:r>
-        <w:rPr>
-          <w:rFonts w:ascii="Arial" w:eastAsia="Calibri" w:hAnsi="Arial" w:cs="Arial"/>
-          <w:noProof/>
-          <w:sz w:val="16"/>
-          <w:szCs w:val="16"/>
-          <w:lang w:eastAsia="es-PE"/>
-        </w:rPr>
-        <mc:AlternateContent>
-          <mc:Choice Requires="wps">
-            <w:drawing>
-              <wp:anchor distT="0" distB="0" distL="114300" distR="114300" simplePos="0" relativeHeight="251663360" behindDoc="0" locked="0" layoutInCell="1" allowOverlap="1" wp14:anchorId="727554FB" wp14:editId="1A4A0D15">
-                <wp:simplePos x="0" y="0"/>
-                <wp:positionH relativeFrom="column">
-                  <wp:posOffset>2164553</wp:posOffset>
-                </wp:positionH>
-                <wp:positionV relativeFrom="paragraph">
-                  <wp:posOffset>97155</wp:posOffset>
-                </wp:positionV>
-                <wp:extent cx="247650" cy="152400"/>
-                <wp:effectExtent l="0" t="0" r="19050" b="19050"/>
-                <wp:wrapNone/>
-                <wp:docPr id="5" name="5 Rectángulo"/>
-                <wp:cNvGraphicFramePr/>
-                <a:graphic xmlns:a="http://schemas.openxmlformats.org/drawingml/2006/main">
-                  <a:graphicData uri="http://schemas.microsoft.com/office/word/2010/wordprocessingShape">
-                    <wps:wsp>
-                      <wps:cNvSpPr/>
-                      <wps:spPr>
-                        <a:xfrm>
-                          <a:off x="0" y="0"/>
-                          <a:ext cx="247650" cy="152400"/>
-                        </a:xfrm>
-                        <a:prstGeom prst="rect">
-                          <a:avLst/>
-                        </a:prstGeom>
-                        <a:solidFill>
-                          <a:sysClr val="window" lastClr="FFFFFF"/>
-                        </a:solidFill>
-                        <a:ln w="25400" cap="flat" cmpd="sng" algn="ctr">
-                          <a:solidFill>
-                            <a:sysClr val="windowText" lastClr="000000"/>
-                          </a:solidFill>
-                          <a:prstDash val="solid"/>
-                        </a:ln>
-                        <a:effectLst/>
-                      </wps:spPr>
-                      <wps:bodyPr rot="0" spcFirstLastPara="0" vertOverflow="overflow" horzOverflow="overflow" vert="horz" wrap="square" lIns="91440" tIns="45720" rIns="91440" bIns="45720" numCol="1" spcCol="0" rtlCol="0" fromWordArt="0" anchor="ctr" anchorCtr="0" forceAA="0" compatLnSpc="1">
-                        <a:prstTxWarp prst="textNoShape">
-                          <a:avLst/>
-                        </a:prstTxWarp>
-                        <a:noAutofit/>
-                      </wps:bodyPr>
-                    </wps:wsp>
-                  </a:graphicData>
-                </a:graphic>
-              </wp:anchor>
-            </w:drawing>
-          </mc:Choice>
-          <mc:Fallback>
-            <w:pict>
-              <v:rect w14:anchorId="0E044DC6" id="5 Rectángulo" o:spid="_x0000_s1026" style="position:absolute;margin-left:170.45pt;margin-top:7.65pt;width:19.5pt;height:12pt;z-index:251663360;visibility:visible;mso-wrap-style:square;mso-wrap-distance-left:9pt;mso-wrap-distance-top:0;mso-wrap-distance-right:9pt;mso-wrap-distance-bottom:0;mso-position-horizontal:absolute;mso-position-horizontal-relative:text;mso-position-vertical:absolute;mso-position-vertical-relative:text;v-text-anchor:middle" o:gfxdata="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" fillcolor="window" strokecolor="windowText" strokeweight="2pt"/>
-            </w:pict>
-          </mc:Fallback>
-        </mc:AlternateContent>
-      </w:r>
-      <w:r>
-        <w:rPr>
-          <w:rFonts w:ascii="Arial" w:eastAsia="Calibri" w:hAnsi="Arial" w:cs="Arial"/>
-          <w:noProof/>
-          <w:sz w:val="16"/>
-          <w:szCs w:val="16"/>
-          <w:lang w:eastAsia="es-PE"/>
-        </w:rPr>
-        <mc:AlternateContent>
-          <mc:Choice Requires="wps">
-            <w:drawing>
-              <wp:anchor distT="0" distB="0" distL="114300" distR="114300" simplePos="0" relativeHeight="251662336" behindDoc="0" locked="0" layoutInCell="1" allowOverlap="1" wp14:anchorId="25E4A7B0" wp14:editId="5001C23C">
-                <wp:simplePos x="0" y="0"/>
-                <wp:positionH relativeFrom="column">
-                  <wp:posOffset>1916903</wp:posOffset>
-                </wp:positionH>
-                <wp:positionV relativeFrom="paragraph">
-                  <wp:posOffset>97155</wp:posOffset>
-                </wp:positionV>
-                <wp:extent cx="247650" cy="152400"/>
-                <wp:effectExtent l="0" t="0" r="19050" b="19050"/>
-                <wp:wrapNone/>
-                <wp:docPr id="4" name="4 Rectángulo"/>
-                <wp:cNvGraphicFramePr/>
-                <a:graphic xmlns:a="http://schemas.openxmlformats.org/drawingml/2006/main">
-                  <a:graphicData uri="http://schemas.microsoft.com/office/word/2010/wordprocessingShape">
-                    <wps:wsp>
-                      <wps:cNvSpPr/>
-                      <wps:spPr>
-                        <a:xfrm>
-                          <a:off x="0" y="0"/>
-                          <a:ext cx="247650" cy="152400"/>
-                        </a:xfrm>
-                        <a:prstGeom prst="rect">
-                          <a:avLst/>
-                        </a:prstGeom>
-                        <a:solidFill>
-                          <a:sysClr val="window" lastClr="FFFFFF"/>
-                        </a:solidFill>
-                        <a:ln w="25400" cap="flat" cmpd="sng" algn="ctr">
-                          <a:solidFill>
-                            <a:sysClr val="windowText" lastClr="000000"/>
-                          </a:solidFill>
-                          <a:prstDash val="solid"/>
-                        </a:ln>
-                        <a:effectLst/>
-                      </wps:spPr>
-                      <wps:bodyPr rot="0" spcFirstLastPara="0" vertOverflow="overflow" horzOverflow="overflow" vert="horz" wrap="square" lIns="91440" tIns="45720" rIns="91440" bIns="45720" numCol="1" spcCol="0" rtlCol="0" fromWordArt="0" anchor="ctr" anchorCtr="0" forceAA="0" compatLnSpc="1">
-                        <a:prstTxWarp prst="textNoShape">
-                          <a:avLst/>
-                        </a:prstTxWarp>
-                        <a:noAutofit/>
-                      </wps:bodyPr>
-                    </wps:wsp>
-                  </a:graphicData>
-                </a:graphic>
-              </wp:anchor>
-            </w:drawing>
-          </mc:Choice>
-          <mc:Fallback>
-            <w:pict>
-              <v:rect w14:anchorId="3452E065" id="4 Rectángulo" o:spid="_x0000_s1026" style="position:absolute;margin-left:150.95pt;margin-top:7.65pt;width:19.5pt;height:12pt;z-index:251662336;visibility:visible;mso-wrap-style:square;mso-wrap-distance-left:9pt;mso-wrap-distance-top:0;mso-wrap-distance-right:9pt;mso-wrap-distance-bottom:0;mso-position-horizontal:absolute;mso-position-horizontal-relative:text;mso-position-vertical:absolute;mso-position-vertical-relative:text;v-text-anchor:middle" o:gfxdata="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" fillcolor="window" strokecolor="windowText" strokeweight="2pt"/>
-            </w:pict>
-          </mc:Fallback>
-        </mc:AlternateContent>
-      </w:r>
-      <w:r>
-        <w:rPr>
-          <w:rFonts w:ascii="Arial" w:eastAsia="Calibri" w:hAnsi="Arial" w:cs="Arial"/>
-          <w:noProof/>
-          <w:sz w:val="16"/>
-          <w:szCs w:val="16"/>
-          <w:lang w:eastAsia="es-PE"/>
-        </w:rPr>
-        <mc:AlternateContent>
-          <mc:Choice Requires="wps">
-            <w:drawing>
-              <wp:anchor distT="0" distB="0" distL="114300" distR="114300" simplePos="0" relativeHeight="251661312" behindDoc="0" locked="0" layoutInCell="1" allowOverlap="1" wp14:anchorId="6E855395" wp14:editId="0BE46887">
-                <wp:simplePos x="0" y="0"/>
-                <wp:positionH relativeFrom="column">
-                  <wp:posOffset>1717513</wp:posOffset>
-                </wp:positionH>
-                <wp:positionV relativeFrom="paragraph">
-                  <wp:posOffset>97155</wp:posOffset>
-                </wp:positionV>
-                <wp:extent cx="247650" cy="152400"/>
-                <wp:effectExtent l="0" t="0" r="19050" b="19050"/>
-                <wp:wrapNone/>
-                <wp:docPr id="3" name="3 Rectángulo"/>
-                <wp:cNvGraphicFramePr/>
-                <a:graphic xmlns:a="http://schemas.openxmlformats.org/drawingml/2006/main">
-                  <a:graphicData uri="http://schemas.microsoft.com/office/word/2010/wordprocessingShape">
-                    <wps:wsp>
-                      <wps:cNvSpPr/>
-                      <wps:spPr>
-                        <a:xfrm>
-                          <a:off x="0" y="0"/>
-                          <a:ext cx="247650" cy="152400"/>
-                        </a:xfrm>
-                        <a:prstGeom prst="rect">
-                          <a:avLst/>
-                        </a:prstGeom>
-                        <a:solidFill>
-                          <a:sysClr val="window" lastClr="FFFFFF"/>
-                        </a:solidFill>
-                        <a:ln w="25400" cap="flat" cmpd="sng" algn="ctr">
-                          <a:solidFill>
-                            <a:sysClr val="windowText" lastClr="000000"/>
-                          </a:solidFill>
-                          <a:prstDash val="solid"/>
-                        </a:ln>
-                        <a:effectLst/>
-                      </wps:spPr>
-                      <wps:bodyPr rot="0" spcFirstLastPara="0" vertOverflow="overflow" horzOverflow="overflow" vert="horz" wrap="square" lIns="91440" tIns="45720" rIns="91440" bIns="45720" numCol="1" spcCol="0" rtlCol="0" fromWordArt="0" anchor="ctr" anchorCtr="0" forceAA="0" compatLnSpc="1">
-                        <a:prstTxWarp prst="textNoShape">
-                          <a:avLst/>
-                        </a:prstTxWarp>
-                        <a:noAutofit/>
-                      </wps:bodyPr>
-                    </wps:wsp>
-                  </a:graphicData>
-                </a:graphic>
-              </wp:anchor>
-            </w:drawing>
-          </mc:Choice>
-          <mc:Fallback>
-            <w:pict>
-              <v:rect w14:anchorId="22753E6A" id="3 Rectángulo" o:spid="_x0000_s1026" style="position:absolute;margin-left:135.25pt;margin-top:7.65pt;width:19.5pt;height:12pt;z-index:251661312;visibility:visible;mso-wrap-style:square;mso-wrap-distance-left:9pt;mso-wrap-distance-top:0;mso-wrap-distance-right:9pt;mso-wrap-distance-bottom:0;mso-position-horizontal:absolute;mso-position-horizontal-relative:text;mso-position-vertical:absolute;mso-position-vertical-relative:text;v-text-anchor:middle" o:gfxdata="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" fillcolor="window" strokecolor="windowText" strokeweight="2pt"/>
-            </w:pict>
-          </mc:Fallback>
-        </mc:AlternateContent>
-      </w:r>
-      <w:r>
-        <w:rPr>
-          <w:rFonts w:ascii="Arial" w:eastAsia="Calibri" w:hAnsi="Arial" w:cs="Arial"/>
-          <w:noProof/>
-          <w:sz w:val="16"/>
-          <w:szCs w:val="16"/>
-          <w:lang w:eastAsia="es-PE"/>
-        </w:rPr>
-        <mc:AlternateContent>
-          <mc:Choice Requires="wps">
-            <w:drawing>
-              <wp:anchor distT="0" distB="0" distL="114300" distR="114300" simplePos="0" relativeHeight="251660288" behindDoc="0" locked="0" layoutInCell="1" allowOverlap="1" wp14:anchorId="548ABE03" wp14:editId="69A8510E">
-                <wp:simplePos x="0" y="0"/>
-                <wp:positionH relativeFrom="column">
-                  <wp:posOffset>1500343</wp:posOffset>
-                </wp:positionH>
-                <wp:positionV relativeFrom="paragraph">
-                  <wp:posOffset>97155</wp:posOffset>
-                </wp:positionV>
-                <wp:extent cx="247650" cy="152400"/>
-                <wp:effectExtent l="0" t="0" r="19050" b="19050"/>
-                <wp:wrapNone/>
-                <wp:docPr id="24" name="2 Rectángulo"/>
-                <wp:cNvGraphicFramePr/>
-                <a:graphic xmlns:a="http://schemas.openxmlformats.org/drawingml/2006/main">
-                  <a:graphicData uri="http://schemas.microsoft.com/office/word/2010/wordprocessingShape">
-                    <wps:wsp>
-                      <wps:cNvSpPr/>
-                      <wps:spPr>
-                        <a:xfrm>
-                          <a:off x="0" y="0"/>
-                          <a:ext cx="247650" cy="152400"/>
-                        </a:xfrm>
-                        <a:prstGeom prst="rect">
-                          <a:avLst/>
-                        </a:prstGeom>
-                        <a:solidFill>
-                          <a:sysClr val="window" lastClr="FFFFFF"/>
-                        </a:solidFill>
-                        <a:ln w="25400" cap="flat" cmpd="sng" algn="ctr">
-                          <a:solidFill>
-                            <a:sysClr val="windowText" lastClr="000000"/>
-                          </a:solidFill>
-                          <a:prstDash val="solid"/>
-                        </a:ln>
-                        <a:effectLst/>
-                      </wps:spPr>
-                      <wps:bodyPr rot="0" spcFirstLastPara="0" vertOverflow="overflow" horzOverflow="overflow" vert="horz" wrap="square" lIns="91440" tIns="45720" rIns="91440" bIns="45720" numCol="1" spcCol="0" rtlCol="0" fromWordArt="0" anchor="ctr" anchorCtr="0" forceAA="0" compatLnSpc="1">
-                        <a:prstTxWarp prst="textNoShape">
-                          <a:avLst/>
-                        </a:prstTxWarp>
-                        <a:noAutofit/>
-                      </wps:bodyPr>
-                    </wps:wsp>
-                  </a:graphicData>
-                </a:graphic>
-              </wp:anchor>
-            </w:drawing>
-          </mc:Choice>
-          <mc:Fallback>
-            <w:pict>
-              <v:rect w14:anchorId="59BE4E64" id="2 Rectángulo" o:spid="_x0000_s1026" style="position:absolute;margin-left:118.15pt;margin-top:7.65pt;width:19.5pt;height:12pt;z-index:251660288;visibility:visible;mso-wrap-style:square;mso-wrap-distance-left:9pt;mso-wrap-distance-top:0;mso-wrap-distance-right:9pt;mso-wrap-distance-bottom:0;mso-position-horizontal:absolute;mso-position-horizontal-relative:text;mso-position-vertical:absolute;mso-position-vertical-relative:text;v-text-anchor:middle" o:gfxdata="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" fillcolor="window" strokecolor="windowText" strokeweight="2pt"/>
-            </w:pict>
-          </mc:Fallback>
-        </mc:AlternateContent>
-      </w:r>
-      <w:r>
-        <w:rPr>
-          <w:rFonts w:ascii="Arial" w:eastAsia="Calibri" w:hAnsi="Arial" w:cs="Arial"/>
-          <w:noProof/>
-          <w:sz w:val="16"/>
-          <w:szCs w:val="16"/>
-          <w:lang w:eastAsia="es-PE"/>
-        </w:rPr>
-        <mc:AlternateContent>
-          <mc:Choice Requires="wps">
-            <w:drawing>
-              <wp:anchor distT="0" distB="0" distL="114300" distR="114300" simplePos="0" relativeHeight="251659264" behindDoc="0" locked="0" layoutInCell="1" allowOverlap="1" wp14:anchorId="793A695D" wp14:editId="50E90879">
-                <wp:simplePos x="0" y="0"/>
-                <wp:positionH relativeFrom="column">
-                  <wp:posOffset>1293333</wp:posOffset>
-                </wp:positionH>
-                <wp:positionV relativeFrom="paragraph">
-                  <wp:posOffset>97155</wp:posOffset>
-                </wp:positionV>
-                <wp:extent cx="247650" cy="152400"/>
-                <wp:effectExtent l="0" t="0" r="19050" b="19050"/>
-                <wp:wrapNone/>
-                <wp:docPr id="25" name="1 Rectángulo"/>
-                <wp:cNvGraphicFramePr/>
-                <a:graphic xmlns:a="http://schemas.openxmlformats.org/drawingml/2006/main">
-                  <a:graphicData uri="http://schemas.microsoft.com/office/word/2010/wordprocessingShape">
-                    <wps:wsp>
-                      <wps:cNvSpPr/>
-                      <wps:spPr>
-                        <a:xfrm>
-                          <a:off x="0" y="0"/>
-                          <a:ext cx="247650" cy="152400"/>
-                        </a:xfrm>
-                        <a:prstGeom prst="rect">
-                          <a:avLst/>
-                        </a:prstGeom>
-                        <a:solidFill>
-                          <a:sysClr val="window" lastClr="FFFFFF"/>
-                        </a:solidFill>
-                        <a:ln w="25400" cap="flat" cmpd="sng" algn="ctr">
-                          <a:solidFill>
-                            <a:sysClr val="windowText" lastClr="000000"/>
-                          </a:solidFill>
-                          <a:prstDash val="solid"/>
-                        </a:ln>
-                        <a:effectLst/>
-                      </wps:spPr>
-                      <wps:bodyPr rot="0" spcFirstLastPara="0" vertOverflow="overflow" horzOverflow="overflow" vert="horz" wrap="square" lIns="91440" tIns="45720" rIns="91440" bIns="45720" numCol="1" spcCol="0" rtlCol="0" fromWordArt="0" anchor="ctr" anchorCtr="0" forceAA="0" compatLnSpc="1">
-                        <a:prstTxWarp prst="textNoShape">
-                          <a:avLst/>
-                        </a:prstTxWarp>
-                        <a:noAutofit/>
-                      </wps:bodyPr>
-                    </wps:wsp>
-                  </a:graphicData>
-                </a:graphic>
-              </wp:anchor>
-            </w:drawing>
-          </mc:Choice>
-          <mc:Fallback>
-            <w:pict>
-              <v:rect w14:anchorId="40418A67" id="1 Rectángulo" o:spid="_x0000_s1026" style="position:absolute;margin-left:101.85pt;margin-top:7.65pt;width:19.5pt;height:12pt;z-index:251659264;visibility:visible;mso-wrap-style:square;mso-wrap-distance-left:9pt;mso-wrap-distance-top:0;mso-wrap-distance-right:9pt;mso-wrap-distance-bottom:0;mso-position-horizontal:absolute;mso-position-horizontal-relative:text;mso-position-vertical:absolute;mso-position-vertical-relative:text;v-text-anchor:middle" o:gfxdata="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" fillcolor="window" strokecolor="windowText" strokeweight="2pt"/>
-            </w:pict>
-          </mc:Fallback>
-        </mc:AlternateContent>
-      </w:r>
-      <w:r>
-        <w:rPr>
-          <w:rFonts w:ascii="Arial" w:eastAsia="Calibri" w:hAnsi="Arial" w:cs="Arial"/>
-          <w:noProof/>
-          <w:sz w:val="16"/>
-          <w:szCs w:val="16"/>
-          <w:lang w:eastAsia="es-PE"/>
-        </w:rPr>
-        <mc:AlternateContent>
-          <mc:Choice Requires="wps">
-            <w:drawing>
-              <wp:anchor distT="0" distB="0" distL="114300" distR="114300" simplePos="0" relativeHeight="251666432" behindDoc="0" locked="0" layoutInCell="1" allowOverlap="1" wp14:anchorId="16F6F52F" wp14:editId="1B28BCC8">
-                <wp:simplePos x="0" y="0"/>
-                <wp:positionH relativeFrom="column">
-                  <wp:posOffset>2877185</wp:posOffset>
-                </wp:positionH>
-                <wp:positionV relativeFrom="paragraph">
-                  <wp:posOffset>97155</wp:posOffset>
-                </wp:positionV>
-                <wp:extent cx="247650" cy="152400"/>
-                <wp:effectExtent l="0" t="0" r="19050" b="19050"/>
-                <wp:wrapNone/>
-                <wp:docPr id="8" name="8 Rectángulo"/>
-                <wp:cNvGraphicFramePr/>
-                <a:graphic xmlns:a="http://schemas.openxmlformats.org/drawingml/2006/main">
-                  <a:graphicData uri="http://schemas.microsoft.com/office/word/2010/wordprocessingShape">
-                    <wps:wsp>
-                      <wps:cNvSpPr/>
-                      <wps:spPr>
-                        <a:xfrm>
-                          <a:off x="0" y="0"/>
-                          <a:ext cx="247650" cy="152400"/>
-                        </a:xfrm>
-                        <a:prstGeom prst="rect">
-                          <a:avLst/>
-                        </a:prstGeom>
-                        <a:solidFill>
-                          <a:sysClr val="window" lastClr="FFFFFF"/>
-                        </a:solidFill>
-                        <a:ln w="25400" cap="flat" cmpd="sng" algn="ctr">
-                          <a:solidFill>
-                            <a:sysClr val="windowText" lastClr="000000"/>
-                          </a:solidFill>
-                          <a:prstDash val="solid"/>
-                        </a:ln>
-                        <a:effectLst/>
-                      </wps:spPr>
-                      <wps:bodyPr rot="0" spcFirstLastPara="0" vertOverflow="overflow" horzOverflow="overflow" vert="horz" wrap="square" lIns="91440" tIns="45720" rIns="91440" bIns="45720" numCol="1" spcCol="0" rtlCol="0" fromWordArt="0" anchor="ctr" anchorCtr="0" forceAA="0" compatLnSpc="1">
-                        <a:prstTxWarp prst="textNoShape">
-                          <a:avLst/>
-                        </a:prstTxWarp>
-                        <a:noAutofit/>
-                      </wps:bodyPr>
-                    </wps:wsp>
-                  </a:graphicData>
-                </a:graphic>
-              </wp:anchor>
-            </w:drawing>
-          </mc:Choice>
-          <mc:Fallback>
-            <w:pict>
-              <v:rect w14:anchorId="79D942AD" id="8 Rectángulo" o:spid="_x0000_s1026" style="position:absolute;margin-left:226.55pt;margin-top:7.65pt;width:19.5pt;height:12pt;z-index:251666432;visibility:visible;mso-wrap-style:square;mso-wrap-distance-left:9pt;mso-wrap-distance-top:0;mso-wrap-distance-right:9pt;mso-wrap-distance-bottom:0;mso-position-horizontal:absolute;mso-position-horizontal-relative:text;mso-position-vertical:absolute;mso-position-vertical-relative:text;v-text-anchor:middle" o:gfxdata="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" fillcolor="window" strokecolor="windowText" strokeweight="2pt"/>
+              <v:rect w14:anchorId="3A790A7F" id="17 Rectángulo" o:spid="_x0000_s1026" style="position:absolute;margin-left:348.85pt;margin-top:5.8pt;width:63.95pt;height:15.75pt;z-index:251704320;visibility:visible;mso-wrap-style:square;mso-width-percent:0;mso-wrap-distance-left:9pt;mso-wrap-distance-top:0;mso-wrap-distance-right:9pt;mso-wrap-distance-bottom:0;mso-position-horizontal:absolute;mso-position-horizontal-relative:text;mso-position-vertical:absolute;mso-position-vertical-relative:text;mso-width-percent:0;mso-width-relative:margin;v-text-anchor:middle" o:gfxdata="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" filled="f" strokecolor="windowText" strokeweight=".25pt"/>
             </w:pict>
           </mc:Fallback>
         </mc:AlternateContent>
@@ -1770,10 +2062,46 @@
       <w:r>
         <w:rPr>
           <w:rFonts w:ascii="Arial" w:eastAsia="Calibri" w:hAnsi="Arial" w:cs="Arial"/>
-          <w:sz w:val="16"/>
-          <w:szCs w:val="16"/>
-        </w:rPr>
-        <w:t>Documento de Identidad {dni}</w:t>
+          <w:b/>
+          <w:bCs/>
+          <w:sz w:val="16"/>
+          <w:szCs w:val="16"/>
+        </w:rPr>
+        <w:t>Documento de Identidad</w:t>
+      </w:r>
+      <w:r>
+        <w:rPr>
+          <w:rFonts w:ascii="Arial" w:eastAsia="Calibri" w:hAnsi="Arial" w:cs="Arial"/>
+          <w:sz w:val="16"/>
+          <w:szCs w:val="16"/>
+        </w:rPr>
+        <w:t>:</w:t>
+      </w:r>
+      <w:r>
+        <w:rPr>
+          <w:rFonts w:ascii="Arial" w:eastAsia="Calibri" w:hAnsi="Arial" w:cs="Arial"/>
+          <w:sz w:val="16"/>
+          <w:szCs w:val="16"/>
+        </w:rPr>
+        <w:t xml:space="preserve"> {</w:t>
+      </w:r>
+      <w:proofErr w:type="spellStart"/>
+      <w:r>
+        <w:rPr>
+          <w:rFonts w:ascii="Arial" w:eastAsia="Calibri" w:hAnsi="Arial" w:cs="Arial"/>
+          <w:sz w:val="16"/>
+          <w:szCs w:val="16"/>
+        </w:rPr>
+        <w:t>dni</w:t>
+      </w:r>
+      <w:proofErr w:type="spellEnd"/>
+      <w:r>
+        <w:rPr>
+          <w:rFonts w:ascii="Arial" w:eastAsia="Calibri" w:hAnsi="Arial" w:cs="Arial"/>
+          <w:sz w:val="16"/>
+          <w:szCs w:val="16"/>
+        </w:rPr>
+        <w:t>}</w:t>
       </w:r>
       <w:r>
         <w:rPr>
@@ -1813,16 +2141,7 @@
           <w:sz w:val="16"/>
           <w:szCs w:val="16"/>
         </w:rPr>
-        <w:tab/>
-        <w:t xml:space="preserve">  </w:t>
-      </w:r>
-      <w:r>
-        <w:rPr>
-          <w:rFonts w:ascii="Arial" w:eastAsia="Calibri" w:hAnsi="Arial" w:cs="Arial"/>
-          <w:sz w:val="16"/>
-          <w:szCs w:val="16"/>
-        </w:rPr>
-        <w:t xml:space="preserve">   Número Orden de Servicio: {numeroOS}</w:t>
+        <w:t xml:space="preserve"> Número Orden de Servicio: {numeroOS}</w:t>
       </w:r>
     </w:p>
     <w:p>
@@ -2013,15 +2332,591 @@
             <w:r>
               <w:rPr>
                 <w:rFonts w:ascii="Arial" w:eastAsia="Calibri" w:hAnsi="Arial" w:cs="Arial"/>
+                <w:b/>
                 <w:noProof/>
                 <w:sz w:val="16"/>
                 <w:szCs w:val="16"/>
-                <w:lang w:eastAsia="es-PE"/>
               </w:rPr>
               <mc:AlternateContent>
                 <mc:Choice Requires="wps">
                   <w:drawing>
-                    <wp:anchor distT="0" distB="0" distL="114300" distR="114300" simplePos="0" relativeHeight="251683840" behindDoc="0" locked="0" layoutInCell="1" allowOverlap="1" wp14:anchorId="29847FF9" wp14:editId="5B2E4C8C">
+                    <wp:anchor distT="45720" distB="45720" distL="114300" distR="114300" simplePos="0" relativeHeight="251722752" behindDoc="0" locked="0" layoutInCell="1" allowOverlap="1" wp14:anchorId="54EED9AB" wp14:editId="14643593">
+                      <wp:simplePos x="0" y="0"/>
+                      <wp:positionH relativeFrom="column">
+                        <wp:posOffset>2435225</wp:posOffset>
+                      </wp:positionH>
+                      <wp:positionV relativeFrom="page">
+                        <wp:posOffset>48260</wp:posOffset>
+                      </wp:positionV>
+                      <wp:extent cx="420370" cy="309880"/>
+                      <wp:effectExtent l="0" t="0" r="0" b="0"/>
+                      <wp:wrapNone/>
+                      <wp:docPr id="22" name="Cuadro de texto 2"/>
+                      <wp:cNvGraphicFramePr>
+                        <a:graphicFrameLocks xmlns:a="http://schemas.openxmlformats.org/drawingml/2006/main"/>
+                      </wp:cNvGraphicFramePr>
+                      <a:graphic xmlns:a="http://schemas.openxmlformats.org/drawingml/2006/main">
+                        <a:graphicData uri="http://schemas.microsoft.com/office/word/2010/wordprocessingShape">
+                          <wps:wsp>
+                            <wps:cNvSpPr txBox="1">
+                              <a:spLocks noChangeArrowheads="1"/>
+                            </wps:cNvSpPr>
+                            <wps:spPr bwMode="auto">
+                              <a:xfrm>
+                                <a:off x="0" y="0"/>
+                                <a:ext cx="420370" cy="309880"/>
+                              </a:xfrm>
+                              <a:prstGeom prst="rect">
+                                <a:avLst/>
+                              </a:prstGeom>
+                              <a:noFill/>
+                              <a:ln w="9525">
+                                <a:noFill/>
+                                <a:miter lim="800000"/>
+                                <a:headEnd/>
+                                <a:tailEnd/>
+                              </a:ln>
+                            </wps:spPr>
+                            <wps:txbx>
+                              <w:txbxContent>
+                                <w:p>
+                                  <w:r>
+                                    <w:rPr>
+                                      <w:rFonts w:ascii="Arial" w:eastAsia="Calibri" w:hAnsi="Arial" w:cs="Arial"/>
+                                      <w:sz w:val="16"/>
+                                      <w:szCs w:val="16"/>
+                                    </w:rPr>
+                                    <w:t>{</w:t>
+                                  </w:r>
+                                  <w:proofErr w:type="spellStart"/>
+                                  <w:r>
+                                    <w:rPr>
+                                      <w:rFonts w:ascii="Arial" w:eastAsia="Calibri" w:hAnsi="Arial" w:cs="Arial"/>
+                                      <w:sz w:val="16"/>
+                                      <w:szCs w:val="16"/>
+                                    </w:rPr>
+                                    <w:t>ckDesactivacion</w:t>
+                                  </w:r>
+                                  <w:proofErr w:type="spellEnd"/>
+                                  <w:r>
+                                    <w:rPr>
+                                      <w:rFonts w:ascii="Arial" w:eastAsia="Calibri" w:hAnsi="Arial" w:cs="Arial"/>
+                                      <w:sz w:val="16"/>
+                                      <w:szCs w:val="16"/>
+                                    </w:rPr>
+                                    <w:t>}</w:t>
+                                  </w:r>
+                                </w:p>
+                              </w:txbxContent>
+                            </wps:txbx>
+                            <wps:bodyPr rot="0" vert="horz" wrap="square" lIns="91440" tIns="45720" rIns="91440" bIns="45720" anchor="t" anchorCtr="0">
+                              <a:noAutofit/>
+                            </wps:bodyPr>
+                          </wps:wsp>
+                        </a:graphicData>
+                      </a:graphic>
+                      <wp14:sizeRelH relativeFrom="margin">
+                        <wp14:pctWidth>0</wp14:pctWidth>
+                      </wp14:sizeRelH>
+                      <wp14:sizeRelV relativeFrom="margin">
+                        <wp14:pctHeight>0</wp14:pctHeight>
+                      </wp14:sizeRelV>
+                    </wp:anchor>
+                  </w:drawing>
+                </mc:Choice>
+                <mc:Fallback>
+                  <w:pict>
+                    <v:shape w14:anchorId="54EED9AB" id="_x0000_s1032" type="#_x0000_t202" style="position:absolute;left:0;text-align:left;margin-left:191.75pt;margin-top:3.8pt;width:33.1pt;height:24.4pt;z-index:251722752;visibility:visible;mso-wrap-style:square;mso-width-percent:0;mso-height-percent:0;mso-wrap-distance-left:9pt;mso-wrap-distance-top:3.6pt;mso-wrap-distance-right:9pt;mso-wrap-distance-bottom:3.6pt;mso-position-horizontal:absolute;mso-position-horizontal-relative:text;mso-position-vertical:absolute;mso-position-vertical-relative:page;mso-width-percent:0;mso-height-percent:0;mso-width-relative:margin;mso-height-relative:margin;v-text-anchor:top" o:gfxdata="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" filled="f" stroked="f">
+                      <v:textbox>
+                        <w:txbxContent>
+                          <w:p>
+                            <w:r>
+                              <w:rPr>
+                                <w:rFonts w:ascii="Arial" w:eastAsia="Calibri" w:hAnsi="Arial" w:cs="Arial"/>
+                                <w:sz w:val="16"/>
+                                <w:szCs w:val="16"/>
+                              </w:rPr>
+                              <w:t>{</w:t>
+                            </w:r>
+                            <w:proofErr w:type="spellStart"/>
+                            <w:r>
+                              <w:rPr>
+                                <w:rFonts w:ascii="Arial" w:eastAsia="Calibri" w:hAnsi="Arial" w:cs="Arial"/>
+                                <w:sz w:val="16"/>
+                                <w:szCs w:val="16"/>
+                              </w:rPr>
+                              <w:t>ckDesactivacion</w:t>
+                            </w:r>
+                            <w:proofErr w:type="spellEnd"/>
+                            <w:r>
+                              <w:rPr>
+                                <w:rFonts w:ascii="Arial" w:eastAsia="Calibri" w:hAnsi="Arial" w:cs="Arial"/>
+                                <w:sz w:val="16"/>
+                                <w:szCs w:val="16"/>
+                              </w:rPr>
+                              <w:t>}</w:t>
+                            </w:r>
+                          </w:p>
+                        </w:txbxContent>
+                      </v:textbox>
+                      <w10:wrap anchory="page"/>
+                    </v:shape>
+                  </w:pict>
+                </mc:Fallback>
+              </mc:AlternateContent>
+            </w:r>
+            <w:r>
+              <w:rPr>
+                <w:rFonts w:ascii="Arial" w:eastAsia="Calibri" w:hAnsi="Arial" w:cs="Arial"/>
+                <w:b/>
+                <w:noProof/>
+                <w:sz w:val="16"/>
+                <w:szCs w:val="16"/>
+              </w:rPr>
+              <mc:AlternateContent>
+                <mc:Choice Requires="wps">
+                  <w:drawing>
+                    <wp:anchor distT="45720" distB="45720" distL="114300" distR="114300" simplePos="0" relativeHeight="251720704" behindDoc="0" locked="0" layoutInCell="1" allowOverlap="1" wp14:anchorId="025F67F3" wp14:editId="4B7B5A91">
+                      <wp:simplePos x="0" y="0"/>
+                      <wp:positionH relativeFrom="column">
+                        <wp:posOffset>1784350</wp:posOffset>
+                      </wp:positionH>
+                      <wp:positionV relativeFrom="page">
+                        <wp:posOffset>63500</wp:posOffset>
+                      </wp:positionV>
+                      <wp:extent cx="420370" cy="295275"/>
+                      <wp:effectExtent l="0" t="0" r="0" b="0"/>
+                      <wp:wrapNone/>
+                      <wp:docPr id="21" name="Cuadro de texto 2"/>
+                      <wp:cNvGraphicFramePr>
+                        <a:graphicFrameLocks xmlns:a="http://schemas.openxmlformats.org/drawingml/2006/main"/>
+                      </wp:cNvGraphicFramePr>
+                      <a:graphic xmlns:a="http://schemas.openxmlformats.org/drawingml/2006/main">
+                        <a:graphicData uri="http://schemas.microsoft.com/office/word/2010/wordprocessingShape">
+                          <wps:wsp>
+                            <wps:cNvSpPr txBox="1">
+                              <a:spLocks noChangeArrowheads="1"/>
+                            </wps:cNvSpPr>
+                            <wps:spPr bwMode="auto">
+                              <a:xfrm>
+                                <a:off x="0" y="0"/>
+                                <a:ext cx="420370" cy="295275"/>
+                              </a:xfrm>
+                              <a:prstGeom prst="rect">
+                                <a:avLst/>
+                              </a:prstGeom>
+                              <a:noFill/>
+                              <a:ln w="9525">
+                                <a:noFill/>
+                                <a:miter lim="800000"/>
+                                <a:headEnd/>
+                                <a:tailEnd/>
+                              </a:ln>
+                            </wps:spPr>
+                            <wps:txbx>
+                              <w:txbxContent>
+                                <w:p>
+                                  <w:r>
+                                    <w:rPr>
+                                      <w:rFonts w:ascii="Arial" w:eastAsia="Calibri" w:hAnsi="Arial" w:cs="Arial"/>
+                                      <w:sz w:val="16"/>
+                                      <w:szCs w:val="16"/>
+                                    </w:rPr>
+                                    <w:t>{</w:t>
+                                  </w:r>
+                                  <w:proofErr w:type="spellStart"/>
+                                  <w:r>
+                                    <w:rPr>
+                                      <w:rFonts w:ascii="Arial" w:eastAsia="Calibri" w:hAnsi="Arial" w:cs="Arial"/>
+                                      <w:sz w:val="16"/>
+                                      <w:szCs w:val="16"/>
+                                    </w:rPr>
+                                    <w:t>ckBaja</w:t>
+                                  </w:r>
+                                  <w:proofErr w:type="spellEnd"/>
+                                  <w:r>
+                                    <w:rPr>
+                                      <w:rFonts w:ascii="Arial" w:eastAsia="Calibri" w:hAnsi="Arial" w:cs="Arial"/>
+                                      <w:sz w:val="16"/>
+                                      <w:szCs w:val="16"/>
+                                    </w:rPr>
+                                    <w:t>}</w:t>
+                                  </w:r>
+                                </w:p>
+                              </w:txbxContent>
+                            </wps:txbx>
+                            <wps:bodyPr rot="0" vert="horz" wrap="square" lIns="91440" tIns="45720" rIns="91440" bIns="45720" anchor="t" anchorCtr="0">
+                              <a:noAutofit/>
+                            </wps:bodyPr>
+                          </wps:wsp>
+                        </a:graphicData>
+                      </a:graphic>
+                      <wp14:sizeRelH relativeFrom="margin">
+                        <wp14:pctWidth>0</wp14:pctWidth>
+                      </wp14:sizeRelH>
+                      <wp14:sizeRelV relativeFrom="margin">
+                        <wp14:pctHeight>0</wp14:pctHeight>
+                      </wp14:sizeRelV>
+                    </wp:anchor>
+                  </w:drawing>
+                </mc:Choice>
+                <mc:Fallback>
+                  <w:pict>
+                    <v:shape w14:anchorId="025F67F3" id="_x0000_s1033" type="#_x0000_t202" style="position:absolute;left:0;text-align:left;margin-left:140.5pt;margin-top:5pt;width:33.1pt;height:23.25pt;z-index:251720704;visibility:visible;mso-wrap-style:square;mso-width-percent:0;mso-height-percent:0;mso-wrap-distance-left:9pt;mso-wrap-distance-top:3.6pt;mso-wrap-distance-right:9pt;mso-wrap-distance-bottom:3.6pt;mso-position-horizontal:absolute;mso-position-horizontal-relative:text;mso-position-vertical:absolute;mso-position-vertical-relative:page;mso-width-percent:0;mso-height-percent:0;mso-width-relative:margin;mso-height-relative:margin;v-text-anchor:top" o:gfxdata="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" filled="f" stroked="f">
+                      <v:textbox>
+                        <w:txbxContent>
+                          <w:p>
+                            <w:r>
+                              <w:rPr>
+                                <w:rFonts w:ascii="Arial" w:eastAsia="Calibri" w:hAnsi="Arial" w:cs="Arial"/>
+                                <w:sz w:val="16"/>
+                                <w:szCs w:val="16"/>
+                              </w:rPr>
+                              <w:t>{</w:t>
+                            </w:r>
+                            <w:proofErr w:type="spellStart"/>
+                            <w:r>
+                              <w:rPr>
+                                <w:rFonts w:ascii="Arial" w:eastAsia="Calibri" w:hAnsi="Arial" w:cs="Arial"/>
+                                <w:sz w:val="16"/>
+                                <w:szCs w:val="16"/>
+                              </w:rPr>
+                              <w:t>ckBaja</w:t>
+                            </w:r>
+                            <w:proofErr w:type="spellEnd"/>
+                            <w:r>
+                              <w:rPr>
+                                <w:rFonts w:ascii="Arial" w:eastAsia="Calibri" w:hAnsi="Arial" w:cs="Arial"/>
+                                <w:sz w:val="16"/>
+                                <w:szCs w:val="16"/>
+                              </w:rPr>
+                              <w:t>}</w:t>
+                            </w:r>
+                          </w:p>
+                        </w:txbxContent>
+                      </v:textbox>
+                      <w10:wrap anchory="page"/>
+                    </v:shape>
+                  </w:pict>
+                </mc:Fallback>
+              </mc:AlternateContent>
+            </w:r>
+            <w:r>
+              <w:rPr>
+                <w:rFonts w:ascii="Arial" w:eastAsia="Calibri" w:hAnsi="Arial" w:cs="Arial"/>
+                <w:b/>
+                <w:noProof/>
+                <w:sz w:val="16"/>
+                <w:szCs w:val="16"/>
+              </w:rPr>
+              <mc:AlternateContent>
+                <mc:Choice Requires="wps">
+                  <w:drawing>
+                    <wp:anchor distT="45720" distB="45720" distL="114300" distR="114300" simplePos="0" relativeHeight="251716608" behindDoc="0" locked="0" layoutInCell="1" allowOverlap="1" wp14:anchorId="294B7128" wp14:editId="17EAD260">
+                      <wp:simplePos x="0" y="0"/>
+                      <wp:positionH relativeFrom="column">
+                        <wp:posOffset>-59055</wp:posOffset>
+                      </wp:positionH>
+                      <wp:positionV relativeFrom="page">
+                        <wp:posOffset>35560</wp:posOffset>
+                      </wp:positionV>
+                      <wp:extent cx="420370" cy="288290"/>
+                      <wp:effectExtent l="0" t="0" r="0" b="0"/>
+                      <wp:wrapNone/>
+                      <wp:docPr id="18" name="Cuadro de texto 2"/>
+                      <wp:cNvGraphicFramePr>
+                        <a:graphicFrameLocks xmlns:a="http://schemas.openxmlformats.org/drawingml/2006/main"/>
+                      </wp:cNvGraphicFramePr>
+                      <a:graphic xmlns:a="http://schemas.openxmlformats.org/drawingml/2006/main">
+                        <a:graphicData uri="http://schemas.microsoft.com/office/word/2010/wordprocessingShape">
+                          <wps:wsp>
+                            <wps:cNvSpPr txBox="1">
+                              <a:spLocks noChangeArrowheads="1"/>
+                            </wps:cNvSpPr>
+                            <wps:spPr bwMode="auto">
+                              <a:xfrm>
+                                <a:off x="0" y="0"/>
+                                <a:ext cx="420370" cy="288290"/>
+                              </a:xfrm>
+                              <a:prstGeom prst="rect">
+                                <a:avLst/>
+                              </a:prstGeom>
+                              <a:noFill/>
+                              <a:ln w="9525">
+                                <a:noFill/>
+                                <a:miter lim="800000"/>
+                                <a:headEnd/>
+                                <a:tailEnd/>
+                              </a:ln>
+                            </wps:spPr>
+                            <wps:txbx>
+                              <w:txbxContent>
+                                <w:p>
+                                  <w:r>
+                                    <w:rPr>
+                                      <w:rFonts w:ascii="Arial" w:eastAsia="Calibri" w:hAnsi="Arial" w:cs="Arial"/>
+                                      <w:sz w:val="16"/>
+                                      <w:szCs w:val="16"/>
+                                    </w:rPr>
+                                    <w:t>{</w:t>
+                                  </w:r>
+                                  <w:proofErr w:type="spellStart"/>
+                                  <w:r>
+                                    <w:rPr>
+                                      <w:rFonts w:ascii="Arial" w:eastAsia="Calibri" w:hAnsi="Arial" w:cs="Arial"/>
+                                      <w:sz w:val="16"/>
+                                      <w:szCs w:val="16"/>
+                                    </w:rPr>
+                                    <w:t>ckCreacion</w:t>
+                                  </w:r>
+                                  <w:proofErr w:type="spellEnd"/>
+                                  <w:r>
+                                    <w:rPr>
+                                      <w:rFonts w:ascii="Arial" w:eastAsia="Calibri" w:hAnsi="Arial" w:cs="Arial"/>
+                                      <w:sz w:val="16"/>
+                                      <w:szCs w:val="16"/>
+                                    </w:rPr>
+                                    <w:t>}</w:t>
+                                  </w:r>
+                                </w:p>
+                              </w:txbxContent>
+                            </wps:txbx>
+                            <wps:bodyPr rot="0" vert="horz" wrap="square" lIns="91440" tIns="45720" rIns="91440" bIns="45720" anchor="t" anchorCtr="0">
+                              <a:noAutofit/>
+                            </wps:bodyPr>
+                          </wps:wsp>
+                        </a:graphicData>
+                      </a:graphic>
+                      <wp14:sizeRelH relativeFrom="margin">
+                        <wp14:pctWidth>0</wp14:pctWidth>
+                      </wp14:sizeRelH>
+                      <wp14:sizeRelV relativeFrom="margin">
+                        <wp14:pctHeight>0</wp14:pctHeight>
+                      </wp14:sizeRelV>
+                    </wp:anchor>
+                  </w:drawing>
+                </mc:Choice>
+                <mc:Fallback>
+                  <w:pict>
+                    <v:shape w14:anchorId="294B7128" id="_x0000_s1034" type="#_x0000_t202" style="position:absolute;left:0;text-align:left;margin-left:-4.65pt;margin-top:2.8pt;width:33.1pt;height:22.7pt;z-index:251716608;visibility:visible;mso-wrap-style:square;mso-width-percent:0;mso-height-percent:0;mso-wrap-distance-left:9pt;mso-wrap-distance-top:3.6pt;mso-wrap-distance-right:9pt;mso-wrap-distance-bottom:3.6pt;mso-position-horizontal:absolute;mso-position-horizontal-relative:text;mso-position-vertical:absolute;mso-position-vertical-relative:page;mso-width-percent:0;mso-height-percent:0;mso-width-relative:margin;mso-height-relative:margin;v-text-anchor:top" o:gfxdata="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" filled="f" stroked="f">
+                      <v:textbox>
+                        <w:txbxContent>
+                          <w:p>
+                            <w:r>
+                              <w:rPr>
+                                <w:rFonts w:ascii="Arial" w:eastAsia="Calibri" w:hAnsi="Arial" w:cs="Arial"/>
+                                <w:sz w:val="16"/>
+                                <w:szCs w:val="16"/>
+                              </w:rPr>
+                              <w:t>{</w:t>
+                            </w:r>
+                            <w:proofErr w:type="spellStart"/>
+                            <w:r>
+                              <w:rPr>
+                                <w:rFonts w:ascii="Arial" w:eastAsia="Calibri" w:hAnsi="Arial" w:cs="Arial"/>
+                                <w:sz w:val="16"/>
+                                <w:szCs w:val="16"/>
+                              </w:rPr>
+                              <w:t>ckCreacion</w:t>
+                            </w:r>
+                            <w:proofErr w:type="spellEnd"/>
+                            <w:r>
+                              <w:rPr>
+                                <w:rFonts w:ascii="Arial" w:eastAsia="Calibri" w:hAnsi="Arial" w:cs="Arial"/>
+                                <w:sz w:val="16"/>
+                                <w:szCs w:val="16"/>
+                              </w:rPr>
+                              <w:t>}</w:t>
+                            </w:r>
+                          </w:p>
+                        </w:txbxContent>
+                      </v:textbox>
+                      <w10:wrap anchory="page"/>
+                    </v:shape>
+                  </w:pict>
+                </mc:Fallback>
+              </mc:AlternateContent>
+            </w:r>
+            <w:r>
+              <w:rPr>
+                <w:rFonts w:ascii="Arial" w:eastAsia="Calibri" w:hAnsi="Arial" w:cs="Arial"/>
+                <w:b/>
+                <w:noProof/>
+                <w:sz w:val="16"/>
+                <w:szCs w:val="16"/>
+              </w:rPr>
+              <mc:AlternateContent>
+                <mc:Choice Requires="wps">
+                  <w:drawing>
+                    <wp:anchor distT="45720" distB="45720" distL="114300" distR="114300" simplePos="0" relativeHeight="251718656" behindDoc="0" locked="0" layoutInCell="1" allowOverlap="1" wp14:anchorId="4255E440" wp14:editId="2302C090">
+                      <wp:simplePos x="0" y="0"/>
+                      <wp:positionH relativeFrom="column">
+                        <wp:posOffset>767715</wp:posOffset>
+                      </wp:positionH>
+                      <wp:positionV relativeFrom="page">
+                        <wp:posOffset>26035</wp:posOffset>
+                      </wp:positionV>
+                      <wp:extent cx="420370" cy="287020"/>
+                      <wp:effectExtent l="0" t="0" r="0" b="0"/>
+                      <wp:wrapNone/>
+                      <wp:docPr id="19" name="Cuadro de texto 2"/>
+                      <wp:cNvGraphicFramePr>
+                        <a:graphicFrameLocks xmlns:a="http://schemas.openxmlformats.org/drawingml/2006/main"/>
+                      </wp:cNvGraphicFramePr>
+                      <a:graphic xmlns:a="http://schemas.openxmlformats.org/drawingml/2006/main">
+                        <a:graphicData uri="http://schemas.microsoft.com/office/word/2010/wordprocessingShape">
+                          <wps:wsp>
+                            <wps:cNvSpPr txBox="1">
+                              <a:spLocks noChangeArrowheads="1"/>
+                            </wps:cNvSpPr>
+                            <wps:spPr bwMode="auto">
+                              <a:xfrm>
+                                <a:off x="0" y="0"/>
+                                <a:ext cx="420370" cy="287020"/>
+                              </a:xfrm>
+                              <a:prstGeom prst="rect">
+                                <a:avLst/>
+                              </a:prstGeom>
+                              <a:noFill/>
+                              <a:ln w="9525">
+                                <a:noFill/>
+                                <a:miter lim="800000"/>
+                                <a:headEnd/>
+                                <a:tailEnd/>
+                              </a:ln>
+                            </wps:spPr>
+                            <wps:txbx>
+                              <w:txbxContent>
+                                <w:p>
+                                  <w:r>
+                                    <w:rPr>
+                                      <w:rFonts w:ascii="Arial" w:eastAsia="Calibri" w:hAnsi="Arial" w:cs="Arial"/>
+                                      <w:sz w:val="16"/>
+                                      <w:szCs w:val="16"/>
+                                    </w:rPr>
+                                    <w:t>{</w:t>
+                                  </w:r>
+                                  <w:proofErr w:type="spellStart"/>
+                                  <w:r>
+                                    <w:rPr>
+                                      <w:rFonts w:ascii="Arial" w:eastAsia="Calibri" w:hAnsi="Arial" w:cs="Arial"/>
+                                      <w:sz w:val="16"/>
+                                      <w:szCs w:val="16"/>
+                                    </w:rPr>
+                                    <w:t>ckActualizacion</w:t>
+                                  </w:r>
+                                  <w:proofErr w:type="spellEnd"/>
+                                  <w:r>
+                                    <w:rPr>
+                                      <w:rFonts w:ascii="Arial" w:eastAsia="Calibri" w:hAnsi="Arial" w:cs="Arial"/>
+                                      <w:sz w:val="16"/>
+                                      <w:szCs w:val="16"/>
+                                    </w:rPr>
+                                    <w:t xml:space="preserve">}    </w:t>
+                                  </w:r>
+                                  <w:r>
+                                    <w:rPr>
+                                      <w:rFonts w:ascii="Arial" w:eastAsia="Calibri" w:hAnsi="Arial" w:cs="Arial"/>
+                                      <w:sz w:val="16"/>
+                                      <w:szCs w:val="16"/>
+                                    </w:rPr>
+                                    <w:t xml:space="preserve">           </w:t>
+                                  </w:r>
+                                  <w:r>
+                                    <w:rPr>
+                                      <w:rFonts w:ascii="Arial" w:eastAsia="Calibri" w:hAnsi="Arial" w:cs="Arial"/>
+                                      <w:sz w:val="16"/>
+                                      <w:szCs w:val="16"/>
+                                    </w:rPr>
+                                    <w:t xml:space="preserve">  </w:t>
+                                  </w:r>
+                                </w:p>
+                              </w:txbxContent>
+                            </wps:txbx>
+                            <wps:bodyPr rot="0" vert="horz" wrap="square" lIns="91440" tIns="45720" rIns="91440" bIns="45720" anchor="t" anchorCtr="0">
+                              <a:noAutofit/>
+                            </wps:bodyPr>
+                          </wps:wsp>
+                        </a:graphicData>
+                      </a:graphic>
+                      <wp14:sizeRelH relativeFrom="margin">
+                        <wp14:pctWidth>0</wp14:pctWidth>
+                      </wp14:sizeRelH>
+                      <wp14:sizeRelV relativeFrom="margin">
+                        <wp14:pctHeight>0</wp14:pctHeight>
+                      </wp14:sizeRelV>
+                    </wp:anchor>
+                  </w:drawing>
+                </mc:Choice>
+                <mc:Fallback>
+                  <w:pict>
+                    <v:shape w14:anchorId="4255E440" id="_x0000_s1035" type="#_x0000_t202" style="position:absolute;left:0;text-align:left;margin-left:60.45pt;margin-top:2.05pt;width:33.1pt;height:22.6pt;z-index:251718656;visibility:visible;mso-wrap-style:square;mso-width-percent:0;mso-height-percent:0;mso-wrap-distance-left:9pt;mso-wrap-distance-top:3.6pt;mso-wrap-distance-right:9pt;mso-wrap-distance-bottom:3.6pt;mso-position-horizontal:absolute;mso-position-horizontal-relative:text;mso-position-vertical:absolute;mso-position-vertical-relative:page;mso-width-percent:0;mso-height-percent:0;mso-width-relative:margin;mso-height-relative:margin;v-text-anchor:top" o:gfxdata="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" filled="f" stroked="f">
+                      <v:textbox>
+                        <w:txbxContent>
+                          <w:p>
+                            <w:r>
+                              <w:rPr>
+                                <w:rFonts w:ascii="Arial" w:eastAsia="Calibri" w:hAnsi="Arial" w:cs="Arial"/>
+                                <w:sz w:val="16"/>
+                                <w:szCs w:val="16"/>
+                              </w:rPr>
+                              <w:t>{</w:t>
+                            </w:r>
+                            <w:proofErr w:type="spellStart"/>
+                            <w:r>
+                              <w:rPr>
+                                <w:rFonts w:ascii="Arial" w:eastAsia="Calibri" w:hAnsi="Arial" w:cs="Arial"/>
+                                <w:sz w:val="16"/>
+                                <w:szCs w:val="16"/>
+                              </w:rPr>
+                              <w:t>ckActualizacion</w:t>
+                            </w:r>
+                            <w:proofErr w:type="spellEnd"/>
+                            <w:r>
+                              <w:rPr>
+                                <w:rFonts w:ascii="Arial" w:eastAsia="Calibri" w:hAnsi="Arial" w:cs="Arial"/>
+                                <w:sz w:val="16"/>
+                                <w:szCs w:val="16"/>
+                              </w:rPr>
+                              <w:t xml:space="preserve">}    </w:t>
+                            </w:r>
+                            <w:r>
+                              <w:rPr>
+                                <w:rFonts w:ascii="Arial" w:eastAsia="Calibri" w:hAnsi="Arial" w:cs="Arial"/>
+                                <w:sz w:val="16"/>
+                                <w:szCs w:val="16"/>
+                              </w:rPr>
+                              <w:t xml:space="preserve">           </w:t>
+                            </w:r>
+                            <w:r>
+                              <w:rPr>
+                                <w:rFonts w:ascii="Arial" w:eastAsia="Calibri" w:hAnsi="Arial" w:cs="Arial"/>
+                                <w:sz w:val="16"/>
+                                <w:szCs w:val="16"/>
+                              </w:rPr>
+                              <w:t xml:space="preserve">  </w:t>
+                            </w:r>
+                          </w:p>
+                        </w:txbxContent>
+                      </v:textbox>
+                      <w10:wrap anchory="page"/>
+                    </v:shape>
+                  </w:pict>
+                </mc:Fallback>
+              </mc:AlternateContent>
+            </w:r>
+            <w:r>
+              <w:rPr>
+                <w:rFonts w:ascii="Arial" w:eastAsia="Calibri" w:hAnsi="Arial" w:cs="Arial"/>
+                <w:noProof/>
+                <w:sz w:val="16"/>
+                <w:szCs w:val="16"/>
+                <w:lang w:eastAsia="es-PE"/>
+              </w:rPr>
+              <mc:AlternateContent>
+                <mc:Choice Requires="wps">
+                  <w:drawing>
+                    <wp:anchor distT="0" distB="0" distL="114300" distR="114300" simplePos="0" relativeHeight="251683840" behindDoc="0" locked="0" layoutInCell="1" allowOverlap="1" wp14:anchorId="537E7A9D" wp14:editId="44795E32">
                       <wp:simplePos x="0" y="0"/>
                       <wp:positionH relativeFrom="column">
                         <wp:posOffset>1905</wp:posOffset>
@@ -2075,7 +2970,7 @@
                     </wp:anchor>
                   </w:drawing>
                 </mc:Choice>
-                <mc:Fallback>
+                <mc:Fallback xmlns:oel="http://schemas.microsoft.com/office/2019/extlst" xmlns:w16du="http://schemas.microsoft.com/office/word/2023/wordml/word16du" xmlns:w16sdtfl="http://schemas.microsoft.com/office/word/2024/wordml/sdtformatlock">
                   <w:pict>
                     <v:rect w14:anchorId="5325840E" id="9 Rectángulo" o:spid="_x0000_s1026" style="position:absolute;margin-left:.15pt;margin-top:6.65pt;width:22.5pt;height:13.5pt;z-index:251683840;visibility:visible;mso-wrap-style:square;mso-width-percent:0;mso-height-percent:0;mso-wrap-distance-left:9pt;mso-wrap-distance-top:0;mso-wrap-distance-right:9pt;mso-wrap-distance-bottom:0;mso-position-horizontal:absolute;mso-position-horizontal-relative:text;mso-position-vertical:absolute;mso-position-vertical-relative:text;mso-width-percent:0;mso-height-percent:0;mso-width-relative:margin;mso-height-relative:margin;v-text-anchor:middle" o:gfxdata="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" fillcolor="window" strokecolor="windowText" strokeweight=".25pt"/>
                   </w:pict>
@@ -2093,7 +2988,7 @@
               <mc:AlternateContent>
                 <mc:Choice Requires="wps">
                   <w:drawing>
-                    <wp:anchor distT="0" distB="0" distL="114300" distR="114300" simplePos="0" relativeHeight="251684864" behindDoc="0" locked="0" layoutInCell="1" allowOverlap="1" wp14:anchorId="323212C9" wp14:editId="460784F5">
+                    <wp:anchor distT="0" distB="0" distL="114300" distR="114300" simplePos="0" relativeHeight="251684864" behindDoc="0" locked="0" layoutInCell="1" allowOverlap="1" wp14:anchorId="5164144A" wp14:editId="076B34E0">
                       <wp:simplePos x="0" y="0"/>
                       <wp:positionH relativeFrom="column">
                         <wp:posOffset>834390</wp:posOffset>
@@ -2161,7 +3056,7 @@
                 </mc:Choice>
                 <mc:Fallback>
                   <w:pict>
-                    <v:rect w14:anchorId="323212C9" id="10 Rectángulo" o:spid="_x0000_s1028" style="position:absolute;left:0;text-align:left;margin-left:65.7pt;margin-top:6.95pt;width:22.5pt;height:13.5pt;z-index:251684864;visibility:visible;mso-wrap-style:square;mso-width-percent:0;mso-height-percent:0;mso-wrap-distance-left:9pt;mso-wrap-distance-top:0;mso-wrap-distance-right:9pt;mso-wrap-distance-bottom:0;mso-position-horizontal:absolute;mso-position-horizontal-relative:text;mso-position-vertical:absolute;mso-position-vertical-relative:text;mso-width-percent:0;mso-height-percent:0;mso-width-relative:margin;mso-height-relative:margin;v-text-anchor:middle" o:gfxdata="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" fillcolor="window" strokecolor="windowText" strokeweight=".25pt">
+                    <v:rect w14:anchorId="5164144A" id="10 Rectángulo" o:spid="_x0000_s1036" style="position:absolute;left:0;text-align:left;margin-left:65.7pt;margin-top:6.95pt;width:22.5pt;height:13.5pt;z-index:251684864;visibility:visible;mso-wrap-style:square;mso-width-percent:0;mso-height-percent:0;mso-wrap-distance-left:9pt;mso-wrap-distance-top:0;mso-wrap-distance-right:9pt;mso-wrap-distance-bottom:0;mso-position-horizontal:absolute;mso-position-horizontal-relative:text;mso-position-vertical:absolute;mso-position-vertical-relative:text;mso-width-percent:0;mso-height-percent:0;mso-width-relative:margin;mso-height-relative:margin;v-text-anchor:middle" o:gfxdata="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" fillcolor="window" strokecolor="windowText" strokeweight=".25pt">
                       <v:textbox>
                         <w:txbxContent>
                           <w:p>
@@ -2190,7 +3085,7 @@
               <mc:AlternateContent>
                 <mc:Choice Requires="wps">
                   <w:drawing>
-                    <wp:anchor distT="0" distB="0" distL="114300" distR="114300" simplePos="0" relativeHeight="251700224" behindDoc="0" locked="0" layoutInCell="1" allowOverlap="1" wp14:anchorId="28558D23" wp14:editId="75143993">
+                    <wp:anchor distT="0" distB="0" distL="114300" distR="114300" simplePos="0" relativeHeight="251700224" behindDoc="0" locked="0" layoutInCell="1" allowOverlap="1" wp14:anchorId="36D82E9F" wp14:editId="1E815AE9">
                       <wp:simplePos x="0" y="0"/>
                       <wp:positionH relativeFrom="column">
                         <wp:posOffset>1849755</wp:posOffset>
@@ -2258,7 +3153,7 @@
                 </mc:Choice>
                 <mc:Fallback>
                   <w:pict>
-                    <v:rect w14:anchorId="28558D23" id="_x0000_s1029" style="position:absolute;left:0;text-align:left;margin-left:145.65pt;margin-top:6.85pt;width:22.5pt;height:13.5pt;z-index:251700224;visibility:visible;mso-wrap-style:square;mso-width-percent:0;mso-height-percent:0;mso-wrap-distance-left:9pt;mso-wrap-distance-top:0;mso-wrap-distance-right:9pt;mso-wrap-distance-bottom:0;mso-position-horizontal:absolute;mso-position-horizontal-relative:text;mso-position-vertical:absolute;mso-position-vertical-relative:text;mso-width-percent:0;mso-height-percent:0;mso-width-relative:margin;mso-height-relative:margin;v-text-anchor:middle" o:gfxdata="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" fillcolor="window" strokecolor="windowText" strokeweight=".25pt">
+                    <v:rect w14:anchorId="36D82E9F" id="_x0000_s1037" style="position:absolute;left:0;text-align:left;margin-left:145.65pt;margin-top:6.85pt;width:22.5pt;height:13.5pt;z-index:251700224;visibility:visible;mso-wrap-style:square;mso-width-percent:0;mso-height-percent:0;mso-wrap-distance-left:9pt;mso-wrap-distance-top:0;mso-wrap-distance-right:9pt;mso-wrap-distance-bottom:0;mso-position-horizontal:absolute;mso-position-horizontal-relative:text;mso-position-vertical:absolute;mso-position-vertical-relative:text;mso-width-percent:0;mso-height-percent:0;mso-width-relative:margin;mso-height-relative:margin;v-text-anchor:middle" o:gfxdata="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" fillcolor="window" strokecolor="windowText" strokeweight=".25pt">
                       <v:textbox>
                         <w:txbxContent>
                           <w:p>
@@ -2287,7 +3182,7 @@
               <mc:AlternateContent>
                 <mc:Choice Requires="wps">
                   <w:drawing>
-                    <wp:anchor distT="0" distB="0" distL="114300" distR="114300" simplePos="0" relativeHeight="251702272" behindDoc="0" locked="0" layoutInCell="1" allowOverlap="1" wp14:anchorId="28558D23" wp14:editId="75143993">
+                    <wp:anchor distT="0" distB="0" distL="114300" distR="114300" simplePos="0" relativeHeight="251702272" behindDoc="0" locked="0" layoutInCell="1" allowOverlap="1" wp14:anchorId="63896B9E" wp14:editId="29F27779">
                       <wp:simplePos x="0" y="0"/>
                       <wp:positionH relativeFrom="column">
                         <wp:posOffset>2502535</wp:posOffset>
@@ -2355,7 +3250,7 @@
                 </mc:Choice>
                 <mc:Fallback>
                   <w:pict>
-                    <v:rect w14:anchorId="28558D23" id="_x0000_s1030" style="position:absolute;left:0;text-align:left;margin-left:197.05pt;margin-top:6.3pt;width:22.5pt;height:13.5pt;z-index:251702272;visibility:visible;mso-wrap-style:square;mso-width-percent:0;mso-height-percent:0;mso-wrap-distance-left:9pt;mso-wrap-distance-top:0;mso-wrap-distance-right:9pt;mso-wrap-distance-bottom:0;mso-position-horizontal:absolute;mso-position-horizontal-relative:text;mso-position-vertical:absolute;mso-position-vertical-relative:text;mso-width-percent:0;mso-height-percent:0;mso-width-relative:margin;mso-height-relative:margin;v-text-anchor:middle" o:gfxdata="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" fillcolor="window" strokecolor="windowText" strokeweight=".25pt">
+                    <v:rect w14:anchorId="63896B9E" id="_x0000_s1038" style="position:absolute;left:0;text-align:left;margin-left:197.05pt;margin-top:6.3pt;width:22.5pt;height:13.5pt;z-index:251702272;visibility:visible;mso-wrap-style:square;mso-width-percent:0;mso-height-percent:0;mso-wrap-distance-left:9pt;mso-wrap-distance-top:0;mso-wrap-distance-right:9pt;mso-wrap-distance-bottom:0;mso-position-horizontal:absolute;mso-position-horizontal-relative:text;mso-position-vertical:absolute;mso-position-vertical-relative:text;mso-width-percent:0;mso-height-percent:0;mso-width-relative:margin;mso-height-relative:margin;v-text-anchor:middle" o:gfxdata="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" fillcolor="window" strokecolor="windowText" strokeweight=".25pt">
                       <v:textbox>
                         <w:txbxContent>
                           <w:p>
@@ -2393,7 +3288,7 @@
                 <w:sz w:val="16"/>
                 <w:szCs w:val="16"/>
               </w:rPr>
-              <w:t xml:space="preserve">           Creación {ckCreacion}</w:t>
+              <w:t xml:space="preserve">           Creación</w:t>
             </w:r>
             <w:r>
               <w:rPr>
@@ -2410,7 +3305,7 @@
                 <w:sz w:val="16"/>
                 <w:szCs w:val="16"/>
               </w:rPr>
-              <w:t xml:space="preserve"> Actualización {ckActualizacion}    </w:t>
+              <w:t xml:space="preserve"> Actualización</w:t>
             </w:r>
             <w:r>
               <w:rPr>
@@ -2418,7 +3313,7 @@
                 <w:sz w:val="16"/>
                 <w:szCs w:val="16"/>
               </w:rPr>
-              <w:t xml:space="preserve">           </w:t>
+              <w:t xml:space="preserve">                  </w:t>
             </w:r>
             <w:r>
               <w:rPr>
@@ -2426,15 +3321,7 @@
                 <w:sz w:val="16"/>
                 <w:szCs w:val="16"/>
               </w:rPr>
-              <w:t xml:space="preserve">  </w:t>
-            </w:r>
-            <w:r>
-              <w:rPr>
-                <w:rFonts w:ascii="Arial" w:eastAsia="Calibri" w:hAnsi="Arial" w:cs="Arial"/>
-                <w:sz w:val="16"/>
-                <w:szCs w:val="16"/>
-              </w:rPr>
-              <w:t>{ckBaja}Baja                   {ckDesactivacion}Desactivación</w:t>
+              <w:t>Baja                   Desactivación</w:t>
             </w:r>
           </w:p>
           <w:p>
@@ -2565,7 +3452,7 @@
               <mc:AlternateContent>
                 <mc:Choice Requires="wps">
                   <w:drawing>
-                    <wp:anchor distT="0" distB="0" distL="114300" distR="114300" simplePos="0" relativeHeight="251695104" behindDoc="1" locked="0" layoutInCell="1" allowOverlap="1" wp14:anchorId="1D3CC1AB" wp14:editId="3EDE6F79">
+                    <wp:anchor distT="0" distB="0" distL="114300" distR="114300" simplePos="0" relativeHeight="251695104" behindDoc="1" locked="0" layoutInCell="1" allowOverlap="1" wp14:anchorId="55DE2616" wp14:editId="4667FE9F">
                       <wp:simplePos x="0" y="0"/>
                       <wp:positionH relativeFrom="column">
                         <wp:posOffset>152400</wp:posOffset>
@@ -2633,7 +3520,7 @@
                 </mc:Choice>
                 <mc:Fallback>
                   <w:pict>
-                    <v:rect w14:anchorId="1D3CC1AB" id="20 Rectángulo" o:spid="_x0000_s1031" style="position:absolute;left:0;text-align:left;margin-left:12pt;margin-top:4.15pt;width:13.6pt;height:13.5pt;z-index:-251621376;visibility:visible;mso-wrap-style:square;mso-width-percent:0;mso-height-percent:0;mso-wrap-distance-left:9pt;mso-wrap-distance-top:0;mso-wrap-distance-right:9pt;mso-wrap-distance-bottom:0;mso-position-horizontal:absolute;mso-position-horizontal-relative:text;mso-position-vertical:absolute;mso-position-vertical-relative:text;mso-width-percent:0;mso-height-percent:0;mso-width-relative:margin;mso-height-relative:margin;v-text-anchor:middle" o:gfxdata="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" fillcolor="window" strokecolor="windowText" strokeweight=".25pt">
+                    <v:rect w14:anchorId="55DE2616" id="20 Rectángulo" o:spid="_x0000_s1039" style="position:absolute;left:0;text-align:left;margin-left:12pt;margin-top:4.15pt;width:13.6pt;height:13.5pt;z-index:-251621376;visibility:visible;mso-wrap-style:square;mso-width-percent:0;mso-height-percent:0;mso-wrap-distance-left:9pt;mso-wrap-distance-top:0;mso-wrap-distance-right:9pt;mso-wrap-distance-bottom:0;mso-position-horizontal:absolute;mso-position-horizontal-relative:text;mso-position-vertical:absolute;mso-position-vertical-relative:text;mso-width-percent:0;mso-height-percent:0;mso-width-relative:margin;mso-height-relative:margin;v-text-anchor:middle" o:gfxdata="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" fillcolor="window" strokecolor="windowText" strokeweight=".25pt">
                       <v:textbox>
                         <w:txbxContent>
                           <w:p>
@@ -2679,7 +3566,7 @@
                 <w:sz w:val="16"/>
                 <w:szCs w:val="16"/>
               </w:rPr>
-              <w:t>{ckSi}SI</w:t>
+              <w:t>SI</w:t>
             </w:r>
           </w:p>
         </w:tc>
@@ -2716,7 +3603,7 @@
               <mc:AlternateContent>
                 <mc:Choice Requires="wps">
                   <w:drawing>
-                    <wp:anchor distT="0" distB="0" distL="114300" distR="114300" simplePos="0" relativeHeight="251696128" behindDoc="0" locked="0" layoutInCell="1" allowOverlap="1" wp14:anchorId="76675131" wp14:editId="74A2B5A4">
+                    <wp:anchor distT="0" distB="0" distL="114300" distR="114300" simplePos="0" relativeHeight="251696128" behindDoc="0" locked="0" layoutInCell="1" allowOverlap="1" wp14:anchorId="1E9FF16E" wp14:editId="78FDD05D">
                       <wp:simplePos x="0" y="0"/>
                       <wp:positionH relativeFrom="column">
                         <wp:posOffset>219710</wp:posOffset>
@@ -2784,7 +3671,7 @@
                 </mc:Choice>
                 <mc:Fallback>
                   <w:pict>
-                    <v:rect w14:anchorId="76675131" id="_x0000_s1032" style="position:absolute;left:0;text-align:left;margin-left:17.3pt;margin-top:4.05pt;width:13.6pt;height:13.5pt;z-index:251696128;visibility:visible;mso-wrap-style:square;mso-width-percent:0;mso-height-percent:0;mso-wrap-distance-left:9pt;mso-wrap-distance-top:0;mso-wrap-distance-right:9pt;mso-wrap-distance-bottom:0;mso-position-horizontal:absolute;mso-position-horizontal-relative:text;mso-position-vertical:absolute;mso-position-vertical-relative:text;mso-width-percent:0;mso-height-percent:0;mso-width-relative:margin;mso-height-relative:margin;v-text-anchor:middle" o:gfxdata="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" fillcolor="window" strokecolor="windowText" strokeweight=".25pt">
+                    <v:rect w14:anchorId="1E9FF16E" id="_x0000_s1040" style="position:absolute;left:0;text-align:left;margin-left:17.3pt;margin-top:4.05pt;width:13.6pt;height:13.5pt;z-index:251696128;visibility:visible;mso-wrap-style:square;mso-width-percent:0;mso-height-percent:0;mso-wrap-distance-left:9pt;mso-wrap-distance-top:0;mso-wrap-distance-right:9pt;mso-wrap-distance-bottom:0;mso-position-horizontal:absolute;mso-position-horizontal-relative:text;mso-position-vertical:absolute;mso-position-vertical-relative:text;mso-width-percent:0;mso-height-percent:0;mso-width-relative:margin;mso-height-relative:margin;v-text-anchor:middle" o:gfxdata="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" fillcolor="window" strokecolor="windowText" strokeweight=".25pt">
                       <v:textbox>
                         <w:txbxContent>
                           <w:p>
@@ -2830,7 +3717,7 @@
                 <w:sz w:val="16"/>
                 <w:szCs w:val="16"/>
               </w:rPr>
-              <w:t>{ckNo}NO</w:t>
+              <w:t>NO</w:t>
             </w:r>
           </w:p>
         </w:tc>
@@ -2866,7 +3753,7 @@
               <mc:AlternateContent>
                 <mc:Choice Requires="wps">
                   <w:drawing>
-                    <wp:anchor distT="0" distB="0" distL="114300" distR="114300" simplePos="0" relativeHeight="251698176" behindDoc="0" locked="0" layoutInCell="1" allowOverlap="1" wp14:anchorId="11D4175C" wp14:editId="1090D3B4">
+                    <wp:anchor distT="0" distB="0" distL="114300" distR="114300" simplePos="0" relativeHeight="251698176" behindDoc="0" locked="0" layoutInCell="1" allowOverlap="1" wp14:anchorId="3C2F83F6" wp14:editId="05E637BB">
                       <wp:simplePos x="0" y="0"/>
                       <wp:positionH relativeFrom="column">
                         <wp:posOffset>27940</wp:posOffset>
@@ -2940,7 +3827,7 @@
                 </mc:Choice>
                 <mc:Fallback>
                   <w:pict>
-                    <v:rect w14:anchorId="11D4175C" id="11 Rectángulo" o:spid="_x0000_s1033" style="position:absolute;left:0;text-align:left;margin-left:2.2pt;margin-top:3.3pt;width:51.15pt;height:13.5pt;z-index:251698176;visibility:visible;mso-wrap-style:square;mso-width-percent:0;mso-height-percent:0;mso-wrap-distance-left:9pt;mso-wrap-distance-top:0;mso-wrap-distance-right:9pt;mso-wrap-distance-bottom:0;mso-position-horizontal:absolute;mso-position-horizontal-relative:text;mso-position-vertical:absolute;mso-position-vertical-relative:text;mso-width-percent:0;mso-height-percent:0;mso-width-relative:margin;mso-height-relative:margin;v-text-anchor:middle" o:gfxdata="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" fillcolor="window" strokecolor="windowText" strokeweight=".25pt">
+                    <v:rect w14:anchorId="3C2F83F6" id="11 Rectángulo" o:spid="_x0000_s1041" style="position:absolute;left:0;text-align:left;margin-left:2.2pt;margin-top:3.3pt;width:51.15pt;height:13.5pt;z-index:251698176;visibility:visible;mso-wrap-style:square;mso-width-percent:0;mso-height-percent:0;mso-wrap-distance-left:9pt;mso-wrap-distance-top:0;mso-wrap-distance-right:9pt;mso-wrap-distance-bottom:0;mso-position-horizontal:absolute;mso-position-horizontal-relative:text;mso-position-vertical:absolute;mso-position-vertical-relative:text;mso-width-percent:0;mso-height-percent:0;mso-width-relative:margin;mso-height-relative:margin;v-text-anchor:middle" o:gfxdata="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" fillcolor="window" strokecolor="windowText" strokeweight=".25pt">
                       <v:textbox>
                         <w:txbxContent>
                           <w:p>
@@ -3012,7 +3899,7 @@
                 <w:sz w:val="16"/>
                 <w:szCs w:val="16"/>
               </w:rPr>
-              <w:t>Llenado por OTIN: {ipAsignada}</w:t>
+              <w:t>Llenado por OTIN</w:t>
             </w:r>
           </w:p>
         </w:tc>
@@ -3095,15 +3982,15 @@
       </w:tblPr>
       <w:tblGrid>
         <w:gridCol w:w="222"/>
-        <w:gridCol w:w="907"/>
-        <w:gridCol w:w="426"/>
+        <w:gridCol w:w="683"/>
+        <w:gridCol w:w="950"/>
         <w:gridCol w:w="708"/>
-        <w:gridCol w:w="426"/>
-        <w:gridCol w:w="1559"/>
-        <w:gridCol w:w="425"/>
-        <w:gridCol w:w="567"/>
-        <w:gridCol w:w="2552"/>
-        <w:gridCol w:w="420"/>
+        <w:gridCol w:w="1261"/>
+        <w:gridCol w:w="1358"/>
+        <w:gridCol w:w="1101"/>
+        <w:gridCol w:w="333"/>
+        <w:gridCol w:w="644"/>
+        <w:gridCol w:w="1154"/>
         <w:gridCol w:w="283"/>
       </w:tblGrid>
       <w:tr>
@@ -3138,7 +4025,7 @@
                 <w:szCs w:val="16"/>
                 <w:lang w:eastAsia="es-PE"/>
               </w:rPr>
-              <w:t>{ckCuentaRed}Cuenta de usuario de red</w:t>
+              <w:t>Cuenta de usuario de red</w:t>
             </w:r>
           </w:p>
         </w:tc>
@@ -3173,6 +4060,38 @@
                 <w:lang w:eastAsia="es-PE"/>
               </w:rPr>
               <w:t> </w:t>
+            </w:r>
+            <w:r>
+              <w:rPr>
+                <w:rFonts w:ascii="Arial" w:eastAsia="Times New Roman" w:hAnsi="Arial" w:cs="Arial"/>
+                <w:color w:val="000000"/>
+                <w:sz w:val="16"/>
+                <w:szCs w:val="16"/>
+                <w:lang w:eastAsia="es-PE"/>
+              </w:rPr>
+              <w:t>{</w:t>
+            </w:r>
+            <w:proofErr w:type="spellStart"/>
+            <w:r>
+              <w:rPr>
+                <w:rFonts w:ascii="Arial" w:eastAsia="Times New Roman" w:hAnsi="Arial" w:cs="Arial"/>
+                <w:color w:val="000000"/>
+                <w:sz w:val="16"/>
+                <w:szCs w:val="16"/>
+                <w:lang w:eastAsia="es-PE"/>
+              </w:rPr>
+              <w:t>ckCuentaRed</w:t>
+            </w:r>
+            <w:proofErr w:type="spellEnd"/>
+            <w:r>
+              <w:rPr>
+                <w:rFonts w:ascii="Arial" w:eastAsia="Times New Roman" w:hAnsi="Arial" w:cs="Arial"/>
+                <w:color w:val="000000"/>
+                <w:sz w:val="16"/>
+                <w:szCs w:val="16"/>
+                <w:lang w:eastAsia="es-PE"/>
+              </w:rPr>
+              <w:t>}</w:t>
             </w:r>
           </w:p>
         </w:tc>
@@ -3219,7 +4138,7 @@
                 <w:szCs w:val="16"/>
                 <w:lang w:eastAsia="es-PE"/>
               </w:rPr>
-              <w:t xml:space="preserve"> usuario genérico: {nombreGenerico}</w:t>
+              <w:t xml:space="preserve"> usuario genérico: </w:t>
             </w:r>
           </w:p>
         </w:tc>
@@ -3255,6 +4174,38 @@
               </w:rPr>
               <w:t> </w:t>
             </w:r>
+            <w:r>
+              <w:rPr>
+                <w:rFonts w:ascii="Arial" w:eastAsia="Times New Roman" w:hAnsi="Arial" w:cs="Arial"/>
+                <w:color w:val="000000"/>
+                <w:sz w:val="16"/>
+                <w:szCs w:val="16"/>
+                <w:lang w:eastAsia="es-PE"/>
+              </w:rPr>
+              <w:t>{</w:t>
+            </w:r>
+            <w:proofErr w:type="spellStart"/>
+            <w:r>
+              <w:rPr>
+                <w:rFonts w:ascii="Arial" w:eastAsia="Times New Roman" w:hAnsi="Arial" w:cs="Arial"/>
+                <w:color w:val="000000"/>
+                <w:sz w:val="16"/>
+                <w:szCs w:val="16"/>
+                <w:lang w:eastAsia="es-PE"/>
+              </w:rPr>
+              <w:t>nombreGenerico</w:t>
+            </w:r>
+            <w:proofErr w:type="spellEnd"/>
+            <w:r>
+              <w:rPr>
+                <w:rFonts w:ascii="Arial" w:eastAsia="Times New Roman" w:hAnsi="Arial" w:cs="Arial"/>
+                <w:color w:val="000000"/>
+                <w:sz w:val="16"/>
+                <w:szCs w:val="16"/>
+                <w:lang w:eastAsia="es-PE"/>
+              </w:rPr>
+              <w:t>}</w:t>
+            </w:r>
           </w:p>
         </w:tc>
       </w:tr>
@@ -3308,7 +4259,7 @@
                 <w:szCs w:val="16"/>
                 <w:lang w:eastAsia="es-PE"/>
               </w:rPr>
-              <w:t>{ckInternet}Internet</w:t>
+              <w:t>Internet</w:t>
             </w:r>
           </w:p>
         </w:tc>
@@ -3329,6 +4280,38 @@
                 <w:lang w:eastAsia="es-PE"/>
               </w:rPr>
             </w:pPr>
+            <w:r>
+              <w:rPr>
+                <w:rFonts w:ascii="Arial" w:eastAsia="Times New Roman" w:hAnsi="Arial" w:cs="Arial"/>
+                <w:color w:val="000000"/>
+                <w:sz w:val="16"/>
+                <w:szCs w:val="16"/>
+                <w:lang w:eastAsia="es-PE"/>
+              </w:rPr>
+              <w:t>{</w:t>
+            </w:r>
+            <w:proofErr w:type="spellStart"/>
+            <w:r>
+              <w:rPr>
+                <w:rFonts w:ascii="Arial" w:eastAsia="Times New Roman" w:hAnsi="Arial" w:cs="Arial"/>
+                <w:color w:val="000000"/>
+                <w:sz w:val="16"/>
+                <w:szCs w:val="16"/>
+                <w:lang w:eastAsia="es-PE"/>
+              </w:rPr>
+              <w:t>ckInternet</w:t>
+            </w:r>
+            <w:proofErr w:type="spellEnd"/>
+            <w:r>
+              <w:rPr>
+                <w:rFonts w:ascii="Arial" w:eastAsia="Times New Roman" w:hAnsi="Arial" w:cs="Arial"/>
+                <w:color w:val="000000"/>
+                <w:sz w:val="16"/>
+                <w:szCs w:val="16"/>
+                <w:lang w:eastAsia="es-PE"/>
+              </w:rPr>
+              <w:t>}</w:t>
+            </w:r>
           </w:p>
         </w:tc>
         <w:tc>
@@ -3387,9 +4370,7 @@
             <w:r>
               <w:rPr>
                 <w:rFonts w:ascii="Arial" w:eastAsia="Times New Roman" w:hAnsi="Arial" w:cs="Arial"/>
-                <w:i/>
-                <w:iCs/>
-                <w:color w:val="BFBFBF" w:themeColor="background1" w:themeShade="BF"/>
+                <w:color w:val="000000"/>
                 <w:sz w:val="16"/>
                 <w:szCs w:val="16"/>
                 <w:lang w:eastAsia="es-PE"/>
@@ -3426,7 +4407,7 @@
                 <w:szCs w:val="16"/>
                 <w:lang w:eastAsia="es-PE"/>
               </w:rPr>
-              <w:t>{ckCorreoInst}Cuenta de Correo institucional</w:t>
+              <w:t>Cuenta de Correo institucional</w:t>
             </w:r>
           </w:p>
         </w:tc>
@@ -3450,6 +4431,38 @@
                 <w:lang w:eastAsia="es-PE"/>
               </w:rPr>
             </w:pPr>
+            <w:r>
+              <w:rPr>
+                <w:rFonts w:ascii="Arial" w:eastAsia="Times New Roman" w:hAnsi="Arial" w:cs="Arial"/>
+                <w:color w:val="000000"/>
+                <w:sz w:val="16"/>
+                <w:szCs w:val="16"/>
+                <w:lang w:eastAsia="es-PE"/>
+              </w:rPr>
+              <w:t>{</w:t>
+            </w:r>
+            <w:proofErr w:type="spellStart"/>
+            <w:r>
+              <w:rPr>
+                <w:rFonts w:ascii="Arial" w:eastAsia="Times New Roman" w:hAnsi="Arial" w:cs="Arial"/>
+                <w:color w:val="000000"/>
+                <w:sz w:val="16"/>
+                <w:szCs w:val="16"/>
+                <w:lang w:eastAsia="es-PE"/>
+              </w:rPr>
+              <w:t>ckCorreoInst</w:t>
+            </w:r>
+            <w:proofErr w:type="spellEnd"/>
+            <w:r>
+              <w:rPr>
+                <w:rFonts w:ascii="Arial" w:eastAsia="Times New Roman" w:hAnsi="Arial" w:cs="Arial"/>
+                <w:color w:val="000000"/>
+                <w:sz w:val="16"/>
+                <w:szCs w:val="16"/>
+                <w:lang w:eastAsia="es-PE"/>
+              </w:rPr>
+              <w:t>}</w:t>
+            </w:r>
           </w:p>
         </w:tc>
         <w:tc>
@@ -3664,7 +4677,7 @@
                 <w:szCs w:val="16"/>
                 <w:lang w:eastAsia="es-PE"/>
               </w:rPr>
-              <w:t>{ckConRedes}Con redes sociales</w:t>
+              <w:t>Con redes sociales</w:t>
             </w:r>
           </w:p>
         </w:tc>
@@ -3697,16 +4710,7 @@
               </w:rPr>
               <w:t> </w:t>
             </w:r>
-          </w:p>
-        </w:tc>
-        <w:tc>
-          <w:tcPr>
-            <w:tcW w:w="1559" w:type="dxa"/>
-            <w:vAlign w:val="center"/>
-          </w:tcPr>
-          <w:p>
-            <w:pPr>
-              <w:spacing w:after="0" w:line="240" w:lineRule="auto"/>
+            <w:r>
               <w:rPr>
                 <w:rFonts w:ascii="Arial" w:eastAsia="Times New Roman" w:hAnsi="Arial" w:cs="Arial"/>
                 <w:color w:val="000000"/>
@@ -3714,7 +4718,9 @@
                 <w:szCs w:val="16"/>
                 <w:lang w:eastAsia="es-PE"/>
               </w:rPr>
-            </w:pPr>
+              <w:t>{</w:t>
+            </w:r>
+            <w:proofErr w:type="spellStart"/>
             <w:r>
               <w:rPr>
                 <w:rFonts w:ascii="Arial" w:eastAsia="Times New Roman" w:hAnsi="Arial" w:cs="Arial"/>
@@ -3723,19 +4729,10 @@
                 <w:szCs w:val="16"/>
                 <w:lang w:eastAsia="es-PE"/>
               </w:rPr>
-              <w:t>{ckSinRedes}Sin redes sociales</w:t>
-            </w:r>
-          </w:p>
-        </w:tc>
-        <w:tc>
-          <w:tcPr>
-            <w:tcW w:w="425" w:type="dxa"/>
-            <w:shd w:val="clear" w:color="auto" w:fill="auto"/>
-            <w:vAlign w:val="center"/>
-          </w:tcPr>
-          <w:p>
-            <w:pPr>
-              <w:spacing w:after="0" w:line="240" w:lineRule="auto"/>
+              <w:t>ckConRedes</w:t>
+            </w:r>
+            <w:proofErr w:type="spellEnd"/>
+            <w:r>
               <w:rPr>
                 <w:rFonts w:ascii="Arial" w:eastAsia="Times New Roman" w:hAnsi="Arial" w:cs="Arial"/>
                 <w:color w:val="000000"/>
@@ -3743,7 +4740,87 @@
                 <w:szCs w:val="16"/>
                 <w:lang w:eastAsia="es-PE"/>
               </w:rPr>
-            </w:pPr>
+              <w:t>}</w:t>
+            </w:r>
+          </w:p>
+        </w:tc>
+        <w:tc>
+          <w:tcPr>
+            <w:tcW w:w="1559" w:type="dxa"/>
+            <w:vAlign w:val="center"/>
+          </w:tcPr>
+          <w:p>
+            <w:pPr>
+              <w:spacing w:after="0" w:line="240" w:lineRule="auto"/>
+              <w:rPr>
+                <w:rFonts w:ascii="Arial" w:eastAsia="Times New Roman" w:hAnsi="Arial" w:cs="Arial"/>
+                <w:color w:val="000000"/>
+                <w:sz w:val="16"/>
+                <w:szCs w:val="16"/>
+                <w:lang w:eastAsia="es-PE"/>
+              </w:rPr>
+            </w:pPr>
+            <w:r>
+              <w:rPr>
+                <w:rFonts w:ascii="Arial" w:eastAsia="Times New Roman" w:hAnsi="Arial" w:cs="Arial"/>
+                <w:color w:val="000000"/>
+                <w:sz w:val="16"/>
+                <w:szCs w:val="16"/>
+                <w:lang w:eastAsia="es-PE"/>
+              </w:rPr>
+              <w:t>Sin redes sociales</w:t>
+            </w:r>
+          </w:p>
+        </w:tc>
+        <w:tc>
+          <w:tcPr>
+            <w:tcW w:w="425" w:type="dxa"/>
+            <w:shd w:val="clear" w:color="auto" w:fill="auto"/>
+            <w:vAlign w:val="center"/>
+          </w:tcPr>
+          <w:p>
+            <w:pPr>
+              <w:spacing w:after="0" w:line="240" w:lineRule="auto"/>
+              <w:rPr>
+                <w:rFonts w:ascii="Arial" w:eastAsia="Times New Roman" w:hAnsi="Arial" w:cs="Arial"/>
+                <w:color w:val="000000"/>
+                <w:sz w:val="16"/>
+                <w:szCs w:val="16"/>
+                <w:lang w:eastAsia="es-PE"/>
+              </w:rPr>
+            </w:pPr>
+            <w:r>
+              <w:rPr>
+                <w:rFonts w:ascii="Arial" w:eastAsia="Times New Roman" w:hAnsi="Arial" w:cs="Arial"/>
+                <w:color w:val="000000"/>
+                <w:sz w:val="16"/>
+                <w:szCs w:val="16"/>
+                <w:lang w:eastAsia="es-PE"/>
+              </w:rPr>
+              <w:t>{</w:t>
+            </w:r>
+            <w:proofErr w:type="spellStart"/>
+            <w:r>
+              <w:rPr>
+                <w:rFonts w:ascii="Arial" w:eastAsia="Times New Roman" w:hAnsi="Arial" w:cs="Arial"/>
+                <w:color w:val="000000"/>
+                <w:sz w:val="16"/>
+                <w:szCs w:val="16"/>
+                <w:lang w:eastAsia="es-PE"/>
+              </w:rPr>
+              <w:t>ckSinRedes</w:t>
+            </w:r>
+            <w:proofErr w:type="spellEnd"/>
+            <w:r>
+              <w:rPr>
+                <w:rFonts w:ascii="Arial" w:eastAsia="Times New Roman" w:hAnsi="Arial" w:cs="Arial"/>
+                <w:color w:val="000000"/>
+                <w:sz w:val="16"/>
+                <w:szCs w:val="16"/>
+                <w:lang w:eastAsia="es-PE"/>
+              </w:rPr>
+              <w:t>}</w:t>
+            </w:r>
           </w:p>
         </w:tc>
         <w:tc>
@@ -3852,7 +4929,7 @@
           <w:sz w:val="16"/>
           <w:szCs w:val="16"/>
         </w:rPr>
-        <w:t xml:space="preserve">CEPCIONES: {justificacion}</w:t>
+        <w:t xml:space="preserve">CEPCIONES: </w:t>
       </w:r>
       <w:r>
         <w:rPr>
@@ -3913,70 +4990,40 @@
               <w:pStyle w:val="Sinespaciado"/>
               <w:rPr>
                 <w:rFonts w:ascii="Arial" w:hAnsi="Arial" w:cs="Arial"/>
-                <w:sz w:val="16"/>
-                <w:szCs w:val="16"/>
-              </w:rPr>
-            </w:pPr>
-          </w:p>
-          <w:p>
-            <w:pPr>
-              <w:pStyle w:val="Sinespaciado"/>
-              <w:rPr>
-                <w:rFonts w:ascii="Arial" w:hAnsi="Arial" w:cs="Arial"/>
-                <w:sz w:val="16"/>
-                <w:szCs w:val="16"/>
-              </w:rPr>
-            </w:pPr>
-          </w:p>
-          <w:p>
-            <w:pPr>
-              <w:pStyle w:val="Sinespaciado"/>
-              <w:rPr>
-                <w:rFonts w:ascii="Arial" w:hAnsi="Arial" w:cs="Arial"/>
-                <w:sz w:val="16"/>
-                <w:szCs w:val="16"/>
-              </w:rPr>
-            </w:pPr>
-          </w:p>
-          <w:p>
-            <w:pPr>
-              <w:pStyle w:val="Sinespaciado"/>
-              <w:rPr>
-                <w:rFonts w:ascii="Arial" w:hAnsi="Arial" w:cs="Arial"/>
-                <w:sz w:val="16"/>
-                <w:szCs w:val="16"/>
-              </w:rPr>
-            </w:pPr>
-          </w:p>
-          <w:p>
-            <w:pPr>
-              <w:pStyle w:val="Sinespaciado"/>
-              <w:rPr>
-                <w:rFonts w:ascii="Arial" w:hAnsi="Arial" w:cs="Arial"/>
-                <w:sz w:val="16"/>
-                <w:szCs w:val="16"/>
-              </w:rPr>
-            </w:pPr>
-          </w:p>
-          <w:p>
-            <w:pPr>
-              <w:pStyle w:val="Sinespaciado"/>
-              <w:rPr>
-                <w:rFonts w:ascii="Arial" w:hAnsi="Arial" w:cs="Arial"/>
-                <w:sz w:val="16"/>
-                <w:szCs w:val="16"/>
-              </w:rPr>
-            </w:pPr>
-          </w:p>
-          <w:p>
-            <w:pPr>
-              <w:pStyle w:val="Sinespaciado"/>
-              <w:rPr>
-                <w:rFonts w:ascii="Arial" w:hAnsi="Arial" w:cs="Arial"/>
-                <w:sz w:val="16"/>
-                <w:szCs w:val="16"/>
-              </w:rPr>
-            </w:pPr>
+                <w:bCs/>
+                <w:sz w:val="16"/>
+                <w:szCs w:val="16"/>
+              </w:rPr>
+            </w:pPr>
+            <w:r>
+              <w:rPr>
+                <w:rFonts w:ascii="Arial" w:hAnsi="Arial" w:cs="Arial"/>
+                <w:bCs/>
+                <w:sz w:val="16"/>
+                <w:szCs w:val="16"/>
+              </w:rPr>
+              <w:t>{</w:t>
+            </w:r>
+            <w:proofErr w:type="spellStart"/>
+            <w:r>
+              <w:rPr>
+                <w:rFonts w:ascii="Arial" w:hAnsi="Arial" w:cs="Arial"/>
+                <w:bCs/>
+                <w:sz w:val="16"/>
+                <w:szCs w:val="16"/>
+              </w:rPr>
+              <w:t>justificacion</w:t>
+            </w:r>
+            <w:proofErr w:type="spellEnd"/>
+            <w:r>
+              <w:rPr>
+                <w:rFonts w:ascii="Arial" w:hAnsi="Arial" w:cs="Arial"/>
+                <w:bCs/>
+                <w:sz w:val="16"/>
+                <w:szCs w:val="16"/>
+              </w:rPr>
+              <w:t>}</w:t>
+            </w:r>
           </w:p>
           <w:p>
             <w:pPr>
@@ -4144,7 +5191,29 @@
                 <w:sz w:val="16"/>
                 <w:szCs w:val="16"/>
               </w:rPr>
-              <w:t xml:space="preserve"> o Funcionario Autorizado</w:t>
+              <w:t xml:space="preserve"> o </w:t>
+            </w:r>
+            <w:proofErr w:type="gramStart"/>
+            <w:r>
+              <w:rPr>
+                <w:rFonts w:ascii="Arial" w:hAnsi="Arial" w:cs="Arial"/>
+                <w:b/>
+                <w:i/>
+                <w:sz w:val="16"/>
+                <w:szCs w:val="16"/>
+              </w:rPr>
+              <w:t>Funcionario</w:t>
+            </w:r>
+            <w:proofErr w:type="gramEnd"/>
+            <w:r>
+              <w:rPr>
+                <w:rFonts w:ascii="Arial" w:hAnsi="Arial" w:cs="Arial"/>
+                <w:b/>
+                <w:i/>
+                <w:sz w:val="16"/>
+                <w:szCs w:val="16"/>
+              </w:rPr>
+              <w:t xml:space="preserve"> Autorizado</w:t>
             </w:r>
             <w:r>
               <w:rPr>
@@ -4233,7 +5302,10 @@
               <w:rPr>
                 <w:rFonts w:ascii="Arial" w:hAnsi="Arial" w:cs="Arial"/>
                 <w:b/>
+                <w:bCs/>
                 <w:i/>
+                <w:iCs/>
+                <w:color w:val="000000"/>
                 <w:sz w:val="16"/>
                 <w:szCs w:val="16"/>
               </w:rPr>
@@ -4244,7 +5316,10 @@
               <w:rPr>
                 <w:rFonts w:ascii="Arial" w:hAnsi="Arial" w:cs="Arial"/>
                 <w:b/>
+                <w:bCs/>
                 <w:i/>
+                <w:iCs/>
+                <w:color w:val="000000"/>
                 <w:sz w:val="16"/>
                 <w:szCs w:val="16"/>
               </w:rPr>
@@ -4255,11 +5330,42 @@
               <w:rPr>
                 <w:rFonts w:ascii="Arial" w:hAnsi="Arial" w:cs="Arial"/>
                 <w:b/>
+                <w:bCs/>
                 <w:i/>
-                <w:sz w:val="16"/>
-                <w:szCs w:val="16"/>
-              </w:rPr>
-              <w:t xml:space="preserve">{nombreDirector}</w:t>
+                <w:iCs/>
+                <w:color w:val="000000"/>
+                <w:sz w:val="16"/>
+                <w:szCs w:val="16"/>
+              </w:rPr>
+              <w:t xml:space="preserve">(la) </w:t>
+            </w:r>
+            <w:proofErr w:type="gramStart"/>
+            <w:r>
+              <w:rPr>
+                <w:rFonts w:ascii="Arial" w:hAnsi="Arial" w:cs="Arial"/>
+                <w:b/>
+                <w:bCs/>
+                <w:i/>
+                <w:iCs/>
+                <w:color w:val="000000"/>
+                <w:sz w:val="16"/>
+                <w:szCs w:val="16"/>
+              </w:rPr>
+              <w:t>Director</w:t>
+            </w:r>
+            <w:proofErr w:type="gramEnd"/>
+            <w:r>
+              <w:rPr>
+                <w:rFonts w:ascii="Arial" w:hAnsi="Arial" w:cs="Arial"/>
+                <w:b/>
+                <w:bCs/>
+                <w:i/>
+                <w:iCs/>
+                <w:color w:val="000000"/>
+                <w:sz w:val="16"/>
+                <w:szCs w:val="16"/>
+              </w:rPr>
+              <w:t>(a) Técnico(a) / Nacional o Funcionario Autorizado)</w:t>
             </w:r>
             <w:r>
               <w:rPr>
@@ -4534,11 +5640,11 @@
         <w:tblLook w:val="04A0" w:firstRow="1" w:lastRow="0" w:firstColumn="1" w:lastColumn="0" w:noHBand="0" w:noVBand="1"/>
       </w:tblPr>
       <w:tblGrid>
-        <w:gridCol w:w="1205"/>
-        <w:gridCol w:w="1620"/>
-        <w:gridCol w:w="1204"/>
-        <w:gridCol w:w="267"/>
-        <w:gridCol w:w="2083"/>
+        <w:gridCol w:w="1560"/>
+        <w:gridCol w:w="1842"/>
+        <w:gridCol w:w="1560"/>
+        <w:gridCol w:w="283"/>
+        <w:gridCol w:w="1134"/>
       </w:tblGrid>
       <w:tr>
         <w:trPr>
@@ -4793,10 +5899,28 @@
             <w:r>
               <w:rPr>
                 <w:rFonts w:ascii="Arial" w:hAnsi="Arial" w:cs="Arial"/>
-                <w:sz w:val="16"/>
-                <w:szCs w:val="16"/>
-              </w:rPr>
-              <w:t>…………/………../………..</w:t>
+                <w:b/>
+                <w:sz w:val="16"/>
+              </w:rPr>
+              <w:t>{</w:t>
+            </w:r>
+            <w:proofErr w:type="spellStart"/>
+            <w:r>
+              <w:rPr>
+                <w:rFonts w:ascii="Arial" w:hAnsi="Arial" w:cs="Arial"/>
+                <w:b/>
+                <w:sz w:val="16"/>
+              </w:rPr>
+              <w:t>fechaIHoy</w:t>
+            </w:r>
+            <w:proofErr w:type="spellEnd"/>
+            <w:r>
+              <w:rPr>
+                <w:rFonts w:ascii="Arial" w:hAnsi="Arial" w:cs="Arial"/>
+                <w:b/>
+                <w:sz w:val="16"/>
+              </w:rPr>
+              <w:t>}</w:t>
             </w:r>
           </w:p>
         </w:tc>
@@ -5125,13 +6249,6 @@
         </w:tc>
       </w:tr>
     </w:tbl>
-    <w:p>
-      <w:pPr>
-        <w:rPr>
-          <w:sz w:val="4"/>
-        </w:rPr>
-      </w:pPr>
-    </w:p>
     <w:p>
       <w:pPr>
         <w:rPr>
@@ -5248,7 +6365,7 @@
                 <w:lang w:eastAsia="es-PE"/>
               </w:rPr>
               <w:drawing>
-                <wp:anchor distT="0" distB="0" distL="114300" distR="114300" simplePos="0" relativeHeight="251681792" behindDoc="0" locked="0" layoutInCell="1" allowOverlap="1">
+                <wp:anchor distT="0" distB="0" distL="114300" distR="114300" simplePos="0" relativeHeight="251681792" behindDoc="0" locked="0" layoutInCell="1" allowOverlap="1" wp14:anchorId="6BF4BFB9" wp14:editId="276BFE4A">
                   <wp:simplePos x="0" y="0"/>
                   <wp:positionH relativeFrom="column">
                     <wp:posOffset>382270</wp:posOffset>
@@ -6648,8 +7765,22 @@
                 <w:szCs w:val="16"/>
                 <w:lang w:eastAsia="es-PE"/>
               </w:rPr>
-              <w:t xml:space="preserve"> de Orden de Servicio: …….</w:t>
-            </w:r>
+              <w:t xml:space="preserve"> de Orden de Servicio: </w:t>
+            </w:r>
+            <w:proofErr w:type="gramStart"/>
+            <w:r>
+              <w:rPr>
+                <w:rFonts w:ascii="Arial" w:eastAsia="Times New Roman" w:hAnsi="Arial" w:cs="Arial"/>
+                <w:i/>
+                <w:iCs/>
+                <w:color w:val="BFBFBF" w:themeColor="background1" w:themeShade="BF"/>
+                <w:sz w:val="16"/>
+                <w:szCs w:val="16"/>
+                <w:lang w:eastAsia="es-PE"/>
+              </w:rPr>
+              <w:t>…….</w:t>
+            </w:r>
+            <w:proofErr w:type="gramEnd"/>
           </w:p>
         </w:tc>
         <w:tc>
@@ -7585,7 +8716,7 @@
           <w:sz w:val="16"/>
           <w:szCs w:val="16"/>
         </w:rPr>
-        <w:t xml:space="preserve">CEPCIONES: {justificacion}</w:t>
+        <w:t>CEPCIONES: {justificacion}</w:t>
       </w:r>
       <w:r>
         <w:rPr>
@@ -7986,7 +9117,27 @@
                 <w:sz w:val="16"/>
                 <w:szCs w:val="16"/>
               </w:rPr>
-              <w:t>o Funcionario Autorizado</w:t>
+              <w:t xml:space="preserve">o </w:t>
+            </w:r>
+            <w:proofErr w:type="gramStart"/>
+            <w:r>
+              <w:rPr>
+                <w:rFonts w:ascii="Arial" w:hAnsi="Arial" w:cs="Arial"/>
+                <w:b/>
+                <w:sz w:val="16"/>
+                <w:szCs w:val="16"/>
+              </w:rPr>
+              <w:t>Funcionario</w:t>
+            </w:r>
+            <w:proofErr w:type="gramEnd"/>
+            <w:r>
+              <w:rPr>
+                <w:rFonts w:ascii="Arial" w:hAnsi="Arial" w:cs="Arial"/>
+                <w:b/>
+                <w:sz w:val="16"/>
+                <w:szCs w:val="16"/>
+              </w:rPr>
+              <w:t xml:space="preserve"> Autorizado</w:t>
             </w:r>
             <w:r>
               <w:rPr>
@@ -8631,7 +9782,7 @@
 </file>
 
 <file path=word/endnotes.xml><?xml version="1.0" encoding="utf-8"?>
-<w:endnotes xmlns:wpc="http://schemas.microsoft.com/office/word/2010/wordprocessingCanvas" xmlns:cx="http://schemas.microsoft.com/office/drawing/2014/chartex" xmlns:cx1="http://schemas.microsoft.com/office/drawing/2015/9/8/chartex" xmlns:cx2="http://schemas.microsoft.com/office/drawing/2015/10/21/chartex" xmlns:cx3="http://schemas.microsoft.com/office/drawing/2016/5/9/chartex" xmlns:cx4="http://schemas.microsoft.com/office/drawing/2016/5/10/chartex" xmlns:cx5="http://schemas.microsoft.com/office/drawing/2016/5/11/chartex" xmlns:cx6="http://schemas.microsoft.com/office/drawing/2016/5/12/chartex" xmlns:cx7="http://schemas.microsoft.com/office/drawing/2016/5/13/chartex" xmlns:cx8="http://schemas.microsoft.com/office/drawing/2016/5/14/chartex" xmlns:mc="http://schemas.openxmlformats.org/markup-compatibility/2006" xmlns:aink="http://schemas.microsoft.com/office/drawing/2016/ink" xmlns:am3d="http://schemas.microsoft.com/office/drawing/2017/model3d" xmlns:o="urn:schemas-microsoft-com:office:office" xmlns:oel="http://schemas.microsoft.com/office/2019/extlst" xmlns:r="http://schemas.openxmlformats.org/officeDocument/2006/relationships" xmlns:m="http://schemas.openxmlformats.org/officeDocument/2006/math" xmlns:v="urn:schemas-microsoft-com:vml" xmlns:wp14="http://schemas.microsoft.com/office/word/2010/wordprocessingDrawing" xmlns:wp="http://schemas.openxmlformats.org/drawingml/2006/wordprocessingDrawing" xmlns:w10="urn:schemas-microsoft-com:office:word" xmlns:w="http://schemas.openxmlformats.org/wordprocessingml/2006/main" xmlns:w14="http://schemas.microsoft.com/office/word/2010/wordml" xmlns:w15="http://schemas.microsoft.com/office/word/2012/wordml" xmlns:w16cex="http://schemas.microsoft.com/office/word/2018/wordml/cex" xmlns:w16cid="http://schemas.microsoft.com/office/word/2016/wordml/cid" xmlns:w16="http://schemas.microsoft.com/office/word/2018/wordml" xmlns:w16du="http://schemas.microsoft.com/office/word/2023/wordml/word16du" xmlns:w16sdtdh="http://schemas.microsoft.com/office/word/2020/wordml/sdtdatahash" xmlns:w16sdtfl="http://schemas.microsoft.com/office/word/2024/wordml/sdtformatlock" xmlns:w16se="http://schemas.microsoft.com/office/word/2015/wordml/symex" xmlns:wpg="http://schemas.microsoft.com/office/word/2010/wordprocessingGroup" xmlns:wpi="http://schemas.microsoft.com/office/word/2010/wordprocessingInk" xmlns:wne="http://schemas.microsoft.com/office/word/2006/wordml" xmlns:wps="http://schemas.microsoft.com/office/word/2010/wordprocessingShape" mc:Ignorable="w14 w15 w16se w16cid w16 w16cex w16sdtdh w16sdtfl w16du wp14">
+<w:endnotes xmlns:wpc="http://schemas.microsoft.com/office/word/2010/wordprocessingCanvas" xmlns:cx="http://schemas.microsoft.com/office/drawing/2014/chartex" xmlns:cx1="http://schemas.microsoft.com/office/drawing/2015/9/8/chartex" xmlns:cx2="http://schemas.microsoft.com/office/drawing/2015/10/21/chartex" xmlns:cx3="http://schemas.microsoft.com/office/drawing/2016/5/9/chartex" xmlns:cx4="http://schemas.microsoft.com/office/drawing/2016/5/10/chartex" xmlns:cx5="http://schemas.microsoft.com/office/drawing/2016/5/11/chartex" xmlns:cx6="http://schemas.microsoft.com/office/drawing/2016/5/12/chartex" xmlns:cx7="http://schemas.microsoft.com/office/drawing/2016/5/13/chartex" xmlns:cx8="http://schemas.microsoft.com/office/drawing/2016/5/14/chartex" xmlns:mc="http://schemas.openxmlformats.org/markup-compatibility/2006" xmlns:aink="http://schemas.microsoft.com/office/drawing/2016/ink" xmlns:am3d="http://schemas.microsoft.com/office/drawing/2017/model3d" xmlns:o="urn:schemas-microsoft-com:office:office" xmlns:r="http://schemas.openxmlformats.org/officeDocument/2006/relationships" xmlns:m="http://schemas.openxmlformats.org/officeDocument/2006/math" xmlns:v="urn:schemas-microsoft-com:vml" xmlns:wp14="http://schemas.microsoft.com/office/word/2010/wordprocessingDrawing" xmlns:wp="http://schemas.openxmlformats.org/drawingml/2006/wordprocessingDrawing" xmlns:w10="urn:schemas-microsoft-com:office:word" xmlns:w="http://schemas.openxmlformats.org/wordprocessingml/2006/main" xmlns:w14="http://schemas.microsoft.com/office/word/2010/wordml" xmlns:w15="http://schemas.microsoft.com/office/word/2012/wordml" xmlns:w16cex="http://schemas.microsoft.com/office/word/2018/wordml/cex" xmlns:w16cid="http://schemas.microsoft.com/office/word/2016/wordml/cid" xmlns:w16="http://schemas.microsoft.com/office/word/2018/wordml" xmlns:w16sdtdh="http://schemas.microsoft.com/office/word/2020/wordml/sdtdatahash" xmlns:w16se="http://schemas.microsoft.com/office/word/2015/wordml/symex" xmlns:wpg="http://schemas.microsoft.com/office/word/2010/wordprocessingGroup" xmlns:wpi="http://schemas.microsoft.com/office/word/2010/wordprocessingInk" xmlns:wne="http://schemas.microsoft.com/office/word/2006/wordml" xmlns:wps="http://schemas.microsoft.com/office/word/2010/wordprocessingShape" mc:Ignorable="w14 w15 w16se w16cid w16 w16cex w16sdtdh wp14">
   <w:endnote w:type="separator" w:id="-1">
     <w:p>
       <w:pPr>
@@ -8656,7 +9807,7 @@
 </file>
 
 <file path=word/footer1.xml><?xml version="1.0" encoding="utf-8"?>
-<w:ftr xmlns:wpc="http://schemas.microsoft.com/office/word/2010/wordprocessingCanvas" xmlns:cx="http://schemas.microsoft.com/office/drawing/2014/chartex" xmlns:cx1="http://schemas.microsoft.com/office/drawing/2015/9/8/chartex" xmlns:cx2="http://schemas.microsoft.com/office/drawing/2015/10/21/chartex" xmlns:cx3="http://schemas.microsoft.com/office/drawing/2016/5/9/chartex" xmlns:cx4="http://schemas.microsoft.com/office/drawing/2016/5/10/chartex" xmlns:cx5="http://schemas.microsoft.com/office/drawing/2016/5/11/chartex" xmlns:cx6="http://schemas.microsoft.com/office/drawing/2016/5/12/chartex" xmlns:cx7="http://schemas.microsoft.com/office/drawing/2016/5/13/chartex" xmlns:cx8="http://schemas.microsoft.com/office/drawing/2016/5/14/chartex" xmlns:mc="http://schemas.openxmlformats.org/markup-compatibility/2006" xmlns:aink="http://schemas.microsoft.com/office/drawing/2016/ink" xmlns:am3d="http://schemas.microsoft.com/office/drawing/2017/model3d" xmlns:o="urn:schemas-microsoft-com:office:office" xmlns:oel="http://schemas.microsoft.com/office/2019/extlst" xmlns:r="http://schemas.openxmlformats.org/officeDocument/2006/relationships" xmlns:m="http://schemas.openxmlformats.org/officeDocument/2006/math" xmlns:v="urn:schemas-microsoft-com:vml" xmlns:wp14="http://schemas.microsoft.com/office/word/2010/wordprocessingDrawing" xmlns:wp="http://schemas.openxmlformats.org/drawingml/2006/wordprocessingDrawing" xmlns:w10="urn:schemas-microsoft-com:office:word" xmlns:w="http://schemas.openxmlformats.org/wordprocessingml/2006/main" xmlns:w14="http://schemas.microsoft.com/office/word/2010/wordml" xmlns:w15="http://schemas.microsoft.com/office/word/2012/wordml" xmlns:w16cex="http://schemas.microsoft.com/office/word/2018/wordml/cex" xmlns:w16cid="http://schemas.microsoft.com/office/word/2016/wordml/cid" xmlns:w16="http://schemas.microsoft.com/office/word/2018/wordml" xmlns:w16du="http://schemas.microsoft.com/office/word/2023/wordml/word16du" xmlns:w16sdtdh="http://schemas.microsoft.com/office/word/2020/wordml/sdtdatahash" xmlns:w16sdtfl="http://schemas.microsoft.com/office/word/2024/wordml/sdtformatlock" xmlns:w16se="http://schemas.microsoft.com/office/word/2015/wordml/symex" xmlns:wpg="http://schemas.microsoft.com/office/word/2010/wordprocessingGroup" xmlns:wpi="http://schemas.microsoft.com/office/word/2010/wordprocessingInk" xmlns:wne="http://schemas.microsoft.com/office/word/2006/wordml" xmlns:wps="http://schemas.microsoft.com/office/word/2010/wordprocessingShape" mc:Ignorable="w14 w15 w16se w16cid w16 w16cex w16sdtdh w16sdtfl w16du wp14">
+<w:ftr xmlns:wpc="http://schemas.microsoft.com/office/word/2010/wordprocessingCanvas" xmlns:cx="http://schemas.microsoft.com/office/drawing/2014/chartex" xmlns:cx1="http://schemas.microsoft.com/office/drawing/2015/9/8/chartex" xmlns:cx2="http://schemas.microsoft.com/office/drawing/2015/10/21/chartex" xmlns:cx3="http://schemas.microsoft.com/office/drawing/2016/5/9/chartex" xmlns:cx4="http://schemas.microsoft.com/office/drawing/2016/5/10/chartex" xmlns:cx5="http://schemas.microsoft.com/office/drawing/2016/5/11/chartex" xmlns:cx6="http://schemas.microsoft.com/office/drawing/2016/5/12/chartex" xmlns:cx7="http://schemas.microsoft.com/office/drawing/2016/5/13/chartex" xmlns:cx8="http://schemas.microsoft.com/office/drawing/2016/5/14/chartex" xmlns:mc="http://schemas.openxmlformats.org/markup-compatibility/2006" xmlns:aink="http://schemas.microsoft.com/office/drawing/2016/ink" xmlns:am3d="http://schemas.microsoft.com/office/drawing/2017/model3d" xmlns:o="urn:schemas-microsoft-com:office:office" xmlns:r="http://schemas.openxmlformats.org/officeDocument/2006/relationships" xmlns:m="http://schemas.openxmlformats.org/officeDocument/2006/math" xmlns:v="urn:schemas-microsoft-com:vml" xmlns:wp14="http://schemas.microsoft.com/office/word/2010/wordprocessingDrawing" xmlns:wp="http://schemas.openxmlformats.org/drawingml/2006/wordprocessingDrawing" xmlns:w10="urn:schemas-microsoft-com:office:word" xmlns:w="http://schemas.openxmlformats.org/wordprocessingml/2006/main" xmlns:w14="http://schemas.microsoft.com/office/word/2010/wordml" xmlns:w15="http://schemas.microsoft.com/office/word/2012/wordml" xmlns:w16cex="http://schemas.microsoft.com/office/word/2018/wordml/cex" xmlns:w16cid="http://schemas.microsoft.com/office/word/2016/wordml/cid" xmlns:w16="http://schemas.microsoft.com/office/word/2018/wordml" xmlns:w16sdtdh="http://schemas.microsoft.com/office/word/2020/wordml/sdtdatahash" xmlns:w16se="http://schemas.microsoft.com/office/word/2015/wordml/symex" xmlns:wpg="http://schemas.microsoft.com/office/word/2010/wordprocessingGroup" xmlns:wpi="http://schemas.microsoft.com/office/word/2010/wordprocessingInk" xmlns:wne="http://schemas.microsoft.com/office/word/2006/wordml" xmlns:wps="http://schemas.microsoft.com/office/word/2010/wordprocessingShape" mc:Ignorable="w14 w15 w16se w16cid w16 w16cex w16sdtdh wp14">
   <w:p>
     <w:pPr>
       <w:pStyle w:val="Piedepgina"/>
@@ -8680,7 +9831,7 @@
 </file>
 
 <file path=word/footnotes.xml><?xml version="1.0" encoding="utf-8"?>
-<w:footnotes xmlns:wpc="http://schemas.microsoft.com/office/word/2010/wordprocessingCanvas" xmlns:cx="http://schemas.microsoft.com/office/drawing/2014/chartex" xmlns:cx1="http://schemas.microsoft.com/office/drawing/2015/9/8/chartex" xmlns:cx2="http://schemas.microsoft.com/office/drawing/2015/10/21/chartex" xmlns:cx3="http://schemas.microsoft.com/office/drawing/2016/5/9/chartex" xmlns:cx4="http://schemas.microsoft.com/office/drawing/2016/5/10/chartex" xmlns:cx5="http://schemas.microsoft.com/office/drawing/2016/5/11/chartex" xmlns:cx6="http://schemas.microsoft.com/office/drawing/2016/5/12/chartex" xmlns:cx7="http://schemas.microsoft.com/office/drawing/2016/5/13/chartex" xmlns:cx8="http://schemas.microsoft.com/office/drawing/2016/5/14/chartex" xmlns:mc="http://schemas.openxmlformats.org/markup-compatibility/2006" xmlns:aink="http://schemas.microsoft.com/office/drawing/2016/ink" xmlns:am3d="http://schemas.microsoft.com/office/drawing/2017/model3d" xmlns:o="urn:schemas-microsoft-com:office:office" xmlns:oel="http://schemas.microsoft.com/office/2019/extlst" xmlns:r="http://schemas.openxmlformats.org/officeDocument/2006/relationships" xmlns:m="http://schemas.openxmlformats.org/officeDocument/2006/math" xmlns:v="urn:schemas-microsoft-com:vml" xmlns:wp14="http://schemas.microsoft.com/office/word/2010/wordprocessingDrawing" xmlns:wp="http://schemas.openxmlformats.org/drawingml/2006/wordprocessingDrawing" xmlns:w10="urn:schemas-microsoft-com:office:word" xmlns:w="http://schemas.openxmlformats.org/wordprocessingml/2006/main" xmlns:w14="http://schemas.microsoft.com/office/word/2010/wordml" xmlns:w15="http://schemas.microsoft.com/office/word/2012/wordml" xmlns:w16cex="http://schemas.microsoft.com/office/word/2018/wordml/cex" xmlns:w16cid="http://schemas.microsoft.com/office/word/2016/wordml/cid" xmlns:w16="http://schemas.microsoft.com/office/word/2018/wordml" xmlns:w16du="http://schemas.microsoft.com/office/word/2023/wordml/word16du" xmlns:w16sdtdh="http://schemas.microsoft.com/office/word/2020/wordml/sdtdatahash" xmlns:w16sdtfl="http://schemas.microsoft.com/office/word/2024/wordml/sdtformatlock" xmlns:w16se="http://schemas.microsoft.com/office/word/2015/wordml/symex" xmlns:wpg="http://schemas.microsoft.com/office/word/2010/wordprocessingGroup" xmlns:wpi="http://schemas.microsoft.com/office/word/2010/wordprocessingInk" xmlns:wne="http://schemas.microsoft.com/office/word/2006/wordml" xmlns:wps="http://schemas.microsoft.com/office/word/2010/wordprocessingShape" mc:Ignorable="w14 w15 w16se w16cid w16 w16cex w16sdtdh w16sdtfl w16du wp14">
+<w:footnotes xmlns:wpc="http://schemas.microsoft.com/office/word/2010/wordprocessingCanvas" xmlns:cx="http://schemas.microsoft.com/office/drawing/2014/chartex" xmlns:cx1="http://schemas.microsoft.com/office/drawing/2015/9/8/chartex" xmlns:cx2="http://schemas.microsoft.com/office/drawing/2015/10/21/chartex" xmlns:cx3="http://schemas.microsoft.com/office/drawing/2016/5/9/chartex" xmlns:cx4="http://schemas.microsoft.com/office/drawing/2016/5/10/chartex" xmlns:cx5="http://schemas.microsoft.com/office/drawing/2016/5/11/chartex" xmlns:cx6="http://schemas.microsoft.com/office/drawing/2016/5/12/chartex" xmlns:cx7="http://schemas.microsoft.com/office/drawing/2016/5/13/chartex" xmlns:cx8="http://schemas.microsoft.com/office/drawing/2016/5/14/chartex" xmlns:mc="http://schemas.openxmlformats.org/markup-compatibility/2006" xmlns:aink="http://schemas.microsoft.com/office/drawing/2016/ink" xmlns:am3d="http://schemas.microsoft.com/office/drawing/2017/model3d" xmlns:o="urn:schemas-microsoft-com:office:office" xmlns:r="http://schemas.openxmlformats.org/officeDocument/2006/relationships" xmlns:m="http://schemas.openxmlformats.org/officeDocument/2006/math" xmlns:v="urn:schemas-microsoft-com:vml" xmlns:wp14="http://schemas.microsoft.com/office/word/2010/wordprocessingDrawing" xmlns:wp="http://schemas.openxmlformats.org/drawingml/2006/wordprocessingDrawing" xmlns:w10="urn:schemas-microsoft-com:office:word" xmlns:w="http://schemas.openxmlformats.org/wordprocessingml/2006/main" xmlns:w14="http://schemas.microsoft.com/office/word/2010/wordml" xmlns:w15="http://schemas.microsoft.com/office/word/2012/wordml" xmlns:w16cex="http://schemas.microsoft.com/office/word/2018/wordml/cex" xmlns:w16cid="http://schemas.microsoft.com/office/word/2016/wordml/cid" xmlns:w16="http://schemas.microsoft.com/office/word/2018/wordml" xmlns:w16sdtdh="http://schemas.microsoft.com/office/word/2020/wordml/sdtdatahash" xmlns:w16se="http://schemas.microsoft.com/office/word/2015/wordml/symex" xmlns:wpg="http://schemas.microsoft.com/office/word/2010/wordprocessingGroup" xmlns:wpi="http://schemas.microsoft.com/office/word/2010/wordprocessingInk" xmlns:wne="http://schemas.microsoft.com/office/word/2006/wordml" xmlns:wps="http://schemas.microsoft.com/office/word/2010/wordprocessingShape" mc:Ignorable="w14 w15 w16se w16cid w16 w16cex w16sdtdh wp14">
   <w:footnote w:type="separator" w:id="-1">
     <w:p>
       <w:pPr>
@@ -8734,7 +9885,23 @@
           <w:rFonts w:ascii="Arial" w:hAnsi="Arial" w:cs="Arial"/>
           <w:sz w:val="16"/>
         </w:rPr>
-        <w:t>de que la DDTT/NN designó al Funcionario Autorizado</w:t>
+        <w:t xml:space="preserve">de que la DDTT/NN designó al </w:t>
+      </w:r>
+      <w:proofErr w:type="gramStart"/>
+      <w:r>
+        <w:rPr>
+          <w:rFonts w:ascii="Arial" w:hAnsi="Arial" w:cs="Arial"/>
+          <w:sz w:val="16"/>
+        </w:rPr>
+        <w:t>Funcionario</w:t>
+      </w:r>
+      <w:proofErr w:type="gramEnd"/>
+      <w:r>
+        <w:rPr>
+          <w:rFonts w:ascii="Arial" w:hAnsi="Arial" w:cs="Arial"/>
+          <w:sz w:val="16"/>
+        </w:rPr>
+        <w:t xml:space="preserve"> Autorizado</w:t>
       </w:r>
       <w:r>
         <w:rPr>
@@ -8876,7 +10043,23 @@
           <w:rFonts w:ascii="Arial" w:hAnsi="Arial" w:cs="Arial"/>
           <w:sz w:val="16"/>
         </w:rPr>
-        <w:t xml:space="preserve">el/la Director/a del Órgano o Unidad Orgánica </w:t>
+        <w:t xml:space="preserve">el/la </w:t>
+      </w:r>
+      <w:proofErr w:type="gramStart"/>
+      <w:r>
+        <w:rPr>
+          <w:rFonts w:ascii="Arial" w:hAnsi="Arial" w:cs="Arial"/>
+          <w:sz w:val="16"/>
+        </w:rPr>
+        <w:t>Director</w:t>
+      </w:r>
+      <w:proofErr w:type="gramEnd"/>
+      <w:r>
+        <w:rPr>
+          <w:rFonts w:ascii="Arial" w:hAnsi="Arial" w:cs="Arial"/>
+          <w:sz w:val="16"/>
+        </w:rPr>
+        <w:t xml:space="preserve">/a del Órgano o Unidad Orgánica </w:t>
       </w:r>
       <w:r>
         <w:rPr>
@@ -8891,7 +10074,7 @@
 </file>
 
 <file path=word/numbering.xml><?xml version="1.0" encoding="utf-8"?>
-<w:numbering xmlns:wpc="http://schemas.microsoft.com/office/word/2010/wordprocessingCanvas" xmlns:cx="http://schemas.microsoft.com/office/drawing/2014/chartex" xmlns:cx1="http://schemas.microsoft.com/office/drawing/2015/9/8/chartex" xmlns:cx2="http://schemas.microsoft.com/office/drawing/2015/10/21/chartex" xmlns:cx3="http://schemas.microsoft.com/office/drawing/2016/5/9/chartex" xmlns:cx4="http://schemas.microsoft.com/office/drawing/2016/5/10/chartex" xmlns:cx5="http://schemas.microsoft.com/office/drawing/2016/5/11/chartex" xmlns:cx6="http://schemas.microsoft.com/office/drawing/2016/5/12/chartex" xmlns:cx7="http://schemas.microsoft.com/office/drawing/2016/5/13/chartex" xmlns:cx8="http://schemas.microsoft.com/office/drawing/2016/5/14/chartex" xmlns:mc="http://schemas.openxmlformats.org/markup-compatibility/2006" xmlns:aink="http://schemas.microsoft.com/office/drawing/2016/ink" xmlns:am3d="http://schemas.microsoft.com/office/drawing/2017/model3d" xmlns:o="urn:schemas-microsoft-com:office:office" xmlns:oel="http://schemas.microsoft.com/office/2019/extlst" xmlns:r="http://schemas.openxmlformats.org/officeDocument/2006/relationships" xmlns:m="http://schemas.openxmlformats.org/officeDocument/2006/math" xmlns:v="urn:schemas-microsoft-com:vml" xmlns:wp14="http://schemas.microsoft.com/office/word/2010/wordprocessingDrawing" xmlns:wp="http://schemas.openxmlformats.org/drawingml/2006/wordprocessingDrawing" xmlns:w10="urn:schemas-microsoft-com:office:word" xmlns:w="http://schemas.openxmlformats.org/wordprocessingml/2006/main" xmlns:w14="http://schemas.microsoft.com/office/word/2010/wordml" xmlns:w15="http://schemas.microsoft.com/office/word/2012/wordml" xmlns:w16cex="http://schemas.microsoft.com/office/word/2018/wordml/cex" xmlns:w16cid="http://schemas.microsoft.com/office/word/2016/wordml/cid" xmlns:w16="http://schemas.microsoft.com/office/word/2018/wordml" xmlns:w16du="http://schemas.microsoft.com/office/word/2023/wordml/word16du" xmlns:w16sdtdh="http://schemas.microsoft.com/office/word/2020/wordml/sdtdatahash" xmlns:w16sdtfl="http://schemas.microsoft.com/office/word/2024/wordml/sdtformatlock" xmlns:w16se="http://schemas.microsoft.com/office/word/2015/wordml/symex" xmlns:wpg="http://schemas.microsoft.com/office/word/2010/wordprocessingGroup" xmlns:wpi="http://schemas.microsoft.com/office/word/2010/wordprocessingInk" xmlns:wne="http://schemas.microsoft.com/office/word/2006/wordml" xmlns:wps="http://schemas.microsoft.com/office/word/2010/wordprocessingShape" mc:Ignorable="w14 w15 w16se w16cid w16 w16cex w16sdtdh w16sdtfl w16du wp14">
+<w:numbering xmlns:wpc="http://schemas.microsoft.com/office/word/2010/wordprocessingCanvas" xmlns:cx="http://schemas.microsoft.com/office/drawing/2014/chartex" xmlns:cx1="http://schemas.microsoft.com/office/drawing/2015/9/8/chartex" xmlns:cx2="http://schemas.microsoft.com/office/drawing/2015/10/21/chartex" xmlns:cx3="http://schemas.microsoft.com/office/drawing/2016/5/9/chartex" xmlns:cx4="http://schemas.microsoft.com/office/drawing/2016/5/10/chartex" xmlns:cx5="http://schemas.microsoft.com/office/drawing/2016/5/11/chartex" xmlns:cx6="http://schemas.microsoft.com/office/drawing/2016/5/12/chartex" xmlns:cx7="http://schemas.microsoft.com/office/drawing/2016/5/13/chartex" xmlns:cx8="http://schemas.microsoft.com/office/drawing/2016/5/14/chartex" xmlns:mc="http://schemas.openxmlformats.org/markup-compatibility/2006" xmlns:aink="http://schemas.microsoft.com/office/drawing/2016/ink" xmlns:am3d="http://schemas.microsoft.com/office/drawing/2017/model3d" xmlns:o="urn:schemas-microsoft-com:office:office" xmlns:r="http://schemas.openxmlformats.org/officeDocument/2006/relationships" xmlns:m="http://schemas.openxmlformats.org/officeDocument/2006/math" xmlns:v="urn:schemas-microsoft-com:vml" xmlns:wp14="http://schemas.microsoft.com/office/word/2010/wordprocessingDrawing" xmlns:wp="http://schemas.openxmlformats.org/drawingml/2006/wordprocessingDrawing" xmlns:w10="urn:schemas-microsoft-com:office:word" xmlns:w="http://schemas.openxmlformats.org/wordprocessingml/2006/main" xmlns:w14="http://schemas.microsoft.com/office/word/2010/wordml" xmlns:w15="http://schemas.microsoft.com/office/word/2012/wordml" xmlns:w16cex="http://schemas.microsoft.com/office/word/2018/wordml/cex" xmlns:w16cid="http://schemas.microsoft.com/office/word/2016/wordml/cid" xmlns:w16="http://schemas.microsoft.com/office/word/2018/wordml" xmlns:w16sdtdh="http://schemas.microsoft.com/office/word/2020/wordml/sdtdatahash" xmlns:w16se="http://schemas.microsoft.com/office/word/2015/wordml/symex" xmlns:wpg="http://schemas.microsoft.com/office/word/2010/wordprocessingGroup" xmlns:wpi="http://schemas.microsoft.com/office/word/2010/wordprocessingInk" xmlns:wne="http://schemas.microsoft.com/office/word/2006/wordml" xmlns:wps="http://schemas.microsoft.com/office/word/2010/wordprocessingShape" mc:Ignorable="w14 w15 w16se w16cid w16 w16cex w16sdtdh wp14">
   <w:abstractNum w:abstractNumId="0" w15:restartNumberingAfterBreak="0">
     <w:nsid w:val="11EA69A7"/>
     <w:multiLevelType w:val="hybridMultilevel"/>
@@ -9248,23 +10431,23 @@
       </w:pPr>
     </w:lvl>
   </w:abstractNum>
-  <w:num w:numId="1" w16cid:durableId="1570191253">
+  <w:num w:numId="1">
     <w:abstractNumId w:val="2"/>
   </w:num>
-  <w:num w:numId="2" w16cid:durableId="1100218809">
+  <w:num w:numId="2">
     <w:abstractNumId w:val="3"/>
   </w:num>
-  <w:num w:numId="3" w16cid:durableId="1718238929">
+  <w:num w:numId="3">
     <w:abstractNumId w:val="1"/>
   </w:num>
-  <w:num w:numId="4" w16cid:durableId="1477338303">
+  <w:num w:numId="4">
     <w:abstractNumId w:val="0"/>
   </w:num>
 </w:numbering>
 </file>
 
 <file path=word/styles.xml><?xml version="1.0" encoding="utf-8"?>
-<w:styles xmlns:mc="http://schemas.openxmlformats.org/markup-compatibility/2006" xmlns:r="http://schemas.openxmlformats.org/officeDocument/2006/relationships" xmlns:w="http://schemas.openxmlformats.org/wordprocessingml/2006/main" xmlns:w14="http://schemas.microsoft.com/office/word/2010/wordml" xmlns:w15="http://schemas.microsoft.com/office/word/2012/wordml" xmlns:w16cex="http://schemas.microsoft.com/office/word/2018/wordml/cex" xmlns:w16cid="http://schemas.microsoft.com/office/word/2016/wordml/cid" xmlns:w16="http://schemas.microsoft.com/office/word/2018/wordml" xmlns:w16du="http://schemas.microsoft.com/office/word/2023/wordml/word16du" xmlns:w16sdtdh="http://schemas.microsoft.com/office/word/2020/wordml/sdtdatahash" xmlns:w16sdtfl="http://schemas.microsoft.com/office/word/2024/wordml/sdtformatlock" xmlns:w16se="http://schemas.microsoft.com/office/word/2015/wordml/symex" mc:Ignorable="w14 w15 w16se w16cid w16 w16cex w16sdtdh w16sdtfl w16du">
+<w:styles xmlns:mc="http://schemas.openxmlformats.org/markup-compatibility/2006" xmlns:r="http://schemas.openxmlformats.org/officeDocument/2006/relationships" xmlns:w="http://schemas.openxmlformats.org/wordprocessingml/2006/main" xmlns:w14="http://schemas.microsoft.com/office/word/2010/wordml" xmlns:w15="http://schemas.microsoft.com/office/word/2012/wordml" xmlns:w16cex="http://schemas.microsoft.com/office/word/2018/wordml/cex" xmlns:w16cid="http://schemas.microsoft.com/office/word/2016/wordml/cid" xmlns:w16="http://schemas.microsoft.com/office/word/2018/wordml" xmlns:w16sdtdh="http://schemas.microsoft.com/office/word/2020/wordml/sdtdatahash" xmlns:w16se="http://schemas.microsoft.com/office/word/2015/wordml/symex" mc:Ignorable="w14 w15 w16se w16cid w16 w16cex w16sdtdh">
   <w:docDefaults>
     <w:rPrDefault>
       <w:rPr>

</xml_diff>